<commit_message>
26-10-24, Deelname en distantie bijgewerkt
</commit_message>
<xml_diff>
--- a/BlogsWord/Deelnameendistantie.docx
+++ b/BlogsWord/Deelnameendistantie.docx
@@ -122,7 +122,119 @@
           <w:sz w:val="22"/>
           <w:szCs w:val="22"/>
         </w:rPr>
-        <w:t xml:space="preserve">Over het filosofisch werk van Jürgen Habermas is al het nodige geschreven. </w:t>
+        <w:t xml:space="preserve">Ik heb zo’n rijtje favoriete filosofen waar ik graag bij tijd en wijle iets van </w:t>
+      </w:r>
+      <w:r>
+        <w:rPr>
+          <w:rFonts w:ascii="Courier New" w:hAnsi="Courier New" w:cs="Courier New"/>
+          <w:sz w:val="22"/>
+          <w:szCs w:val="22"/>
+        </w:rPr>
+        <w:t xml:space="preserve">of over </w:t>
+      </w:r>
+      <w:r>
+        <w:rPr>
+          <w:rFonts w:ascii="Courier New" w:hAnsi="Courier New" w:cs="Courier New"/>
+          <w:sz w:val="22"/>
+          <w:szCs w:val="22"/>
+        </w:rPr>
+        <w:t xml:space="preserve">lees. Dat ‘vriendengroepje’ bestaat uit John Dewey, Hannah Arendt, Richard Bernstein en Jürgen Habermas. Dit jaar overleed </w:t>
+      </w:r>
+      <w:r>
+        <w:rPr>
+          <w:rFonts w:ascii="Courier New" w:hAnsi="Courier New" w:cs="Courier New"/>
+          <w:sz w:val="22"/>
+          <w:szCs w:val="22"/>
+        </w:rPr>
+        <w:t xml:space="preserve">van dit groepje </w:t>
+      </w:r>
+      <w:r>
+        <w:rPr>
+          <w:rFonts w:ascii="Courier New" w:hAnsi="Courier New" w:cs="Courier New"/>
+          <w:sz w:val="22"/>
+          <w:szCs w:val="22"/>
+        </w:rPr>
+        <w:t xml:space="preserve">ook Habermas (1929-2026). </w:t>
+      </w:r>
+      <w:r>
+        <w:rPr>
+          <w:rFonts w:ascii="Courier New" w:hAnsi="Courier New" w:cs="Courier New"/>
+          <w:sz w:val="22"/>
+          <w:szCs w:val="22"/>
+        </w:rPr>
+        <w:t xml:space="preserve">Over </w:t>
+      </w:r>
+      <w:r>
+        <w:rPr>
+          <w:rFonts w:ascii="Courier New" w:hAnsi="Courier New" w:cs="Courier New"/>
+          <w:sz w:val="22"/>
+          <w:szCs w:val="22"/>
+        </w:rPr>
+        <w:t>zijn</w:t>
+      </w:r>
+      <w:r>
+        <w:rPr>
+          <w:rFonts w:ascii="Courier New" w:hAnsi="Courier New" w:cs="Courier New"/>
+          <w:sz w:val="22"/>
+          <w:szCs w:val="22"/>
+        </w:rPr>
+        <w:t xml:space="preserve"> filosofisch werk </w:t>
+      </w:r>
+      <w:r>
+        <w:rPr>
+          <w:rFonts w:ascii="Courier New" w:hAnsi="Courier New" w:cs="Courier New"/>
+          <w:sz w:val="22"/>
+          <w:szCs w:val="22"/>
+        </w:rPr>
+        <w:t xml:space="preserve">is </w:t>
+      </w:r>
+      <w:r>
+        <w:rPr>
+          <w:rFonts w:ascii="Courier New" w:hAnsi="Courier New" w:cs="Courier New"/>
+          <w:sz w:val="22"/>
+          <w:szCs w:val="22"/>
+        </w:rPr>
+        <w:t>het nodige geschreven</w:t>
+      </w:r>
+      <w:r>
+        <w:rPr>
+          <w:rFonts w:ascii="Courier New" w:hAnsi="Courier New" w:cs="Courier New"/>
+          <w:sz w:val="22"/>
+          <w:szCs w:val="22"/>
+        </w:rPr>
+        <w:t>, maar er zat ook nog een andere kant aan Habermas</w:t>
+      </w:r>
+      <w:r>
+        <w:rPr>
+          <w:rFonts w:ascii="Courier New" w:hAnsi="Courier New" w:cs="Courier New"/>
+          <w:sz w:val="22"/>
+          <w:szCs w:val="22"/>
+        </w:rPr>
+        <w:t xml:space="preserve">. </w:t>
+      </w:r>
+      <w:r>
+        <w:rPr>
+          <w:rFonts w:ascii="Courier New" w:hAnsi="Courier New" w:cs="Courier New"/>
+          <w:sz w:val="22"/>
+          <w:szCs w:val="22"/>
+        </w:rPr>
+        <w:t xml:space="preserve">Daarnaast mengde hij zich sinds de jaren vijftig in allerlei </w:t>
+      </w:r>
+      <w:r>
+        <w:rPr>
+          <w:rFonts w:ascii="Courier New" w:hAnsi="Courier New" w:cs="Courier New"/>
+          <w:sz w:val="22"/>
+          <w:szCs w:val="22"/>
+        </w:rPr>
+        <w:t xml:space="preserve">politieke en maatschappelijke </w:t>
+      </w:r>
+      <w:r>
+        <w:rPr>
+          <w:rFonts w:ascii="Courier New" w:hAnsi="Courier New" w:cs="Courier New"/>
+          <w:sz w:val="22"/>
+          <w:szCs w:val="22"/>
+        </w:rPr>
+        <w:t xml:space="preserve">discussies die er in Duitsland speelden. Over dat deel, Habermas als publiek intellectueel, schreef </w:t>
       </w:r>
       <w:r>
         <w:rPr>
@@ -138,7 +250,7 @@
           <w:sz w:val="22"/>
           <w:szCs w:val="22"/>
         </w:rPr>
-        <w:t>onderzoekt in</w:t>
+        <w:t>recent</w:t>
       </w:r>
       <w:r>
         <w:rPr>
@@ -156,51 +268,13 @@
           <w:sz w:val="22"/>
           <w:szCs w:val="22"/>
         </w:rPr>
-        <w:t>Jürgen Habermas: Public Intellectual and Engaged Critical Theorist</w:t>
-      </w:r>
-      <w:r>
-        <w:rPr>
-          <w:rFonts w:ascii="Courier New" w:hAnsi="Courier New" w:cs="Courier New"/>
-          <w:sz w:val="22"/>
-          <w:szCs w:val="22"/>
-        </w:rPr>
-        <w:t xml:space="preserve"> onderzoekt </w:t>
-      </w:r>
-      <w:r>
-        <w:rPr>
-          <w:rFonts w:ascii="Courier New" w:hAnsi="Courier New" w:cs="Courier New"/>
-          <w:sz w:val="22"/>
-          <w:szCs w:val="22"/>
-        </w:rPr>
-        <w:t xml:space="preserve">een specifiek deel van </w:t>
-      </w:r>
-      <w:r>
-        <w:rPr>
-          <w:rFonts w:ascii="Courier New" w:hAnsi="Courier New" w:cs="Courier New"/>
-          <w:sz w:val="22"/>
-          <w:szCs w:val="22"/>
-        </w:rPr>
-        <w:t xml:space="preserve">het leven en werk van de </w:t>
-      </w:r>
-      <w:r>
-        <w:rPr>
-          <w:rFonts w:ascii="Courier New" w:hAnsi="Courier New" w:cs="Courier New"/>
-          <w:sz w:val="22"/>
-          <w:szCs w:val="22"/>
-        </w:rPr>
-        <w:t xml:space="preserve">dit jaar overleden </w:t>
-      </w:r>
-      <w:r>
-        <w:rPr>
-          <w:rFonts w:ascii="Courier New" w:hAnsi="Courier New" w:cs="Courier New"/>
-          <w:sz w:val="22"/>
-          <w:szCs w:val="22"/>
-        </w:rPr>
-        <w:t>Duitse filosoof Jürgen Habermas (1929–2026)</w:t>
-      </w:r>
-      <w:r>
-        <w:rPr>
-          <w:rFonts w:ascii="Courier New" w:hAnsi="Courier New" w:cs="Courier New"/>
+        <w:t>Jürgen Habermas: Public Intellectual and Engaged Critical</w:t>
+      </w:r>
+      <w:r>
+        <w:rPr>
+          <w:rFonts w:ascii="Courier New" w:hAnsi="Courier New" w:cs="Courier New"/>
+          <w:i/>
+          <w:iCs/>
           <w:sz w:val="22"/>
           <w:szCs w:val="22"/>
         </w:rPr>
@@ -212,7 +286,23 @@
           <w:sz w:val="22"/>
           <w:szCs w:val="22"/>
         </w:rPr>
-        <w:t xml:space="preserve">Verovšek zich vooral op zijn optreden als publieke intellectueel. Habermas was niet alleen een van de belangrijkste vertegenwoordigers van de Frankfurter Schule en de kritische theorie, </w:t>
+        <w:t>Habermas was niet alleen een van d</w:t>
+      </w:r>
+      <w:r>
+        <w:rPr>
+          <w:rFonts w:ascii="Courier New" w:hAnsi="Courier New" w:cs="Courier New"/>
+          <w:sz w:val="22"/>
+          <w:szCs w:val="22"/>
+        </w:rPr>
+        <w:t>é filosoof</w:t>
+      </w:r>
+      <w:r>
+        <w:rPr>
+          <w:rFonts w:ascii="Courier New" w:hAnsi="Courier New" w:cs="Courier New"/>
+          <w:sz w:val="22"/>
+          <w:szCs w:val="22"/>
+        </w:rPr>
+        <w:t xml:space="preserve"> van de Frankfurter Schule en de kritische theorie, </w:t>
       </w:r>
       <w:r>
         <w:rPr>
@@ -228,7 +318,23 @@
           <w:sz w:val="22"/>
           <w:szCs w:val="22"/>
         </w:rPr>
-        <w:t>ook een invloedrijke deelnemer aan het maatschappelijke en politieke debat in Duitsland en Europa</w:t>
+        <w:t xml:space="preserve">ook de belangrijkste intellectueel </w:t>
+      </w:r>
+      <w:r>
+        <w:rPr>
+          <w:rFonts w:ascii="Courier New" w:hAnsi="Courier New" w:cs="Courier New"/>
+          <w:sz w:val="22"/>
+          <w:szCs w:val="22"/>
+        </w:rPr>
+        <w:t xml:space="preserve">in maatschappelijke en politieke debatten </w:t>
+      </w:r>
+      <w:r>
+        <w:rPr>
+          <w:rFonts w:ascii="Courier New" w:hAnsi="Courier New" w:cs="Courier New"/>
+          <w:sz w:val="22"/>
+          <w:szCs w:val="22"/>
+        </w:rPr>
+        <w:t>in Duitsland en Europa</w:t>
       </w:r>
       <w:r>
         <w:rPr>
@@ -244,6 +350,14 @@
           <w:sz w:val="22"/>
           <w:szCs w:val="22"/>
         </w:rPr>
+        <w:t>, waar dit boek over gaat</w:t>
+      </w:r>
+      <w:r>
+        <w:rPr>
+          <w:rFonts w:ascii="Courier New" w:hAnsi="Courier New" w:cs="Courier New"/>
+          <w:sz w:val="22"/>
+          <w:szCs w:val="22"/>
+        </w:rPr>
         <w:t>.</w:t>
       </w:r>
       <w:r>
@@ -260,7 +374,23 @@
           <w:sz w:val="22"/>
           <w:szCs w:val="22"/>
         </w:rPr>
-        <w:t xml:space="preserve">Zijn filosofische theorieën over communicatieve rationaliteit, democratie, rechtvaardigheid en de publieke sfeer vormen de achtergrond van </w:t>
+        <w:t xml:space="preserve">Zijn theorieën over communicatieve rationaliteit, democratie, rechtvaardigheid en de publieke sfeer vormen </w:t>
+      </w:r>
+      <w:r>
+        <w:rPr>
+          <w:rFonts w:ascii="Courier New" w:hAnsi="Courier New" w:cs="Courier New"/>
+          <w:sz w:val="22"/>
+          <w:szCs w:val="22"/>
+        </w:rPr>
+        <w:t xml:space="preserve">in dit boek </w:t>
+      </w:r>
+      <w:r>
+        <w:rPr>
+          <w:rFonts w:ascii="Courier New" w:hAnsi="Courier New" w:cs="Courier New"/>
+          <w:sz w:val="22"/>
+          <w:szCs w:val="22"/>
+        </w:rPr>
+        <w:t xml:space="preserve">de achtergrond van </w:t>
       </w:r>
       <w:r>
         <w:rPr>
@@ -284,7 +414,31 @@
           <w:sz w:val="22"/>
           <w:szCs w:val="22"/>
         </w:rPr>
-        <w:t xml:space="preserve"> die Habermas gepleegd heeft de afgelopen decennia</w:t>
+        <w:t xml:space="preserve"> die Habermas </w:t>
+      </w:r>
+      <w:r>
+        <w:rPr>
+          <w:rFonts w:ascii="Courier New" w:hAnsi="Courier New" w:cs="Courier New"/>
+          <w:sz w:val="22"/>
+          <w:szCs w:val="22"/>
+        </w:rPr>
+        <w:t xml:space="preserve">pleegde in </w:t>
+      </w:r>
+      <w:r>
+        <w:rPr>
+          <w:rFonts w:ascii="Courier New" w:hAnsi="Courier New" w:cs="Courier New"/>
+          <w:sz w:val="22"/>
+          <w:szCs w:val="22"/>
+        </w:rPr>
+        <w:t xml:space="preserve">de afgelopen </w:t>
+      </w:r>
+      <w:r>
+        <w:rPr>
+          <w:rFonts w:ascii="Courier New" w:hAnsi="Courier New" w:cs="Courier New"/>
+          <w:sz w:val="22"/>
+          <w:szCs w:val="22"/>
+        </w:rPr>
+        <w:t>zeventig jaar</w:t>
       </w:r>
       <w:r>
         <w:rPr>
@@ -300,31 +454,71 @@
           <w:sz w:val="22"/>
           <w:szCs w:val="22"/>
         </w:rPr>
-        <w:t>Z</w:t>
-      </w:r>
-      <w:r>
-        <w:rPr>
-          <w:rFonts w:ascii="Courier New" w:hAnsi="Courier New" w:cs="Courier New"/>
-          <w:sz w:val="22"/>
-          <w:szCs w:val="22"/>
-        </w:rPr>
-        <w:t xml:space="preserve">ijn theoretische inzichten mede </w:t>
-      </w:r>
-      <w:r>
-        <w:rPr>
-          <w:rFonts w:ascii="Courier New" w:hAnsi="Courier New" w:cs="Courier New"/>
-          <w:sz w:val="22"/>
-          <w:szCs w:val="22"/>
-        </w:rPr>
-        <w:t xml:space="preserve">werden tegelijk ook </w:t>
-      </w:r>
-      <w:r>
-        <w:rPr>
-          <w:rFonts w:ascii="Courier New" w:hAnsi="Courier New" w:cs="Courier New"/>
-          <w:sz w:val="22"/>
-          <w:szCs w:val="22"/>
-        </w:rPr>
-        <w:t>gevoed door de politieke en maatschappelijke ontwikkelingen waarmee hij zich gedurende zijn leven bezighield.</w:t>
+        <w:t xml:space="preserve">Het is volgens </w:t>
+      </w:r>
+      <w:r>
+        <w:rPr>
+          <w:rFonts w:ascii="Courier New" w:hAnsi="Courier New" w:cs="Courier New"/>
+          <w:sz w:val="22"/>
+          <w:szCs w:val="22"/>
+        </w:rPr>
+        <w:t>Verovšek</w:t>
+      </w:r>
+      <w:r>
+        <w:rPr>
+          <w:rFonts w:ascii="Courier New" w:hAnsi="Courier New" w:cs="Courier New"/>
+          <w:sz w:val="22"/>
+          <w:szCs w:val="22"/>
+        </w:rPr>
+        <w:t xml:space="preserve"> duidelijk. </w:t>
+      </w:r>
+      <w:r>
+        <w:rPr>
+          <w:rFonts w:ascii="Courier New" w:hAnsi="Courier New" w:cs="Courier New"/>
+          <w:sz w:val="22"/>
+          <w:szCs w:val="22"/>
+        </w:rPr>
+        <w:t xml:space="preserve">Habermas’ filosofische inzichten en zijn politieke interventies kunnen eigenlijk niet los van elkaar worden gezien. </w:t>
+      </w:r>
+      <w:r>
+        <w:rPr>
+          <w:rFonts w:ascii="Courier New" w:hAnsi="Courier New" w:cs="Courier New"/>
+          <w:sz w:val="22"/>
+          <w:szCs w:val="22"/>
+        </w:rPr>
+        <w:t>Door het boek krijg je een aanvullend inzicht in Habermas’ werk. Tegelijk is het</w:t>
+      </w:r>
+      <w:r>
+        <w:rPr>
+          <w:rFonts w:ascii="Courier New" w:hAnsi="Courier New" w:cs="Courier New"/>
+          <w:sz w:val="22"/>
+          <w:szCs w:val="22"/>
+        </w:rPr>
+        <w:t xml:space="preserve"> een heel mooi boek over de geschiedenis van Duitland </w:t>
+      </w:r>
+      <w:r>
+        <w:rPr>
+          <w:rFonts w:ascii="Courier New" w:hAnsi="Courier New" w:cs="Courier New"/>
+          <w:sz w:val="22"/>
+          <w:szCs w:val="22"/>
+        </w:rPr>
+        <w:t xml:space="preserve">(en Europa) </w:t>
+      </w:r>
+      <w:r>
+        <w:rPr>
+          <w:rFonts w:ascii="Courier New" w:hAnsi="Courier New" w:cs="Courier New"/>
+          <w:sz w:val="22"/>
+          <w:szCs w:val="22"/>
+        </w:rPr>
+        <w:t>na de Tweede Wereldoorlog.</w:t>
+      </w:r>
+      <w:r>
+        <w:rPr>
+          <w:rFonts w:ascii="Courier New" w:hAnsi="Courier New" w:cs="Courier New"/>
+          <w:sz w:val="22"/>
+          <w:szCs w:val="22"/>
+        </w:rPr>
+        <w:t xml:space="preserve"> </w:t>
       </w:r>
     </w:p>
     <w:p>
@@ -343,15 +537,736 @@
           <w:sz w:val="22"/>
           <w:szCs w:val="22"/>
         </w:rPr>
-        <w:t xml:space="preserve">Habermas’ </w:t>
-      </w:r>
-      <w:r>
-        <w:rPr>
-          <w:rFonts w:ascii="Courier New" w:hAnsi="Courier New" w:cs="Courier New"/>
-          <w:sz w:val="22"/>
-          <w:szCs w:val="22"/>
-        </w:rPr>
-        <w:t>filosofie wordt soms voorgesteld als abstract, idealistisch en onvoldoende gevoelig voor de feitelijke politieke verhoudingen. Volgens Verovšek miskent die kritiek dat Habermas gedurende meer dan zeventig jaar actief heeft deelgenomen aan discussies over democratie, het naziverleden, de studentenbeweging, de Duitse hereniging, Europese integratie en internationale conflicten. Zijn filosofie was geen vlucht uit de werkelijkheid, maar een poging de voorwaarden voor een democratische samenleving te begrijpen en te verdedigen.</w:t>
+        <w:t>Als vertegenwoordiger van de kritische theorie</w:t>
+      </w:r>
+      <w:r>
+        <w:rPr>
+          <w:rFonts w:ascii="Courier New" w:hAnsi="Courier New" w:cs="Courier New"/>
+          <w:sz w:val="22"/>
+          <w:szCs w:val="22"/>
+        </w:rPr>
+        <w:t xml:space="preserve"> ontwikkelde Habermas een </w:t>
+      </w:r>
+      <w:r>
+        <w:rPr>
+          <w:rFonts w:ascii="Courier New" w:hAnsi="Courier New" w:cs="Courier New"/>
+          <w:sz w:val="22"/>
+          <w:szCs w:val="22"/>
+        </w:rPr>
+        <w:t xml:space="preserve">hele </w:t>
+      </w:r>
+      <w:r>
+        <w:rPr>
+          <w:rFonts w:ascii="Courier New" w:hAnsi="Courier New" w:cs="Courier New"/>
+          <w:sz w:val="22"/>
+          <w:szCs w:val="22"/>
+        </w:rPr>
+        <w:t>eigen opvatting over</w:t>
+      </w:r>
+      <w:r>
+        <w:rPr>
+          <w:rFonts w:ascii="Courier New" w:hAnsi="Courier New" w:cs="Courier New"/>
+          <w:sz w:val="22"/>
+          <w:szCs w:val="22"/>
+        </w:rPr>
+        <w:t xml:space="preserve"> d</w:t>
+      </w:r>
+      <w:r>
+        <w:rPr>
+          <w:rFonts w:ascii="Courier New" w:hAnsi="Courier New" w:cs="Courier New"/>
+          <w:sz w:val="22"/>
+          <w:szCs w:val="22"/>
+        </w:rPr>
+        <w:t>e maatschappelijke verantwoordelijkheid van filosofen</w:t>
+      </w:r>
+      <w:r>
+        <w:rPr>
+          <w:rFonts w:ascii="Courier New" w:hAnsi="Courier New" w:cs="Courier New"/>
+          <w:sz w:val="22"/>
+          <w:szCs w:val="22"/>
+        </w:rPr>
+        <w:t xml:space="preserve"> </w:t>
+      </w:r>
+      <w:r>
+        <w:rPr>
+          <w:rFonts w:ascii="Courier New" w:hAnsi="Courier New" w:cs="Courier New"/>
+          <w:sz w:val="22"/>
+          <w:szCs w:val="22"/>
+        </w:rPr>
+        <w:t xml:space="preserve"> en </w:t>
+      </w:r>
+      <w:r>
+        <w:rPr>
+          <w:rFonts w:ascii="Courier New" w:hAnsi="Courier New" w:cs="Courier New"/>
+          <w:sz w:val="22"/>
+          <w:szCs w:val="22"/>
+        </w:rPr>
+        <w:t xml:space="preserve">over </w:t>
+      </w:r>
+      <w:r>
+        <w:rPr>
+          <w:rFonts w:ascii="Courier New" w:hAnsi="Courier New" w:cs="Courier New"/>
+          <w:sz w:val="22"/>
+          <w:szCs w:val="22"/>
+        </w:rPr>
+        <w:t xml:space="preserve">de relatie tussen </w:t>
+      </w:r>
+      <w:r>
+        <w:rPr>
+          <w:rFonts w:ascii="Courier New" w:hAnsi="Courier New" w:cs="Courier New"/>
+          <w:sz w:val="22"/>
+          <w:szCs w:val="22"/>
+        </w:rPr>
+        <w:t>theorie en praktijk</w:t>
+      </w:r>
+      <w:r>
+        <w:rPr>
+          <w:rFonts w:ascii="Courier New" w:hAnsi="Courier New" w:cs="Courier New"/>
+          <w:sz w:val="22"/>
+          <w:szCs w:val="22"/>
+        </w:rPr>
+        <w:t xml:space="preserve">. </w:t>
+      </w:r>
+      <w:r>
+        <w:rPr>
+          <w:rFonts w:ascii="Courier New" w:hAnsi="Courier New" w:cs="Courier New"/>
+          <w:sz w:val="22"/>
+          <w:szCs w:val="22"/>
+        </w:rPr>
+        <w:t xml:space="preserve">Politieke en maatschappelijke discussies waren </w:t>
+      </w:r>
+      <w:r>
+        <w:rPr>
+          <w:rFonts w:ascii="Courier New" w:hAnsi="Courier New" w:cs="Courier New"/>
+          <w:sz w:val="22"/>
+          <w:szCs w:val="22"/>
+        </w:rPr>
+        <w:lastRenderedPageBreak/>
+        <w:t>voor</w:t>
+      </w:r>
+      <w:r>
+        <w:rPr>
+          <w:rFonts w:ascii="Courier New" w:hAnsi="Courier New" w:cs="Courier New"/>
+          <w:sz w:val="22"/>
+          <w:szCs w:val="22"/>
+        </w:rPr>
+        <w:t xml:space="preserve"> hem </w:t>
+      </w:r>
+      <w:r>
+        <w:rPr>
+          <w:rFonts w:ascii="Courier New" w:hAnsi="Courier New" w:cs="Courier New"/>
+          <w:sz w:val="22"/>
+          <w:szCs w:val="22"/>
+        </w:rPr>
+        <w:t>democratische gesprek</w:t>
+      </w:r>
+      <w:r>
+        <w:rPr>
+          <w:rFonts w:ascii="Courier New" w:hAnsi="Courier New" w:cs="Courier New"/>
+          <w:sz w:val="22"/>
+          <w:szCs w:val="22"/>
+        </w:rPr>
+        <w:t>ken</w:t>
+      </w:r>
+      <w:r>
+        <w:rPr>
+          <w:rFonts w:ascii="Courier New" w:hAnsi="Courier New" w:cs="Courier New"/>
+          <w:sz w:val="22"/>
+          <w:szCs w:val="22"/>
+        </w:rPr>
+        <w:t xml:space="preserve"> </w:t>
+      </w:r>
+      <w:r>
+        <w:rPr>
+          <w:rFonts w:ascii="Courier New" w:hAnsi="Courier New" w:cs="Courier New"/>
+          <w:sz w:val="22"/>
+          <w:szCs w:val="22"/>
+        </w:rPr>
+        <w:t>waaraan hij wilde meedoen</w:t>
+      </w:r>
+      <w:r>
+        <w:rPr>
+          <w:rFonts w:ascii="Courier New" w:hAnsi="Courier New" w:cs="Courier New"/>
+          <w:sz w:val="22"/>
+          <w:szCs w:val="22"/>
+        </w:rPr>
+        <w:t xml:space="preserve">, zonder daarbij overigens </w:t>
+      </w:r>
+      <w:r>
+        <w:rPr>
+          <w:rFonts w:ascii="Courier New" w:hAnsi="Courier New" w:cs="Courier New"/>
+          <w:sz w:val="22"/>
+          <w:szCs w:val="22"/>
+        </w:rPr>
+        <w:t xml:space="preserve">als hoogleraar filosofie </w:t>
+      </w:r>
+      <w:r>
+        <w:rPr>
+          <w:rFonts w:ascii="Courier New" w:hAnsi="Courier New" w:cs="Courier New"/>
+          <w:sz w:val="22"/>
+          <w:szCs w:val="22"/>
+        </w:rPr>
+        <w:t>a</w:t>
+      </w:r>
+      <w:r>
+        <w:rPr>
+          <w:rFonts w:ascii="Courier New" w:hAnsi="Courier New" w:cs="Courier New"/>
+          <w:sz w:val="22"/>
+          <w:szCs w:val="22"/>
+        </w:rPr>
+        <w:t>anspraak te willen maken</w:t>
+      </w:r>
+      <w:r>
+        <w:rPr>
+          <w:rFonts w:ascii="Courier New" w:hAnsi="Courier New" w:cs="Courier New"/>
+          <w:sz w:val="22"/>
+          <w:szCs w:val="22"/>
+        </w:rPr>
+        <w:t xml:space="preserve"> op een bevoorrechte positie.</w:t>
+      </w:r>
+      <w:r>
+        <w:rPr>
+          <w:rFonts w:ascii="Courier New" w:hAnsi="Courier New" w:cs="Courier New"/>
+          <w:sz w:val="22"/>
+          <w:szCs w:val="22"/>
+        </w:rPr>
+        <w:t xml:space="preserve"> </w:t>
+      </w:r>
+      <w:r>
+        <w:rPr>
+          <w:rFonts w:ascii="Courier New" w:hAnsi="Courier New" w:cs="Courier New"/>
+          <w:sz w:val="22"/>
+          <w:szCs w:val="22"/>
+        </w:rPr>
+        <w:t>Hij wilde</w:t>
+      </w:r>
+      <w:r>
+        <w:rPr>
+          <w:rFonts w:ascii="Courier New" w:hAnsi="Courier New" w:cs="Courier New"/>
+          <w:sz w:val="22"/>
+          <w:szCs w:val="22"/>
+        </w:rPr>
+        <w:t xml:space="preserve"> democratie te </w:t>
+      </w:r>
+      <w:r>
+        <w:rPr>
+          <w:rFonts w:ascii="Courier New" w:hAnsi="Courier New" w:cs="Courier New"/>
+          <w:sz w:val="22"/>
+          <w:szCs w:val="22"/>
+        </w:rPr>
+        <w:t>versterken door argumenten aan te dragen</w:t>
+      </w:r>
+      <w:r>
+        <w:rPr>
+          <w:rFonts w:ascii="Courier New" w:hAnsi="Courier New" w:cs="Courier New"/>
+          <w:sz w:val="22"/>
+          <w:szCs w:val="22"/>
+        </w:rPr>
+        <w:t xml:space="preserve"> zodat er betere beslissingen </w:t>
+      </w:r>
+      <w:r>
+        <w:rPr>
+          <w:rFonts w:ascii="Courier New" w:hAnsi="Courier New" w:cs="Courier New"/>
+          <w:sz w:val="22"/>
+          <w:szCs w:val="22"/>
+        </w:rPr>
+        <w:t xml:space="preserve">konden worden </w:t>
+      </w:r>
+      <w:r>
+        <w:rPr>
+          <w:rFonts w:ascii="Courier New" w:hAnsi="Courier New" w:cs="Courier New"/>
+          <w:sz w:val="22"/>
+          <w:szCs w:val="22"/>
+        </w:rPr>
+        <w:t xml:space="preserve">genomen </w:t>
+      </w:r>
+      <w:r>
+        <w:rPr>
+          <w:rFonts w:ascii="Courier New" w:hAnsi="Courier New" w:cs="Courier New"/>
+          <w:sz w:val="22"/>
+          <w:szCs w:val="22"/>
+        </w:rPr>
+        <w:t xml:space="preserve">in </w:t>
+      </w:r>
+      <w:r>
+        <w:rPr>
+          <w:rFonts w:ascii="Courier New" w:hAnsi="Courier New" w:cs="Courier New"/>
+          <w:sz w:val="22"/>
+          <w:szCs w:val="22"/>
+        </w:rPr>
+        <w:t>de samenleving.</w:t>
+      </w:r>
+      <w:r>
+        <w:rPr>
+          <w:rFonts w:ascii="Courier New" w:hAnsi="Courier New" w:cs="Courier New"/>
+          <w:sz w:val="22"/>
+          <w:szCs w:val="22"/>
+        </w:rPr>
+        <w:t xml:space="preserve"> </w:t>
+      </w:r>
+      <w:r>
+        <w:rPr>
+          <w:rFonts w:ascii="Courier New" w:hAnsi="Courier New" w:cs="Courier New"/>
+          <w:sz w:val="22"/>
+          <w:szCs w:val="22"/>
+        </w:rPr>
+        <w:t>Democratie</w:t>
+      </w:r>
+      <w:r>
+        <w:rPr>
+          <w:rFonts w:ascii="Courier New" w:hAnsi="Courier New" w:cs="Courier New"/>
+          <w:sz w:val="22"/>
+          <w:szCs w:val="22"/>
+        </w:rPr>
+        <w:t xml:space="preserve"> </w:t>
+      </w:r>
+      <w:r>
+        <w:rPr>
+          <w:rFonts w:ascii="Courier New" w:hAnsi="Courier New" w:cs="Courier New"/>
+          <w:sz w:val="22"/>
+          <w:szCs w:val="22"/>
+        </w:rPr>
+        <w:t>heeft</w:t>
+      </w:r>
+      <w:r>
+        <w:rPr>
+          <w:rFonts w:ascii="Courier New" w:hAnsi="Courier New" w:cs="Courier New"/>
+          <w:sz w:val="22"/>
+          <w:szCs w:val="22"/>
+        </w:rPr>
+        <w:t xml:space="preserve"> maatschappelijke ruimten</w:t>
+      </w:r>
+      <w:r>
+        <w:rPr>
+          <w:rFonts w:ascii="Courier New" w:hAnsi="Courier New" w:cs="Courier New"/>
+          <w:sz w:val="22"/>
+          <w:szCs w:val="22"/>
+        </w:rPr>
+        <w:t> </w:t>
+      </w:r>
+      <w:r>
+        <w:rPr>
+          <w:rFonts w:ascii="Courier New" w:hAnsi="Courier New" w:cs="Courier New"/>
+          <w:sz w:val="22"/>
+          <w:szCs w:val="22"/>
+        </w:rPr>
+        <w:t xml:space="preserve">nodig </w:t>
+      </w:r>
+      <w:r>
+        <w:rPr>
+          <w:rFonts w:ascii="Courier New" w:hAnsi="Courier New" w:cs="Courier New"/>
+          <w:sz w:val="22"/>
+          <w:szCs w:val="22"/>
+        </w:rPr>
+        <w:t>waar</w:t>
+      </w:r>
+      <w:r>
+        <w:rPr>
+          <w:rFonts w:ascii="Courier New" w:hAnsi="Courier New" w:cs="Courier New"/>
+          <w:sz w:val="22"/>
+          <w:szCs w:val="22"/>
+        </w:rPr>
+        <w:t xml:space="preserve"> burgers </w:t>
+      </w:r>
+      <w:r>
+        <w:rPr>
+          <w:rFonts w:ascii="Courier New" w:hAnsi="Courier New" w:cs="Courier New"/>
+          <w:sz w:val="22"/>
+          <w:szCs w:val="22"/>
+        </w:rPr>
+        <w:t xml:space="preserve">met elkaar </w:t>
+      </w:r>
+      <w:r>
+        <w:rPr>
+          <w:rFonts w:ascii="Courier New" w:hAnsi="Courier New" w:cs="Courier New"/>
+          <w:sz w:val="22"/>
+          <w:szCs w:val="22"/>
+        </w:rPr>
+        <w:t xml:space="preserve">informatie uitwisselen, argumenten bespreken en </w:t>
+      </w:r>
+      <w:r>
+        <w:rPr>
+          <w:rFonts w:ascii="Courier New" w:hAnsi="Courier New" w:cs="Courier New"/>
+          <w:sz w:val="22"/>
+          <w:szCs w:val="22"/>
+        </w:rPr>
+        <w:t xml:space="preserve">waar </w:t>
+      </w:r>
+      <w:r>
+        <w:rPr>
+          <w:rFonts w:ascii="Courier New" w:hAnsi="Courier New" w:cs="Courier New"/>
+          <w:sz w:val="22"/>
+          <w:szCs w:val="22"/>
+        </w:rPr>
+        <w:t xml:space="preserve">uiteindelijk </w:t>
+      </w:r>
+      <w:r>
+        <w:rPr>
+          <w:rFonts w:ascii="Courier New" w:hAnsi="Courier New" w:cs="Courier New"/>
+          <w:sz w:val="22"/>
+          <w:szCs w:val="22"/>
+        </w:rPr>
+        <w:t xml:space="preserve">gezamenlijk oordelen </w:t>
+      </w:r>
+      <w:r>
+        <w:rPr>
+          <w:rFonts w:ascii="Courier New" w:hAnsi="Courier New" w:cs="Courier New"/>
+          <w:sz w:val="22"/>
+          <w:szCs w:val="22"/>
+        </w:rPr>
+        <w:t>worden ge</w:t>
+      </w:r>
+      <w:r>
+        <w:rPr>
+          <w:rFonts w:ascii="Courier New" w:hAnsi="Courier New" w:cs="Courier New"/>
+          <w:sz w:val="22"/>
+          <w:szCs w:val="22"/>
+        </w:rPr>
+        <w:t>vorm</w:t>
+      </w:r>
+      <w:r>
+        <w:rPr>
+          <w:rFonts w:ascii="Courier New" w:hAnsi="Courier New" w:cs="Courier New"/>
+          <w:sz w:val="22"/>
+          <w:szCs w:val="22"/>
+        </w:rPr>
+        <w:t>d</w:t>
+      </w:r>
+      <w:r>
+        <w:rPr>
+          <w:rFonts w:ascii="Courier New" w:hAnsi="Courier New" w:cs="Courier New"/>
+          <w:sz w:val="22"/>
+          <w:szCs w:val="22"/>
+        </w:rPr>
+        <w:t xml:space="preserve"> over </w:t>
+      </w:r>
+      <w:r>
+        <w:rPr>
+          <w:rFonts w:ascii="Courier New" w:hAnsi="Courier New" w:cs="Courier New"/>
+          <w:sz w:val="22"/>
+          <w:szCs w:val="22"/>
+        </w:rPr>
+        <w:t>zaken die iedereen aangaan</w:t>
+      </w:r>
+      <w:r>
+        <w:rPr>
+          <w:rFonts w:ascii="Courier New" w:hAnsi="Courier New" w:cs="Courier New"/>
+          <w:sz w:val="22"/>
+          <w:szCs w:val="22"/>
+        </w:rPr>
+        <w:t>.</w:t>
+      </w:r>
+      <w:r>
+        <w:rPr>
+          <w:rFonts w:ascii="Courier New" w:hAnsi="Courier New" w:cs="Courier New"/>
+          <w:sz w:val="22"/>
+          <w:szCs w:val="22"/>
+        </w:rPr>
+        <w:t xml:space="preserve"> </w:t>
+      </w:r>
+      <w:r>
+        <w:rPr>
+          <w:rFonts w:ascii="Courier New" w:hAnsi="Courier New" w:cs="Courier New"/>
+          <w:sz w:val="22"/>
+          <w:szCs w:val="22"/>
+        </w:rPr>
+        <w:t>D</w:t>
+      </w:r>
+      <w:r>
+        <w:rPr>
+          <w:rFonts w:ascii="Courier New" w:hAnsi="Courier New" w:cs="Courier New"/>
+          <w:sz w:val="22"/>
+          <w:szCs w:val="22"/>
+        </w:rPr>
+        <w:t xml:space="preserve">emocratie </w:t>
+      </w:r>
+      <w:r>
+        <w:rPr>
+          <w:rFonts w:ascii="Courier New" w:hAnsi="Courier New" w:cs="Courier New"/>
+          <w:sz w:val="22"/>
+          <w:szCs w:val="22"/>
+        </w:rPr>
+        <w:t>is zoveel meer dan</w:t>
+      </w:r>
+      <w:r>
+        <w:rPr>
+          <w:rFonts w:ascii="Courier New" w:hAnsi="Courier New" w:cs="Courier New"/>
+          <w:sz w:val="22"/>
+          <w:szCs w:val="22"/>
+        </w:rPr>
+        <w:t xml:space="preserve"> verkiezingen, parlementen en juridische procedures</w:t>
+      </w:r>
+      <w:r>
+        <w:rPr>
+          <w:rFonts w:ascii="Courier New" w:hAnsi="Courier New" w:cs="Courier New"/>
+          <w:sz w:val="22"/>
+          <w:szCs w:val="22"/>
+        </w:rPr>
+        <w:t>. Ze</w:t>
+      </w:r>
+      <w:r>
+        <w:rPr>
+          <w:rFonts w:ascii="Courier New" w:hAnsi="Courier New" w:cs="Courier New"/>
+          <w:sz w:val="22"/>
+          <w:szCs w:val="22"/>
+        </w:rPr>
+        <w:t xml:space="preserve"> vraagt ook een</w:t>
+      </w:r>
+      <w:r>
+        <w:rPr>
+          <w:rFonts w:ascii="Courier New" w:hAnsi="Courier New" w:cs="Courier New"/>
+          <w:sz w:val="22"/>
+          <w:szCs w:val="22"/>
+        </w:rPr>
+        <w:t xml:space="preserve"> levende publieke cultuur waarin burgers hun opvattingen kunnen </w:t>
+      </w:r>
+      <w:r>
+        <w:rPr>
+          <w:rFonts w:ascii="Courier New" w:hAnsi="Courier New" w:cs="Courier New"/>
+          <w:sz w:val="22"/>
+          <w:szCs w:val="22"/>
+        </w:rPr>
+        <w:t xml:space="preserve">vormen en </w:t>
+      </w:r>
+      <w:r>
+        <w:rPr>
+          <w:rFonts w:ascii="Courier New" w:hAnsi="Courier New" w:cs="Courier New"/>
+          <w:sz w:val="22"/>
+          <w:szCs w:val="22"/>
+        </w:rPr>
+        <w:t xml:space="preserve">ontwikkelen en </w:t>
+      </w:r>
+      <w:r>
+        <w:rPr>
+          <w:rFonts w:ascii="Courier New" w:hAnsi="Courier New" w:cs="Courier New"/>
+          <w:sz w:val="22"/>
+          <w:szCs w:val="22"/>
+        </w:rPr>
+        <w:t xml:space="preserve">waarin </w:t>
+      </w:r>
+      <w:r>
+        <w:rPr>
+          <w:rFonts w:ascii="Courier New" w:hAnsi="Courier New" w:cs="Courier New"/>
+          <w:sz w:val="22"/>
+          <w:szCs w:val="22"/>
+        </w:rPr>
+        <w:t xml:space="preserve">machthebbers ter verantwoording kunnen </w:t>
+      </w:r>
+      <w:r>
+        <w:rPr>
+          <w:rFonts w:ascii="Courier New" w:hAnsi="Courier New" w:cs="Courier New"/>
+          <w:sz w:val="22"/>
+          <w:szCs w:val="22"/>
+        </w:rPr>
+        <w:t>worden ge</w:t>
+      </w:r>
+      <w:r>
+        <w:rPr>
+          <w:rFonts w:ascii="Courier New" w:hAnsi="Courier New" w:cs="Courier New"/>
+          <w:sz w:val="22"/>
+          <w:szCs w:val="22"/>
+        </w:rPr>
+        <w:t>roepen.</w:t>
+      </w:r>
+      <w:r>
+        <w:rPr>
+          <w:rFonts w:ascii="Courier New" w:hAnsi="Courier New" w:cs="Courier New"/>
+          <w:sz w:val="22"/>
+          <w:szCs w:val="22"/>
+        </w:rPr>
+        <w:t xml:space="preserve"> </w:t>
+      </w:r>
+      <w:r>
+        <w:rPr>
+          <w:rFonts w:ascii="Courier New" w:hAnsi="Courier New" w:cs="Courier New"/>
+          <w:sz w:val="22"/>
+          <w:szCs w:val="22"/>
+        </w:rPr>
+        <w:t xml:space="preserve">Politiek </w:t>
+      </w:r>
+      <w:r>
+        <w:rPr>
+          <w:rFonts w:ascii="Courier New" w:hAnsi="Courier New" w:cs="Courier New"/>
+          <w:sz w:val="22"/>
+          <w:szCs w:val="22"/>
+        </w:rPr>
+        <w:t>is zoveel meer</w:t>
+      </w:r>
+      <w:r>
+        <w:rPr>
+          <w:rFonts w:ascii="Courier New" w:hAnsi="Courier New" w:cs="Courier New"/>
+          <w:sz w:val="22"/>
+          <w:szCs w:val="22"/>
+        </w:rPr>
+        <w:t xml:space="preserve"> dan</w:t>
+      </w:r>
+      <w:r>
+        <w:rPr>
+          <w:rFonts w:ascii="Courier New" w:hAnsi="Courier New" w:cs="Courier New"/>
+          <w:sz w:val="22"/>
+          <w:szCs w:val="22"/>
+        </w:rPr>
+        <w:t xml:space="preserve"> macht, traditie of economisch belang</w:t>
+      </w:r>
+      <w:r>
+        <w:rPr>
+          <w:rFonts w:ascii="Courier New" w:hAnsi="Courier New" w:cs="Courier New"/>
+          <w:sz w:val="22"/>
+          <w:szCs w:val="22"/>
+        </w:rPr>
+        <w:t xml:space="preserve"> en dan komt</w:t>
+      </w:r>
+      <w:r>
+        <w:rPr>
+          <w:rFonts w:ascii="Courier New" w:hAnsi="Courier New" w:cs="Courier New"/>
+          <w:sz w:val="22"/>
+          <w:szCs w:val="22"/>
+        </w:rPr>
+        <w:t xml:space="preserve"> het vermogen elkaar argumenten voor te leggen en tot wederzijds begrip te komen</w:t>
+      </w:r>
+      <w:r>
+        <w:rPr>
+          <w:rFonts w:ascii="Courier New" w:hAnsi="Courier New" w:cs="Courier New"/>
+          <w:sz w:val="22"/>
+          <w:szCs w:val="22"/>
+        </w:rPr>
+        <w:t xml:space="preserve"> om de hoek kijken</w:t>
+      </w:r>
+      <w:r>
+        <w:rPr>
+          <w:rFonts w:ascii="Courier New" w:hAnsi="Courier New" w:cs="Courier New"/>
+          <w:sz w:val="22"/>
+          <w:szCs w:val="22"/>
+        </w:rPr>
+        <w:t>.</w:t>
+      </w:r>
+      <w:r>
+        <w:rPr>
+          <w:rFonts w:ascii="Courier New" w:hAnsi="Courier New" w:cs="Courier New"/>
+          <w:sz w:val="22"/>
+          <w:szCs w:val="22"/>
+        </w:rPr>
+        <w:t xml:space="preserve"> </w:t>
+      </w:r>
+      <w:r>
+        <w:rPr>
+          <w:rFonts w:ascii="Courier New" w:hAnsi="Courier New" w:cs="Courier New"/>
+          <w:sz w:val="22"/>
+          <w:szCs w:val="22"/>
+        </w:rPr>
+        <w:t xml:space="preserve">En niet om het altijd maar met elkaar eens te worden. </w:t>
+      </w:r>
+      <w:r>
+        <w:rPr>
+          <w:rFonts w:ascii="Courier New" w:hAnsi="Courier New" w:cs="Courier New"/>
+          <w:sz w:val="22"/>
+          <w:szCs w:val="22"/>
+        </w:rPr>
+        <w:t>Deze gedachten zit niet alleeen in zijn theoretisch werk</w:t>
+      </w:r>
+      <w:r>
+        <w:rPr>
+          <w:rFonts w:ascii="Courier New" w:hAnsi="Courier New" w:cs="Courier New"/>
+          <w:sz w:val="22"/>
+          <w:szCs w:val="22"/>
+        </w:rPr>
+        <w:t xml:space="preserve"> en die heeft hij</w:t>
+      </w:r>
+      <w:r>
+        <w:rPr>
+          <w:rFonts w:ascii="Courier New" w:hAnsi="Courier New" w:cs="Courier New"/>
+          <w:sz w:val="22"/>
+          <w:szCs w:val="22"/>
+        </w:rPr>
+        <w:t xml:space="preserve"> ook in zijn publieke werk proberen </w:t>
+      </w:r>
+      <w:r>
+        <w:rPr>
+          <w:rFonts w:ascii="Courier New" w:hAnsi="Courier New" w:cs="Courier New"/>
+          <w:sz w:val="22"/>
+          <w:szCs w:val="22"/>
+        </w:rPr>
+        <w:t xml:space="preserve">waar te maken. </w:t>
+      </w:r>
+      <w:r>
+        <w:rPr>
+          <w:rFonts w:ascii="Courier New" w:hAnsi="Courier New" w:cs="Courier New"/>
+          <w:sz w:val="22"/>
+          <w:szCs w:val="22"/>
+        </w:rPr>
+        <w:t>Als geen ander leverde hij bijdragen aan de democratische meningsvorming met</w:t>
+      </w:r>
+      <w:r>
+        <w:rPr>
+          <w:rFonts w:ascii="Courier New" w:hAnsi="Courier New" w:cs="Courier New"/>
+          <w:sz w:val="22"/>
+          <w:szCs w:val="22"/>
+        </w:rPr>
+        <w:t xml:space="preserve"> </w:t>
+      </w:r>
+      <w:r>
+        <w:rPr>
+          <w:rFonts w:ascii="Courier New" w:hAnsi="Courier New" w:cs="Courier New"/>
+          <w:sz w:val="22"/>
+          <w:szCs w:val="22"/>
+        </w:rPr>
+        <w:t xml:space="preserve">zijn </w:t>
+      </w:r>
+      <w:r>
+        <w:rPr>
+          <w:rFonts w:ascii="Courier New" w:hAnsi="Courier New" w:cs="Courier New"/>
+          <w:sz w:val="22"/>
+          <w:szCs w:val="22"/>
+        </w:rPr>
+        <w:t xml:space="preserve">essays, krantenartikelen, interviews en publieke discussies </w:t>
+      </w:r>
+      <w:r>
+        <w:rPr>
+          <w:rFonts w:ascii="Courier New" w:hAnsi="Courier New" w:cs="Courier New"/>
+          <w:sz w:val="22"/>
+          <w:szCs w:val="22"/>
+        </w:rPr>
+        <w:t>waaraan hij deelnam</w:t>
+      </w:r>
+      <w:r>
+        <w:rPr>
+          <w:rFonts w:ascii="Courier New" w:hAnsi="Courier New" w:cs="Courier New"/>
+          <w:sz w:val="22"/>
+          <w:szCs w:val="22"/>
+        </w:rPr>
+        <w:t xml:space="preserve">. Zijn </w:t>
+      </w:r>
+      <w:r>
+        <w:rPr>
+          <w:rFonts w:ascii="Courier New" w:hAnsi="Courier New" w:cs="Courier New"/>
+          <w:sz w:val="22"/>
+          <w:szCs w:val="22"/>
+        </w:rPr>
+        <w:t xml:space="preserve">wat afstandelijke </w:t>
+      </w:r>
+      <w:r>
+        <w:rPr>
+          <w:rFonts w:ascii="Courier New" w:hAnsi="Courier New" w:cs="Courier New"/>
+          <w:sz w:val="22"/>
+          <w:szCs w:val="22"/>
+        </w:rPr>
+        <w:t>filosofische theorie van de publieke sfeer kr</w:t>
+      </w:r>
+      <w:r>
+        <w:rPr>
+          <w:rFonts w:ascii="Courier New" w:hAnsi="Courier New" w:cs="Courier New"/>
+          <w:sz w:val="22"/>
+          <w:szCs w:val="22"/>
+        </w:rPr>
+        <w:t>ijgt</w:t>
+      </w:r>
+      <w:r>
+        <w:rPr>
+          <w:rFonts w:ascii="Courier New" w:hAnsi="Courier New" w:cs="Courier New"/>
+          <w:sz w:val="22"/>
+          <w:szCs w:val="22"/>
+        </w:rPr>
+        <w:t xml:space="preserve"> gestalte in zijn deelname aan diezelfde publieke sfeer.</w:t>
       </w:r>
     </w:p>
     <w:p>
@@ -364,87 +1279,6 @@
           <w:szCs w:val="22"/>
         </w:rPr>
       </w:pPr>
-      <w:r>
-        <w:rPr>
-          <w:rFonts w:ascii="Courier New" w:hAnsi="Courier New" w:cs="Courier New"/>
-          <w:sz w:val="22"/>
-          <w:szCs w:val="22"/>
-        </w:rPr>
-        <w:t xml:space="preserve">Een belangrijk thema in het boek is de verhouding tussen filosofische reflectie en politiek handelen. Habermas behoort tot de </w:t>
-      </w:r>
-      <w:r>
-        <w:rPr>
-          <w:rFonts w:ascii="Courier New" w:hAnsi="Courier New" w:cs="Courier New"/>
-          <w:sz w:val="22"/>
-          <w:szCs w:val="22"/>
-        </w:rPr>
-        <w:lastRenderedPageBreak/>
-        <w:t>traditie van de kritische theorie, die met denkers als Max Horkheimer en Theodor Adorno de samenleving niet alleen wil verklaren, maar ook kritisch wil onderzoeken met het oog op emancipatie.</w:t>
-      </w:r>
-      <w:r>
-        <w:rPr>
-          <w:rFonts w:ascii="Courier New" w:hAnsi="Courier New" w:cs="Courier New"/>
-          <w:sz w:val="22"/>
-          <w:szCs w:val="22"/>
-        </w:rPr>
-        <w:t xml:space="preserve"> </w:t>
-      </w:r>
-      <w:r>
-        <w:rPr>
-          <w:rFonts w:ascii="Courier New" w:hAnsi="Courier New" w:cs="Courier New"/>
-          <w:sz w:val="22"/>
-          <w:szCs w:val="22"/>
-        </w:rPr>
-        <w:t>Toch ontwikkelde Habermas een eigen opvatting over de maatschappelijke verantwoordelijkheid van filosofen. Volgens hem mogen intellectuelen hun theoretische inzichten niet rechtstreeks opleggen aan de politiek. Filosofische kennis verschaft geen bijzondere democratische bevoegdheid. Een filosoof heeft evenmin als andere burgers het recht zijn opvattingen buiten het democratische debat om tot politieke besluiten te verheffen.</w:t>
-      </w:r>
-      <w:r>
-        <w:rPr>
-          <w:rFonts w:ascii="Courier New" w:hAnsi="Courier New" w:cs="Courier New"/>
-          <w:sz w:val="22"/>
-          <w:szCs w:val="22"/>
-        </w:rPr>
-        <w:t xml:space="preserve"> </w:t>
-      </w:r>
-      <w:r>
-        <w:rPr>
-          <w:rFonts w:ascii="Courier New" w:hAnsi="Courier New" w:cs="Courier New"/>
-          <w:sz w:val="22"/>
-          <w:szCs w:val="22"/>
-        </w:rPr>
-        <w:t>Daarom maakt Habermas onderscheid tussen zijn wetenschappelijke werkzaamheden en zijn optreden als burger. Als filosoof ontwikkelt hij algemene theorieën over communicatie, rationaliteit en maatschappelijke instituties. Als publieke intellectueel neemt hij deel aan discussies over concrete politieke problemen. Daarbij kan hij zijn theoretische kennis gebruiken, maar zijn argumenten moeten voor anderen toegankelijk en kritisch bespreekbaar blijven.</w:t>
-      </w:r>
-      <w:r>
-        <w:rPr>
-          <w:rFonts w:ascii="Courier New" w:hAnsi="Courier New" w:cs="Courier New"/>
-          <w:sz w:val="22"/>
-          <w:szCs w:val="22"/>
-        </w:rPr>
-        <w:t xml:space="preserve"> </w:t>
-      </w:r>
-      <w:r>
-        <w:rPr>
-          <w:rFonts w:ascii="Courier New" w:hAnsi="Courier New" w:cs="Courier New"/>
-          <w:sz w:val="22"/>
-          <w:szCs w:val="22"/>
-        </w:rPr>
-        <w:t>Verovšek noemt deze benadering een bemiddelde verhouding tussen theorie en praktijk. Filosofie beïnvloedt de politiek niet rechtstreeks via de macht, maar indirect via de publieke meningsvorming. De intellectueel draagt bij aan het democratische gesprek zonder aanspraak te maken op een bevoorrechte positie.</w:t>
-      </w:r>
-      <w:r>
-        <w:rPr>
-          <w:rFonts w:ascii="Courier New" w:hAnsi="Courier New" w:cs="Courier New"/>
-          <w:sz w:val="22"/>
-          <w:szCs w:val="22"/>
-        </w:rPr>
-        <w:t xml:space="preserve"> </w:t>
-      </w:r>
-      <w:r>
-        <w:rPr>
-          <w:rFonts w:ascii="Courier New" w:hAnsi="Courier New" w:cs="Courier New"/>
-          <w:sz w:val="22"/>
-          <w:szCs w:val="22"/>
-        </w:rPr>
-        <w:t>Hierin ligt volgens Verovšek een belangrijke kwaliteit van Habermas' publieke optreden: hij probeert de democratie te versterken door argumenten aan te dragen, niet door namens de samenleving beslissingen te nemen. </w:t>
-      </w:r>
     </w:p>
     <w:p>
       <w:pPr>
@@ -461,133 +1295,6 @@
           <w:sz w:val="22"/>
           <w:szCs w:val="22"/>
         </w:rPr>
-        <w:t>Het begrip publieke sfeer vormt de verbinding tussen Habermas' filosofische theorie en zijn politieke engagement. De publieke sfeer is de maatschappelijke ruimte waarin burgers informatie uitwisselen, argumenten bespreken en gezamenlijk oordelen vormen over publieke aangelegenheden.</w:t>
-      </w:r>
-      <w:r>
-        <w:rPr>
-          <w:rFonts w:ascii="Courier New" w:hAnsi="Courier New" w:cs="Courier New"/>
-          <w:sz w:val="22"/>
-          <w:szCs w:val="22"/>
-        </w:rPr>
-        <w:t xml:space="preserve"> </w:t>
-      </w:r>
-      <w:r>
-        <w:rPr>
-          <w:rFonts w:ascii="Courier New" w:hAnsi="Courier New" w:cs="Courier New"/>
-          <w:sz w:val="22"/>
-          <w:szCs w:val="22"/>
-        </w:rPr>
-        <w:t>Voor Habermas berust democratie niet uitsluitend op verkiezingen, parlementen en juridische procedures. Zij vereist ook een levende publieke cultuur waarin burgers hun opvattingen kunnen ontwikkelen en machthebbers ter verantwoording kunnen roepen.</w:t>
-      </w:r>
-    </w:p>
-    <w:p>
-      <w:pPr>
-        <w:spacing w:line="360" w:lineRule="auto"/>
-        <w:ind w:firstLine="720"/>
-        <w:rPr>
-          <w:rFonts w:ascii="Courier New" w:hAnsi="Courier New" w:cs="Courier New"/>
-          <w:sz w:val="22"/>
-          <w:szCs w:val="22"/>
-        </w:rPr>
-      </w:pPr>
-      <w:r>
-        <w:rPr>
-          <w:rFonts w:ascii="Courier New" w:hAnsi="Courier New" w:cs="Courier New"/>
-          <w:sz w:val="22"/>
-          <w:szCs w:val="22"/>
-        </w:rPr>
-        <w:t xml:space="preserve">Verovšek laat zien dat Habermas deze opvatting niet alleen theoretisch heeft verdedigd, maar ook in zijn eigen handelen heeft proberen waar te maken. Door essays, krantenartikelen, interviews en </w:t>
-      </w:r>
-      <w:r>
-        <w:rPr>
-          <w:rFonts w:ascii="Courier New" w:hAnsi="Courier New" w:cs="Courier New"/>
-          <w:sz w:val="22"/>
-          <w:szCs w:val="22"/>
-        </w:rPr>
-        <w:lastRenderedPageBreak/>
-        <w:t>publieke discussies leverde hij voortdurend bijdragen aan de democratische meningsvorming.</w:t>
-      </w:r>
-    </w:p>
-    <w:p>
-      <w:pPr>
-        <w:spacing w:line="360" w:lineRule="auto"/>
-        <w:rPr>
-          <w:rFonts w:ascii="Courier New" w:hAnsi="Courier New" w:cs="Courier New"/>
-          <w:sz w:val="22"/>
-          <w:szCs w:val="22"/>
-        </w:rPr>
-      </w:pPr>
-      <w:r>
-        <w:rPr>
-          <w:rFonts w:ascii="Courier New" w:hAnsi="Courier New" w:cs="Courier New"/>
-          <w:sz w:val="22"/>
-          <w:szCs w:val="22"/>
-        </w:rPr>
-        <w:t>Daarbij speelde zijn begrip van communicatieve rationaliteit een belangrijke rol. Mensen kunnen hun onderlinge conflicten niet uitsluitend oplossen door macht, traditie of economisch belang. Zij beschikken ook over het vermogen elkaar argumenten voor te leggen en tot wederzijds begrip te komen.</w:t>
-      </w:r>
-    </w:p>
-    <w:p>
-      <w:pPr>
-        <w:spacing w:line="360" w:lineRule="auto"/>
-        <w:rPr>
-          <w:rFonts w:ascii="Courier New" w:hAnsi="Courier New" w:cs="Courier New"/>
-          <w:sz w:val="22"/>
-          <w:szCs w:val="22"/>
-        </w:rPr>
-      </w:pPr>
-      <w:r>
-        <w:rPr>
-          <w:rFonts w:ascii="Courier New" w:hAnsi="Courier New" w:cs="Courier New"/>
-          <w:sz w:val="22"/>
-          <w:szCs w:val="22"/>
-        </w:rPr>
-        <w:t>Dit betekent niet dat democratische overeenstemming altijd mogelijk is. Wel veronderstelt een democratische samenleving dat burgers bereid zijn hun overtuigingen aan kritiek bloot te stellen en de argumenten van anderen serieus te nemen.</w:t>
-      </w:r>
-    </w:p>
-    <w:p>
-      <w:pPr>
-        <w:spacing w:line="360" w:lineRule="auto"/>
-        <w:rPr>
-          <w:rFonts w:ascii="Courier New" w:hAnsi="Courier New" w:cs="Courier New"/>
-          <w:sz w:val="22"/>
-          <w:szCs w:val="22"/>
-        </w:rPr>
-      </w:pPr>
-      <w:r>
-        <w:rPr>
-          <w:rFonts w:ascii="Courier New" w:hAnsi="Courier New" w:cs="Courier New"/>
-          <w:sz w:val="22"/>
-          <w:szCs w:val="22"/>
-        </w:rPr>
-        <w:t>Habermas' eigen publieke optreden kan volgens Verovšek worden begrepen als een praktische toepassing van deze gedachte. Zijn filosofische theorie van de publieke sfeer kreeg gestalte in zijn deelname aan diezelfde publieke sfeer.</w:t>
-      </w:r>
-    </w:p>
-    <w:p>
-      <w:pPr>
-        <w:spacing w:line="360" w:lineRule="auto"/>
-        <w:ind w:firstLine="720"/>
-        <w:rPr>
-          <w:rFonts w:ascii="Courier New" w:hAnsi="Courier New" w:cs="Courier New"/>
-          <w:sz w:val="22"/>
-          <w:szCs w:val="22"/>
-        </w:rPr>
-      </w:pPr>
-    </w:p>
-    <w:p>
-      <w:pPr>
-        <w:spacing w:line="360" w:lineRule="auto"/>
-        <w:rPr>
-          <w:rFonts w:ascii="Courier New" w:hAnsi="Courier New" w:cs="Courier New"/>
-          <w:sz w:val="22"/>
-          <w:szCs w:val="22"/>
-        </w:rPr>
-      </w:pPr>
-      <w:r>
-        <w:rPr>
-          <w:rFonts w:ascii="Courier New" w:hAnsi="Courier New" w:cs="Courier New"/>
-          <w:sz w:val="22"/>
-          <w:szCs w:val="22"/>
-        </w:rPr>
         <w:fldChar w:fldCharType="begin"/>
       </w:r>
       <w:r>
@@ -609,6 +1316,7 @@
       <w:r>
         <w:rPr>
           <w:rFonts w:ascii="Courier New" w:hAnsi="Courier New" w:cs="Courier New"/>
+          <w:noProof/>
           <w:sz w:val="22"/>
           <w:szCs w:val="22"/>
         </w:rPr>
@@ -695,7 +1403,55 @@
           <w:sz w:val="22"/>
           <w:szCs w:val="22"/>
         </w:rPr>
-        <w:t>Verovšek beschrijft vervolgens chronologisch hoe Habermas zijn rol als publieke intellectueel ontwikkelde. Zijn politieke betrokkenheid begon in het naoorlogse Duitsland, waar de omgang met het nationaalsocialistische verleden een centrale maatschappelijke kwestie vormde.</w:t>
+        <w:t xml:space="preserve">Habermas’ </w:t>
+      </w:r>
+      <w:r>
+        <w:rPr>
+          <w:rFonts w:ascii="Courier New" w:hAnsi="Courier New" w:cs="Courier New"/>
+          <w:sz w:val="22"/>
+          <w:szCs w:val="22"/>
+        </w:rPr>
+        <w:t>politieke betrokkenheid beg</w:t>
+      </w:r>
+      <w:r>
+        <w:rPr>
+          <w:rFonts w:ascii="Courier New" w:hAnsi="Courier New" w:cs="Courier New"/>
+          <w:sz w:val="22"/>
+          <w:szCs w:val="22"/>
+        </w:rPr>
+        <w:t>i</w:t>
+      </w:r>
+      <w:r>
+        <w:rPr>
+          <w:rFonts w:ascii="Courier New" w:hAnsi="Courier New" w:cs="Courier New"/>
+          <w:sz w:val="22"/>
+          <w:szCs w:val="22"/>
+        </w:rPr>
+        <w:t>n</w:t>
+      </w:r>
+      <w:r>
+        <w:rPr>
+          <w:rFonts w:ascii="Courier New" w:hAnsi="Courier New" w:cs="Courier New"/>
+          <w:sz w:val="22"/>
+          <w:szCs w:val="22"/>
+        </w:rPr>
+        <w:t>t</w:t>
+      </w:r>
+      <w:r>
+        <w:rPr>
+          <w:rFonts w:ascii="Courier New" w:hAnsi="Courier New" w:cs="Courier New"/>
+          <w:sz w:val="22"/>
+          <w:szCs w:val="22"/>
+        </w:rPr>
+        <w:t xml:space="preserve"> in het naoorlogse Duitsland</w:t>
+      </w:r>
+      <w:r>
+        <w:rPr>
+          <w:rFonts w:ascii="Courier New" w:hAnsi="Courier New" w:cs="Courier New"/>
+          <w:sz w:val="22"/>
+          <w:szCs w:val="22"/>
+        </w:rPr>
+        <w:t>.</w:t>
       </w:r>
       <w:r>
         <w:rPr>
@@ -711,7 +1467,55 @@
           <w:sz w:val="22"/>
           <w:szCs w:val="22"/>
         </w:rPr>
-        <w:t>Habermas groeide op tijdens het naziregime en behoorde tot een generatie die na 1945 geconfronteerd werd met de morele en politieke</w:t>
+        <w:t>Habermas groei</w:t>
+      </w:r>
+      <w:r>
+        <w:rPr>
+          <w:rFonts w:ascii="Courier New" w:hAnsi="Courier New" w:cs="Courier New"/>
+          <w:sz w:val="22"/>
+          <w:szCs w:val="22"/>
+        </w:rPr>
+        <w:t>de</w:t>
+      </w:r>
+      <w:r>
+        <w:rPr>
+          <w:rFonts w:ascii="Courier New" w:hAnsi="Courier New" w:cs="Courier New"/>
+          <w:sz w:val="22"/>
+          <w:szCs w:val="22"/>
+        </w:rPr>
+        <w:t xml:space="preserve"> op tijdens het naziregime en behoor</w:t>
+      </w:r>
+      <w:r>
+        <w:rPr>
+          <w:rFonts w:ascii="Courier New" w:hAnsi="Courier New" w:cs="Courier New"/>
+          <w:sz w:val="22"/>
+          <w:szCs w:val="22"/>
+        </w:rPr>
+        <w:t>t</w:t>
+      </w:r>
+      <w:r>
+        <w:rPr>
+          <w:rFonts w:ascii="Courier New" w:hAnsi="Courier New" w:cs="Courier New"/>
+          <w:sz w:val="22"/>
+          <w:szCs w:val="22"/>
+        </w:rPr>
+        <w:t xml:space="preserve"> tot een generatie die na 1945 geconfronteerd w</w:t>
+      </w:r>
+      <w:r>
+        <w:rPr>
+          <w:rFonts w:ascii="Courier New" w:hAnsi="Courier New" w:cs="Courier New"/>
+          <w:sz w:val="22"/>
+          <w:szCs w:val="22"/>
+        </w:rPr>
+        <w:t>ordt</w:t>
+      </w:r>
+      <w:r>
+        <w:rPr>
+          <w:rFonts w:ascii="Courier New" w:hAnsi="Courier New" w:cs="Courier New"/>
+          <w:sz w:val="22"/>
+          <w:szCs w:val="22"/>
+        </w:rPr>
+        <w:t xml:space="preserve"> met de morele en politieke</w:t>
       </w:r>
       <w:r>
         <w:rPr>
@@ -727,23 +1531,47 @@
           <w:sz w:val="22"/>
           <w:szCs w:val="22"/>
         </w:rPr>
-        <w:t>verantwoordelijk</w:t>
-      </w:r>
-      <w:r>
-        <w:rPr>
-          <w:rFonts w:ascii="Courier New" w:hAnsi="Courier New" w:cs="Courier New"/>
-          <w:sz w:val="22"/>
-          <w:szCs w:val="22"/>
-        </w:rPr>
-        <w:t>-</w:t>
-      </w:r>
-      <w:r>
-        <w:rPr>
-          <w:rFonts w:ascii="Courier New" w:hAnsi="Courier New" w:cs="Courier New"/>
-          <w:sz w:val="22"/>
-          <w:szCs w:val="22"/>
-        </w:rPr>
-        <w:t>heid van Duitsland. Al vroeg verzette hij zich tegen pogingen het naziverleden te relativeren of te verzwijgen.</w:t>
+        <w:t xml:space="preserve">verantwoordelijkheid van Duitsland. </w:t>
+      </w:r>
+      <w:r>
+        <w:rPr>
+          <w:rFonts w:ascii="Courier New" w:hAnsi="Courier New" w:cs="Courier New"/>
+          <w:sz w:val="22"/>
+          <w:szCs w:val="22"/>
+        </w:rPr>
+        <w:t>Dat</w:t>
+      </w:r>
+      <w:r>
+        <w:rPr>
+          <w:rFonts w:ascii="Courier New" w:hAnsi="Courier New" w:cs="Courier New"/>
+          <w:sz w:val="22"/>
+          <w:szCs w:val="22"/>
+        </w:rPr>
+        <w:t xml:space="preserve"> naziverleden </w:t>
+      </w:r>
+      <w:r>
+        <w:rPr>
+          <w:rFonts w:ascii="Courier New" w:hAnsi="Courier New" w:cs="Courier New"/>
+          <w:sz w:val="22"/>
+          <w:szCs w:val="22"/>
+        </w:rPr>
+        <w:t xml:space="preserve">mag </w:t>
+      </w:r>
+      <w:r>
+        <w:rPr>
+          <w:rFonts w:ascii="Courier New" w:hAnsi="Courier New" w:cs="Courier New"/>
+          <w:sz w:val="22"/>
+          <w:szCs w:val="22"/>
+        </w:rPr>
+        <w:t xml:space="preserve">volgens hem niet </w:t>
+      </w:r>
+      <w:r>
+        <w:rPr>
+          <w:rFonts w:ascii="Courier New" w:hAnsi="Courier New" w:cs="Courier New"/>
+          <w:sz w:val="22"/>
+          <w:szCs w:val="22"/>
+        </w:rPr>
+        <w:t>worden</w:t>
       </w:r>
       <w:r>
         <w:rPr>
@@ -759,7 +1587,47 @@
           <w:sz w:val="22"/>
           <w:szCs w:val="22"/>
         </w:rPr>
-        <w:t>Een belangrijke gebeurtenis was zijn kritiek uit 1953 op de filosoof Martin Heidegger. Habermas bekritiseerde Heideggers omgang met zijn vroegere betrokkenheid bij het nationaalsocialisme. Daarmee stelde hij een vraag die zijn verdere intellectuele leven zou bepalen: hoe kan een democratische samenleving ontstaan wanneer haar burgers en intellectuele elites onvoldoende kritisch omgaan met hun eigen geschiedenis?</w:t>
+        <w:t>ge</w:t>
+      </w:r>
+      <w:r>
+        <w:rPr>
+          <w:rFonts w:ascii="Courier New" w:hAnsi="Courier New" w:cs="Courier New"/>
+          <w:sz w:val="22"/>
+          <w:szCs w:val="22"/>
+        </w:rPr>
+        <w:t>relative</w:t>
+      </w:r>
+      <w:r>
+        <w:rPr>
+          <w:rFonts w:ascii="Courier New" w:hAnsi="Courier New" w:cs="Courier New"/>
+          <w:sz w:val="22"/>
+          <w:szCs w:val="22"/>
+        </w:rPr>
+        <w:t>erd</w:t>
+      </w:r>
+      <w:r>
+        <w:rPr>
+          <w:rFonts w:ascii="Courier New" w:hAnsi="Courier New" w:cs="Courier New"/>
+          <w:sz w:val="22"/>
+          <w:szCs w:val="22"/>
+        </w:rPr>
+        <w:t xml:space="preserve"> of </w:t>
+      </w:r>
+      <w:r>
+        <w:rPr>
+          <w:rFonts w:ascii="Courier New" w:hAnsi="Courier New" w:cs="Courier New"/>
+          <w:sz w:val="22"/>
+          <w:szCs w:val="22"/>
+        </w:rPr>
+        <w:t>verzwegen</w:t>
+      </w:r>
+      <w:r>
+        <w:rPr>
+          <w:rFonts w:ascii="Courier New" w:hAnsi="Courier New" w:cs="Courier New"/>
+          <w:sz w:val="22"/>
+          <w:szCs w:val="22"/>
+        </w:rPr>
+        <w:t>.</w:t>
       </w:r>
       <w:r>
         <w:rPr>
@@ -775,7 +1643,143 @@
           <w:sz w:val="22"/>
           <w:szCs w:val="22"/>
         </w:rPr>
-        <w:t xml:space="preserve">In de jaren vijftig werkte Habermas als journalist en publiceerde hij regelmatig over filosofische en politieke kwesties. Zijn belangstelling voor de publieke meningsvorming ontstond dus niet pas nadat hij een gevestigde </w:t>
+        <w:t>Daarom reageer</w:t>
+      </w:r>
+      <w:r>
+        <w:rPr>
+          <w:rFonts w:ascii="Courier New" w:hAnsi="Courier New" w:cs="Courier New"/>
+          <w:sz w:val="22"/>
+          <w:szCs w:val="22"/>
+        </w:rPr>
+        <w:t>t</w:t>
+      </w:r>
+      <w:r>
+        <w:rPr>
+          <w:rFonts w:ascii="Courier New" w:hAnsi="Courier New" w:cs="Courier New"/>
+          <w:sz w:val="22"/>
+          <w:szCs w:val="22"/>
+        </w:rPr>
+        <w:t xml:space="preserve"> hij als jonge filosoof ook zo fel in</w:t>
+      </w:r>
+      <w:r>
+        <w:rPr>
+          <w:rFonts w:ascii="Courier New" w:hAnsi="Courier New" w:cs="Courier New"/>
+          <w:sz w:val="22"/>
+          <w:szCs w:val="22"/>
+        </w:rPr>
+        <w:t xml:space="preserve"> 1953 op de </w:t>
+      </w:r>
+      <w:r>
+        <w:rPr>
+          <w:rFonts w:ascii="Courier New" w:hAnsi="Courier New" w:cs="Courier New"/>
+          <w:sz w:val="22"/>
+          <w:szCs w:val="22"/>
+        </w:rPr>
+        <w:t>grote</w:t>
+      </w:r>
+      <w:r>
+        <w:rPr>
+          <w:rFonts w:ascii="Courier New" w:hAnsi="Courier New" w:cs="Courier New"/>
+          <w:sz w:val="22"/>
+          <w:szCs w:val="22"/>
+        </w:rPr>
+        <w:t xml:space="preserve"> Martin Heidegger</w:t>
+      </w:r>
+      <w:r>
+        <w:rPr>
+          <w:rFonts w:ascii="Courier New" w:hAnsi="Courier New" w:cs="Courier New"/>
+          <w:sz w:val="22"/>
+          <w:szCs w:val="22"/>
+        </w:rPr>
+        <w:t xml:space="preserve"> waar hijzelf zo door was beïnvloed en die zijn</w:t>
+      </w:r>
+      <w:r>
+        <w:rPr>
+          <w:rFonts w:ascii="Courier New" w:hAnsi="Courier New" w:cs="Courier New"/>
+          <w:sz w:val="22"/>
+          <w:szCs w:val="22"/>
+        </w:rPr>
+        <w:t xml:space="preserve"> vroegere betrokkenheid bij het nationaalsocialisme</w:t>
+      </w:r>
+      <w:r>
+        <w:rPr>
+          <w:rFonts w:ascii="Courier New" w:hAnsi="Courier New" w:cs="Courier New"/>
+          <w:sz w:val="22"/>
+          <w:szCs w:val="22"/>
+        </w:rPr>
+        <w:t xml:space="preserve"> niet benoemde</w:t>
+      </w:r>
+      <w:r>
+        <w:rPr>
+          <w:rFonts w:ascii="Courier New" w:hAnsi="Courier New" w:cs="Courier New"/>
+          <w:sz w:val="22"/>
+          <w:szCs w:val="22"/>
+        </w:rPr>
+        <w:t xml:space="preserve">. </w:t>
+      </w:r>
+      <w:r>
+        <w:rPr>
+          <w:rFonts w:ascii="Courier New" w:hAnsi="Courier New" w:cs="Courier New"/>
+          <w:sz w:val="22"/>
+          <w:szCs w:val="22"/>
+        </w:rPr>
+        <w:t>H</w:t>
+      </w:r>
+      <w:r>
+        <w:rPr>
+          <w:rFonts w:ascii="Courier New" w:hAnsi="Courier New" w:cs="Courier New"/>
+          <w:sz w:val="22"/>
+          <w:szCs w:val="22"/>
+        </w:rPr>
+        <w:t>oe kan een democratische samenleving ontstaan wanneer haar burgers en intellectuele elites onvoldoende kritisch omgaan met hun eigen geschiedenis?</w:t>
+      </w:r>
+      <w:r>
+        <w:rPr>
+          <w:rFonts w:ascii="Courier New" w:hAnsi="Courier New" w:cs="Courier New"/>
+          <w:sz w:val="22"/>
+          <w:szCs w:val="22"/>
+        </w:rPr>
+        <w:t xml:space="preserve"> </w:t>
+      </w:r>
+      <w:r>
+        <w:rPr>
+          <w:rFonts w:ascii="Courier New" w:hAnsi="Courier New" w:cs="Courier New"/>
+          <w:sz w:val="22"/>
+          <w:szCs w:val="22"/>
+        </w:rPr>
+        <w:t xml:space="preserve">In de jaren vijftig werkt Habermas </w:t>
+      </w:r>
+      <w:r>
+        <w:rPr>
+          <w:rFonts w:ascii="Courier New" w:hAnsi="Courier New" w:cs="Courier New"/>
+          <w:sz w:val="22"/>
+          <w:szCs w:val="22"/>
+        </w:rPr>
+        <w:t xml:space="preserve">eerst </w:t>
+      </w:r>
+      <w:r>
+        <w:rPr>
+          <w:rFonts w:ascii="Courier New" w:hAnsi="Courier New" w:cs="Courier New"/>
+          <w:sz w:val="22"/>
+          <w:szCs w:val="22"/>
+        </w:rPr>
+        <w:t>als journalist en publiceer</w:t>
+      </w:r>
+      <w:r>
+        <w:rPr>
+          <w:rFonts w:ascii="Courier New" w:hAnsi="Courier New" w:cs="Courier New"/>
+          <w:sz w:val="22"/>
+          <w:szCs w:val="22"/>
+        </w:rPr>
+        <w:t>t</w:t>
+      </w:r>
+      <w:r>
+        <w:rPr>
+          <w:rFonts w:ascii="Courier New" w:hAnsi="Courier New" w:cs="Courier New"/>
+          <w:sz w:val="22"/>
+          <w:szCs w:val="22"/>
+        </w:rPr>
+        <w:t xml:space="preserve"> hij regelmatig over filosofische en </w:t>
       </w:r>
       <w:r>
         <w:rPr>
@@ -784,7 +1788,23 @@
           <w:szCs w:val="22"/>
         </w:rPr>
         <w:lastRenderedPageBreak/>
-        <w:t>academische reputatie had opgebouwd. Zij behoorde vanaf het begin tot zijn intellectuele ontwikkeling.</w:t>
+        <w:t xml:space="preserve">politieke kwesties. Zijn belangstelling voor de publieke meningsvorming </w:t>
+      </w:r>
+      <w:r>
+        <w:rPr>
+          <w:rFonts w:ascii="Courier New" w:hAnsi="Courier New" w:cs="Courier New"/>
+          <w:sz w:val="22"/>
+          <w:szCs w:val="22"/>
+        </w:rPr>
+        <w:t xml:space="preserve">is er al voordat </w:t>
+      </w:r>
+      <w:r>
+        <w:rPr>
+          <w:rFonts w:ascii="Courier New" w:hAnsi="Courier New" w:cs="Courier New"/>
+          <w:sz w:val="22"/>
+          <w:szCs w:val="22"/>
+        </w:rPr>
+        <w:t xml:space="preserve">hij een academische reputatie had opgebouwd. </w:t>
       </w:r>
     </w:p>
     <w:p>
@@ -803,7 +1823,63 @@
           <w:sz w:val="22"/>
           <w:szCs w:val="22"/>
         </w:rPr>
-        <w:t>Toen hij in 1956 bij het Institut für Sozialforschung in Frankfurt ging werken, kreeg deze betrokkenheid een theoretische verdieping. Onder invloed van Adorno en de kritische theorie begon hij systematisch na te denken over de verhouding tussen maatschappelijke machtsstructuren, democratie en publieke communicatie.</w:t>
+        <w:t>Wanneer</w:t>
+      </w:r>
+      <w:r>
+        <w:rPr>
+          <w:rFonts w:ascii="Courier New" w:hAnsi="Courier New" w:cs="Courier New"/>
+          <w:sz w:val="22"/>
+          <w:szCs w:val="22"/>
+        </w:rPr>
+        <w:t xml:space="preserve"> hij in 1956 bij het Institut für Sozialforschung in Frankfurt g</w:t>
+      </w:r>
+      <w:r>
+        <w:rPr>
+          <w:rFonts w:ascii="Courier New" w:hAnsi="Courier New" w:cs="Courier New"/>
+          <w:sz w:val="22"/>
+          <w:szCs w:val="22"/>
+        </w:rPr>
+        <w:t>aat</w:t>
+      </w:r>
+      <w:r>
+        <w:rPr>
+          <w:rFonts w:ascii="Courier New" w:hAnsi="Courier New" w:cs="Courier New"/>
+          <w:sz w:val="22"/>
+          <w:szCs w:val="22"/>
+        </w:rPr>
+        <w:t xml:space="preserve"> werken, kr</w:t>
+      </w:r>
+      <w:r>
+        <w:rPr>
+          <w:rFonts w:ascii="Courier New" w:hAnsi="Courier New" w:cs="Courier New"/>
+          <w:sz w:val="22"/>
+          <w:szCs w:val="22"/>
+        </w:rPr>
+        <w:t>ijgt</w:t>
+      </w:r>
+      <w:r>
+        <w:rPr>
+          <w:rFonts w:ascii="Courier New" w:hAnsi="Courier New" w:cs="Courier New"/>
+          <w:sz w:val="22"/>
+          <w:szCs w:val="22"/>
+        </w:rPr>
+        <w:t xml:space="preserve"> deze betrokkenheid een theoretische verdieping. Onder invloed van Adorno en de kritische theorie beg</w:t>
+      </w:r>
+      <w:r>
+        <w:rPr>
+          <w:rFonts w:ascii="Courier New" w:hAnsi="Courier New" w:cs="Courier New"/>
+          <w:sz w:val="22"/>
+          <w:szCs w:val="22"/>
+        </w:rPr>
+        <w:t>int</w:t>
+      </w:r>
+      <w:r>
+        <w:rPr>
+          <w:rFonts w:ascii="Courier New" w:hAnsi="Courier New" w:cs="Courier New"/>
+          <w:sz w:val="22"/>
+          <w:szCs w:val="22"/>
+        </w:rPr>
+        <w:t xml:space="preserve"> hij systematisch na te denken over de verhouding tussen maatschappelijke machtsstructuren, democratie en publieke communicatie.</w:t>
       </w:r>
       <w:r>
         <w:rPr>
@@ -819,7 +1895,23 @@
           <w:sz w:val="22"/>
           <w:szCs w:val="22"/>
         </w:rPr>
-        <w:t>Dit mondde uiteindelijk uit in zijn beroemde studie </w:t>
+        <w:t>Dit mond</w:t>
+      </w:r>
+      <w:r>
+        <w:rPr>
+          <w:rFonts w:ascii="Courier New" w:hAnsi="Courier New" w:cs="Courier New"/>
+          <w:sz w:val="22"/>
+          <w:szCs w:val="22"/>
+        </w:rPr>
+        <w:t>t</w:t>
+      </w:r>
+      <w:r>
+        <w:rPr>
+          <w:rFonts w:ascii="Courier New" w:hAnsi="Courier New" w:cs="Courier New"/>
+          <w:sz w:val="22"/>
+          <w:szCs w:val="22"/>
+        </w:rPr>
+        <w:t xml:space="preserve"> uiteindelijk uit in zijn beroemde studie </w:t>
       </w:r>
       <w:r>
         <w:rPr>
@@ -837,7 +1929,311 @@
           <w:sz w:val="22"/>
           <w:szCs w:val="22"/>
         </w:rPr>
-        <w:t> (1962), waarin hij de historische ontwikkeling van de burgerlijke openbaarheid analyseerde. </w:t>
+        <w:t> (1962), waarin hij de historische ontwikkeling van de burgerlijke openbaarheid analyseer</w:t>
+      </w:r>
+      <w:r>
+        <w:rPr>
+          <w:rFonts w:ascii="Courier New" w:hAnsi="Courier New" w:cs="Courier New"/>
+          <w:sz w:val="22"/>
+          <w:szCs w:val="22"/>
+        </w:rPr>
+        <w:t>t.</w:t>
+      </w:r>
+      <w:r>
+        <w:rPr>
+          <w:rFonts w:ascii="Courier New" w:hAnsi="Courier New" w:cs="Courier New"/>
+          <w:sz w:val="22"/>
+          <w:szCs w:val="22"/>
+        </w:rPr>
+        <w:t xml:space="preserve"> In de jaren zestig raakt Habermas </w:t>
+      </w:r>
+      <w:r>
+        <w:rPr>
+          <w:rFonts w:ascii="Courier New" w:hAnsi="Courier New" w:cs="Courier New"/>
+          <w:sz w:val="22"/>
+          <w:szCs w:val="22"/>
+        </w:rPr>
+        <w:t xml:space="preserve">dan </w:t>
+      </w:r>
+      <w:r>
+        <w:rPr>
+          <w:rFonts w:ascii="Courier New" w:hAnsi="Courier New" w:cs="Courier New"/>
+          <w:sz w:val="22"/>
+          <w:szCs w:val="22"/>
+        </w:rPr>
+        <w:t>nauw betrokken bij de Duitse studentenbeweging. Hij ondersteun</w:t>
+      </w:r>
+      <w:r>
+        <w:rPr>
+          <w:rFonts w:ascii="Courier New" w:hAnsi="Courier New" w:cs="Courier New"/>
+          <w:sz w:val="22"/>
+          <w:szCs w:val="22"/>
+        </w:rPr>
+        <w:t>t</w:t>
+      </w:r>
+      <w:r>
+        <w:rPr>
+          <w:rFonts w:ascii="Courier New" w:hAnsi="Courier New" w:cs="Courier New"/>
+          <w:sz w:val="22"/>
+          <w:szCs w:val="22"/>
+        </w:rPr>
+        <w:t xml:space="preserve"> veel van haar democratische en emancipatoire doelstellingen en bekritiseer</w:t>
+      </w:r>
+      <w:r>
+        <w:rPr>
+          <w:rFonts w:ascii="Courier New" w:hAnsi="Courier New" w:cs="Courier New"/>
+          <w:sz w:val="22"/>
+          <w:szCs w:val="22"/>
+        </w:rPr>
+        <w:t>t</w:t>
+      </w:r>
+      <w:r>
+        <w:rPr>
+          <w:rFonts w:ascii="Courier New" w:hAnsi="Courier New" w:cs="Courier New"/>
+          <w:sz w:val="22"/>
+          <w:szCs w:val="22"/>
+        </w:rPr>
+        <w:t xml:space="preserve"> de autoritaire elementen van de West-Duitse samenleving.</w:t>
+      </w:r>
+      <w:r>
+        <w:rPr>
+          <w:rFonts w:ascii="Courier New" w:hAnsi="Courier New" w:cs="Courier New"/>
+          <w:sz w:val="22"/>
+          <w:szCs w:val="22"/>
+        </w:rPr>
+        <w:t xml:space="preserve"> </w:t>
+      </w:r>
+      <w:r>
+        <w:rPr>
+          <w:rFonts w:ascii="Courier New" w:hAnsi="Courier New" w:cs="Courier New"/>
+          <w:sz w:val="22"/>
+          <w:szCs w:val="22"/>
+        </w:rPr>
+        <w:t>Tegelijkertijd ontst</w:t>
+      </w:r>
+      <w:r>
+        <w:rPr>
+          <w:rFonts w:ascii="Courier New" w:hAnsi="Courier New" w:cs="Courier New"/>
+          <w:sz w:val="22"/>
+          <w:szCs w:val="22"/>
+        </w:rPr>
+        <w:t>aan er</w:t>
+      </w:r>
+      <w:r>
+        <w:rPr>
+          <w:rFonts w:ascii="Courier New" w:hAnsi="Courier New" w:cs="Courier New"/>
+          <w:sz w:val="22"/>
+          <w:szCs w:val="22"/>
+        </w:rPr>
+        <w:t xml:space="preserve"> scherpe conflicten tussen Habermas en radicale studentenleiders. H</w:t>
+      </w:r>
+      <w:r>
+        <w:rPr>
+          <w:rFonts w:ascii="Courier New" w:hAnsi="Courier New" w:cs="Courier New"/>
+          <w:sz w:val="22"/>
+          <w:szCs w:val="22"/>
+        </w:rPr>
+        <w:t>abermas</w:t>
+      </w:r>
+      <w:r>
+        <w:rPr>
+          <w:rFonts w:ascii="Courier New" w:hAnsi="Courier New" w:cs="Courier New"/>
+          <w:sz w:val="22"/>
+          <w:szCs w:val="22"/>
+        </w:rPr>
+        <w:t xml:space="preserve"> verzet zich tegen </w:t>
+      </w:r>
+      <w:r>
+        <w:rPr>
+          <w:rFonts w:ascii="Courier New" w:hAnsi="Courier New" w:cs="Courier New"/>
+          <w:sz w:val="22"/>
+          <w:szCs w:val="22"/>
+        </w:rPr>
+        <w:t xml:space="preserve">de </w:t>
+      </w:r>
+      <w:r>
+        <w:rPr>
+          <w:rFonts w:ascii="Courier New" w:hAnsi="Courier New" w:cs="Courier New"/>
+          <w:sz w:val="22"/>
+          <w:szCs w:val="22"/>
+        </w:rPr>
+        <w:t xml:space="preserve">directe actie, revolutionaire retoriek en confrontatie </w:t>
+      </w:r>
+      <w:r>
+        <w:rPr>
+          <w:rFonts w:ascii="Courier New" w:hAnsi="Courier New" w:cs="Courier New"/>
+          <w:sz w:val="22"/>
+          <w:szCs w:val="22"/>
+        </w:rPr>
+        <w:t xml:space="preserve">die </w:t>
+      </w:r>
+      <w:r>
+        <w:rPr>
+          <w:rFonts w:ascii="Courier New" w:hAnsi="Courier New" w:cs="Courier New"/>
+          <w:sz w:val="22"/>
+          <w:szCs w:val="22"/>
+        </w:rPr>
+        <w:t xml:space="preserve">de plaats </w:t>
+      </w:r>
+      <w:r>
+        <w:rPr>
+          <w:rFonts w:ascii="Courier New" w:hAnsi="Courier New" w:cs="Courier New"/>
+          <w:sz w:val="22"/>
+          <w:szCs w:val="22"/>
+        </w:rPr>
+        <w:t>lijken</w:t>
+      </w:r>
+      <w:r>
+        <w:rPr>
+          <w:rFonts w:ascii="Courier New" w:hAnsi="Courier New" w:cs="Courier New"/>
+          <w:sz w:val="22"/>
+          <w:szCs w:val="22"/>
+        </w:rPr>
+        <w:t xml:space="preserve"> in te nemen van democratische discussie.</w:t>
+      </w:r>
+      <w:r>
+        <w:rPr>
+          <w:rFonts w:ascii="Courier New" w:hAnsi="Courier New" w:cs="Courier New"/>
+          <w:sz w:val="22"/>
+          <w:szCs w:val="22"/>
+        </w:rPr>
+        <w:t xml:space="preserve"> </w:t>
+      </w:r>
+      <w:r>
+        <w:rPr>
+          <w:rFonts w:ascii="Courier New" w:hAnsi="Courier New" w:cs="Courier New"/>
+          <w:sz w:val="22"/>
+          <w:szCs w:val="22"/>
+        </w:rPr>
+        <w:t>Habermas heeft het over</w:t>
+      </w:r>
+      <w:r>
+        <w:rPr>
+          <w:rFonts w:ascii="Courier New" w:hAnsi="Courier New" w:cs="Courier New"/>
+          <w:sz w:val="22"/>
+          <w:szCs w:val="22"/>
+        </w:rPr>
+        <w:t xml:space="preserve"> 'links fascisme' </w:t>
+      </w:r>
+      <w:r>
+        <w:rPr>
+          <w:rFonts w:ascii="Courier New" w:hAnsi="Courier New" w:cs="Courier New"/>
+          <w:sz w:val="22"/>
+          <w:szCs w:val="22"/>
+        </w:rPr>
+        <w:t>en dat brengt</w:t>
+      </w:r>
+      <w:r>
+        <w:rPr>
+          <w:rFonts w:ascii="Courier New" w:hAnsi="Courier New" w:cs="Courier New"/>
+          <w:sz w:val="22"/>
+          <w:szCs w:val="22"/>
+        </w:rPr>
+        <w:t xml:space="preserve"> hem in conflict met</w:t>
+      </w:r>
+      <w:r>
+        <w:rPr>
+          <w:rFonts w:ascii="Courier New" w:hAnsi="Courier New" w:cs="Courier New"/>
+          <w:sz w:val="22"/>
+          <w:szCs w:val="22"/>
+        </w:rPr>
+        <w:t xml:space="preserve"> een deel</w:t>
+      </w:r>
+      <w:r>
+        <w:rPr>
+          <w:rFonts w:ascii="Courier New" w:hAnsi="Courier New" w:cs="Courier New"/>
+          <w:sz w:val="22"/>
+          <w:szCs w:val="22"/>
+        </w:rPr>
+        <w:t xml:space="preserve"> van de </w:t>
+      </w:r>
+      <w:r>
+        <w:rPr>
+          <w:rFonts w:ascii="Courier New" w:hAnsi="Courier New" w:cs="Courier New"/>
+          <w:sz w:val="22"/>
+          <w:szCs w:val="22"/>
+        </w:rPr>
+        <w:t>studenten</w:t>
+      </w:r>
+      <w:r>
+        <w:rPr>
+          <w:rFonts w:ascii="Courier New" w:hAnsi="Courier New" w:cs="Courier New"/>
+          <w:sz w:val="22"/>
+          <w:szCs w:val="22"/>
+        </w:rPr>
+        <w:t xml:space="preserve">beweging. </w:t>
+      </w:r>
+      <w:r>
+        <w:rPr>
+          <w:rFonts w:ascii="Courier New" w:hAnsi="Courier New" w:cs="Courier New"/>
+          <w:sz w:val="22"/>
+          <w:szCs w:val="22"/>
+        </w:rPr>
+        <w:t>Habermas past ervoor</w:t>
+      </w:r>
+      <w:r>
+        <w:rPr>
+          <w:rFonts w:ascii="Courier New" w:hAnsi="Courier New" w:cs="Courier New"/>
+          <w:sz w:val="22"/>
+          <w:szCs w:val="22"/>
+        </w:rPr>
+        <w:t xml:space="preserve"> zijn filosofische overtuigingen ondergeschikt te maken aan een politieke beweging</w:t>
+      </w:r>
+      <w:r>
+        <w:rPr>
+          <w:rFonts w:ascii="Courier New" w:hAnsi="Courier New" w:cs="Courier New"/>
+          <w:sz w:val="22"/>
+          <w:szCs w:val="22"/>
+        </w:rPr>
+        <w:t xml:space="preserve"> ook al onderschrijft hij bepaalde doelstellingen</w:t>
+      </w:r>
+      <w:r>
+        <w:rPr>
+          <w:rFonts w:ascii="Courier New" w:hAnsi="Courier New" w:cs="Courier New"/>
+          <w:sz w:val="22"/>
+          <w:szCs w:val="22"/>
+        </w:rPr>
+        <w:t xml:space="preserve">. </w:t>
+      </w:r>
+      <w:r>
+        <w:rPr>
+          <w:rFonts w:ascii="Courier New" w:hAnsi="Courier New" w:cs="Courier New"/>
+          <w:sz w:val="22"/>
+          <w:szCs w:val="22"/>
+        </w:rPr>
+        <w:t>Democrati</w:t>
+      </w:r>
+      <w:r>
+        <w:rPr>
+          <w:rFonts w:ascii="Courier New" w:hAnsi="Courier New" w:cs="Courier New"/>
+          <w:sz w:val="22"/>
+          <w:szCs w:val="22"/>
+        </w:rPr>
+        <w:t>sche</w:t>
+      </w:r>
+      <w:r>
+        <w:rPr>
+          <w:rFonts w:ascii="Courier New" w:hAnsi="Courier New" w:cs="Courier New"/>
+          <w:sz w:val="22"/>
+          <w:szCs w:val="22"/>
+        </w:rPr>
+        <w:t xml:space="preserve"> emancipatie m</w:t>
+      </w:r>
+      <w:r>
+        <w:rPr>
+          <w:rFonts w:ascii="Courier New" w:hAnsi="Courier New" w:cs="Courier New"/>
+          <w:sz w:val="22"/>
+          <w:szCs w:val="22"/>
+        </w:rPr>
+        <w:t>ag nooit</w:t>
+      </w:r>
+      <w:r>
+        <w:rPr>
+          <w:rFonts w:ascii="Courier New" w:hAnsi="Courier New" w:cs="Courier New"/>
+          <w:sz w:val="22"/>
+          <w:szCs w:val="22"/>
+        </w:rPr>
+        <w:t xml:space="preserve"> worden nagestreefd met middelen die de democratische discussie zelf ondermijnen.</w:t>
       </w:r>
     </w:p>
     <w:p>
@@ -856,25 +2252,79 @@
           <w:sz w:val="22"/>
           <w:szCs w:val="22"/>
         </w:rPr>
-        <w:t>In de jaren zestig raakte Habermas nauw betrokken bij de Duitse studentenbeweging. Hij ondersteunde veel van haar democratische en emancipatoire doelstellingen en bekritiseerde de autoritaire elementen van de West-Duitse samenleving.</w:t>
-      </w:r>
-    </w:p>
-    <w:p>
-      <w:pPr>
-        <w:spacing w:line="360" w:lineRule="auto"/>
-        <w:rPr>
-          <w:rFonts w:ascii="Courier New" w:hAnsi="Courier New" w:cs="Courier New"/>
-          <w:sz w:val="22"/>
-          <w:szCs w:val="22"/>
-        </w:rPr>
-      </w:pPr>
-      <w:r>
-        <w:rPr>
-          <w:rFonts w:ascii="Courier New" w:hAnsi="Courier New" w:cs="Courier New"/>
-          <w:sz w:val="22"/>
-          <w:szCs w:val="22"/>
-        </w:rPr>
-        <w:t>Tegelijkertijd ontstonden scherpe conflicten tussen Habermas en radicale studentenleiders. Hij verzette zich tegen politieke strategieën waarin directe actie, revolutionaire retoriek en confrontatie de plaats dreigden in te nemen van democratische discussie.</w:t>
+        <w:t xml:space="preserve">Habermas </w:t>
+      </w:r>
+      <w:r>
+        <w:rPr>
+          <w:rFonts w:ascii="Courier New" w:hAnsi="Courier New" w:cs="Courier New"/>
+          <w:sz w:val="22"/>
+          <w:szCs w:val="22"/>
+        </w:rPr>
+        <w:t>t</w:t>
+      </w:r>
+      <w:r>
+        <w:rPr>
+          <w:rFonts w:ascii="Courier New" w:hAnsi="Courier New" w:cs="Courier New"/>
+          <w:sz w:val="22"/>
+          <w:szCs w:val="22"/>
+        </w:rPr>
+        <w:t>rekt zich terug</w:t>
+      </w:r>
+      <w:r>
+        <w:rPr>
+          <w:rFonts w:ascii="Courier New" w:hAnsi="Courier New" w:cs="Courier New"/>
+          <w:sz w:val="22"/>
+          <w:szCs w:val="22"/>
+        </w:rPr>
+        <w:t xml:space="preserve"> uit het directe politieke debat</w:t>
+      </w:r>
+      <w:r>
+        <w:rPr>
+          <w:rFonts w:ascii="Courier New" w:hAnsi="Courier New" w:cs="Courier New"/>
+          <w:sz w:val="22"/>
+          <w:szCs w:val="22"/>
+        </w:rPr>
+        <w:t xml:space="preserve"> en concentreert zich</w:t>
+      </w:r>
+      <w:r>
+        <w:rPr>
+          <w:rFonts w:ascii="Courier New" w:hAnsi="Courier New" w:cs="Courier New"/>
+          <w:sz w:val="22"/>
+          <w:szCs w:val="22"/>
+        </w:rPr>
+        <w:t xml:space="preserve"> op </w:t>
+      </w:r>
+      <w:r>
+        <w:rPr>
+          <w:rFonts w:ascii="Courier New" w:hAnsi="Courier New" w:cs="Courier New"/>
+          <w:sz w:val="22"/>
+          <w:szCs w:val="22"/>
+        </w:rPr>
+        <w:t xml:space="preserve">zijn </w:t>
+      </w:r>
+      <w:r>
+        <w:rPr>
+          <w:rFonts w:ascii="Courier New" w:hAnsi="Courier New" w:cs="Courier New"/>
+          <w:sz w:val="22"/>
+          <w:szCs w:val="22"/>
+        </w:rPr>
+        <w:t xml:space="preserve">theoretisch </w:t>
+      </w:r>
+      <w:r>
+        <w:rPr>
+          <w:rFonts w:ascii="Courier New" w:hAnsi="Courier New" w:cs="Courier New"/>
+          <w:sz w:val="22"/>
+          <w:szCs w:val="22"/>
+        </w:rPr>
+        <w:t>werk op het Max Planck-instituut</w:t>
+      </w:r>
+      <w:r>
+        <w:rPr>
+          <w:rFonts w:ascii="Courier New" w:hAnsi="Courier New" w:cs="Courier New"/>
+          <w:sz w:val="22"/>
+          <w:szCs w:val="22"/>
+        </w:rPr>
+        <w:t>.</w:t>
       </w:r>
       <w:r>
         <w:rPr>
@@ -890,7 +2340,41 @@
           <w:sz w:val="22"/>
           <w:szCs w:val="22"/>
         </w:rPr>
-        <w:t>Zijn omstreden waarschuwing voor vormen van 'links fascisme' bracht hem in conflict met delen van de beweging. Verovšek beschouwt deze episode als een belangrijk moment in Habermas' ontwikkeling.</w:t>
+        <w:t>Hij werkt</w:t>
+      </w:r>
+      <w:r>
+        <w:rPr>
+          <w:rFonts w:ascii="Courier New" w:hAnsi="Courier New" w:cs="Courier New"/>
+          <w:sz w:val="22"/>
+          <w:szCs w:val="22"/>
+        </w:rPr>
+        <w:t xml:space="preserve"> aan </w:t>
+      </w:r>
+      <w:r>
+        <w:rPr>
+          <w:rFonts w:ascii="Courier New" w:hAnsi="Courier New" w:cs="Courier New"/>
+          <w:sz w:val="22"/>
+          <w:szCs w:val="22"/>
+        </w:rPr>
+        <w:t xml:space="preserve">zijn </w:t>
+      </w:r>
+      <w:r>
+        <w:rPr>
+          <w:rFonts w:ascii="Courier New" w:hAnsi="Courier New" w:cs="Courier New"/>
+          <w:i/>
+          <w:iCs/>
+          <w:sz w:val="22"/>
+          <w:szCs w:val="22"/>
+        </w:rPr>
+        <w:t>Theorie des kommunikativen Handelns</w:t>
+      </w:r>
+      <w:r>
+        <w:rPr>
+          <w:rFonts w:ascii="Courier New" w:hAnsi="Courier New" w:cs="Courier New"/>
+          <w:sz w:val="22"/>
+          <w:szCs w:val="22"/>
+        </w:rPr>
+        <w:t> (1981), waarin hij zijn opvattingen over rationaliteit, maatschappelijke integratie en de verhouding tussen systeem en leefwereld verder uitwerkt.</w:t>
       </w:r>
       <w:r>
         <w:rPr>
@@ -906,7 +2390,296 @@
           <w:sz w:val="22"/>
           <w:szCs w:val="22"/>
         </w:rPr>
-        <w:t>Hier werd zichtbaar dat Habermas niet bereid was zijn filosofische overtuigingen ondergeschikt te maken aan een politieke beweging, zelfs wanneer hij haar algemene doelstellingen onderschreef. Zijn engagement kende grenzen: democratische emancipatie mocht volgens hem niet worden nagestreefd met middelen die de democratische discussie zelf ondermijnden.</w:t>
+        <w:t>Verovšek interpreteert deze periode niet als een afscheid van politiek engagement, maar als een fase waarin Habermas zijn theoretische grondslagen verdiepte. </w:t>
+      </w:r>
+      <w:r>
+        <w:rPr>
+          <w:rFonts w:ascii="Courier New" w:hAnsi="Courier New" w:cs="Courier New"/>
+          <w:sz w:val="22"/>
+          <w:szCs w:val="22"/>
+        </w:rPr>
+        <w:t>Met deze kennis in de zak neemt Habermas</w:t>
+      </w:r>
+      <w:r>
+        <w:rPr>
+          <w:rFonts w:ascii="Courier New" w:hAnsi="Courier New" w:cs="Courier New"/>
+          <w:sz w:val="22"/>
+          <w:szCs w:val="22"/>
+        </w:rPr>
+        <w:t xml:space="preserve"> opnieuw een prominente plaats in het Duitse publieke debat in. Vooral zijn deelname aan de zogenoemde </w:t>
+      </w:r>
+      <w:r>
+        <w:rPr>
+          <w:rFonts w:ascii="Courier New" w:hAnsi="Courier New" w:cs="Courier New"/>
+          <w:sz w:val="22"/>
+          <w:szCs w:val="22"/>
+        </w:rPr>
+        <w:t>‘</w:t>
+      </w:r>
+      <w:r>
+        <w:rPr>
+          <w:rFonts w:ascii="Courier New" w:hAnsi="Courier New" w:cs="Courier New"/>
+          <w:sz w:val="22"/>
+          <w:szCs w:val="22"/>
+        </w:rPr>
+        <w:t>Historikerstreit</w:t>
+      </w:r>
+      <w:r>
+        <w:rPr>
+          <w:rFonts w:ascii="Courier New" w:hAnsi="Courier New" w:cs="Courier New"/>
+          <w:sz w:val="22"/>
+          <w:szCs w:val="22"/>
+        </w:rPr>
+        <w:t>’</w:t>
+      </w:r>
+      <w:r>
+        <w:rPr>
+          <w:rFonts w:ascii="Courier New" w:hAnsi="Courier New" w:cs="Courier New"/>
+          <w:sz w:val="22"/>
+          <w:szCs w:val="22"/>
+        </w:rPr>
+        <w:t> van 1986 maakte hem opnieuw tot een nationaal invloedrijke intellectueel.</w:t>
+      </w:r>
+      <w:r>
+        <w:rPr>
+          <w:rFonts w:ascii="Courier New" w:hAnsi="Courier New" w:cs="Courier New"/>
+          <w:sz w:val="22"/>
+          <w:szCs w:val="22"/>
+        </w:rPr>
+        <w:t xml:space="preserve"> Daarbij verzet </w:t>
+      </w:r>
+      <w:r>
+        <w:rPr>
+          <w:rFonts w:ascii="Courier New" w:hAnsi="Courier New" w:cs="Courier New"/>
+          <w:sz w:val="22"/>
+          <w:szCs w:val="22"/>
+        </w:rPr>
+        <w:t xml:space="preserve">Habermas zich </w:t>
+      </w:r>
+      <w:r>
+        <w:rPr>
+          <w:rFonts w:ascii="Courier New" w:hAnsi="Courier New" w:cs="Courier New"/>
+          <w:sz w:val="22"/>
+          <w:szCs w:val="22"/>
+        </w:rPr>
+        <w:lastRenderedPageBreak/>
+        <w:t>tegen historici die</w:t>
+      </w:r>
+      <w:r>
+        <w:rPr>
+          <w:rFonts w:ascii="Courier New" w:hAnsi="Courier New" w:cs="Courier New"/>
+          <w:sz w:val="22"/>
+          <w:szCs w:val="22"/>
+        </w:rPr>
+        <w:t xml:space="preserve"> </w:t>
+      </w:r>
+      <w:r>
+        <w:rPr>
+          <w:rFonts w:ascii="Courier New" w:hAnsi="Courier New" w:cs="Courier New"/>
+          <w:sz w:val="22"/>
+          <w:szCs w:val="22"/>
+        </w:rPr>
+        <w:t>volgens hem de bijzondere betekenis van de</w:t>
+      </w:r>
+      <w:r>
+        <w:rPr>
+          <w:rFonts w:ascii="Courier New" w:hAnsi="Courier New" w:cs="Courier New"/>
+          <w:sz w:val="22"/>
+          <w:szCs w:val="22"/>
+        </w:rPr>
+        <w:t xml:space="preserve"> </w:t>
+      </w:r>
+      <w:r>
+        <w:rPr>
+          <w:rFonts w:ascii="Courier New" w:hAnsi="Courier New" w:cs="Courier New"/>
+          <w:sz w:val="22"/>
+          <w:szCs w:val="22"/>
+        </w:rPr>
+        <w:t>nationaal</w:t>
+      </w:r>
+      <w:r>
+        <w:rPr>
+          <w:rFonts w:ascii="Courier New" w:hAnsi="Courier New" w:cs="Courier New"/>
+          <w:sz w:val="22"/>
+          <w:szCs w:val="22"/>
+        </w:rPr>
+        <w:t>-</w:t>
+      </w:r>
+      <w:r>
+        <w:rPr>
+          <w:rFonts w:ascii="Courier New" w:hAnsi="Courier New" w:cs="Courier New"/>
+          <w:sz w:val="22"/>
+          <w:szCs w:val="22"/>
+        </w:rPr>
+        <w:t>socialistische misdaden relative</w:t>
+      </w:r>
+      <w:r>
+        <w:rPr>
+          <w:rFonts w:ascii="Courier New" w:hAnsi="Courier New" w:cs="Courier New"/>
+          <w:sz w:val="22"/>
+          <w:szCs w:val="22"/>
+        </w:rPr>
+        <w:t>ren</w:t>
+      </w:r>
+      <w:r>
+        <w:rPr>
+          <w:rFonts w:ascii="Courier New" w:hAnsi="Courier New" w:cs="Courier New"/>
+          <w:sz w:val="22"/>
+          <w:szCs w:val="22"/>
+        </w:rPr>
+        <w:t xml:space="preserve"> door deze te vergelijken met andere historische vormen van massaal geweld. De</w:t>
+      </w:r>
+      <w:r>
+        <w:rPr>
+          <w:rFonts w:ascii="Courier New" w:hAnsi="Courier New" w:cs="Courier New"/>
+          <w:sz w:val="22"/>
+          <w:szCs w:val="22"/>
+        </w:rPr>
+        <w:t>ze</w:t>
+      </w:r>
+      <w:r>
+        <w:rPr>
+          <w:rFonts w:ascii="Courier New" w:hAnsi="Courier New" w:cs="Courier New"/>
+          <w:sz w:val="22"/>
+          <w:szCs w:val="22"/>
+        </w:rPr>
+        <w:t xml:space="preserve"> discussie raakt</w:t>
+      </w:r>
+      <w:r>
+        <w:rPr>
+          <w:rFonts w:ascii="Courier New" w:hAnsi="Courier New" w:cs="Courier New"/>
+          <w:sz w:val="22"/>
+          <w:szCs w:val="22"/>
+        </w:rPr>
+        <w:t xml:space="preserve"> voor hem</w:t>
+      </w:r>
+      <w:r>
+        <w:rPr>
+          <w:rFonts w:ascii="Courier New" w:hAnsi="Courier New" w:cs="Courier New"/>
+          <w:sz w:val="22"/>
+          <w:szCs w:val="22"/>
+        </w:rPr>
+        <w:t xml:space="preserve"> aan de politieke identiteit van de Bondsrepubliek. Een democratisch Duitsland moest volgens hem zijn legitimiteit niet ontlenen aan nationale trots of historische continuïteit, maar aan de beginselen van de democratische rechtsstaat.</w:t>
+      </w:r>
+      <w:r>
+        <w:rPr>
+          <w:rFonts w:ascii="Courier New" w:hAnsi="Courier New" w:cs="Courier New"/>
+          <w:sz w:val="22"/>
+          <w:szCs w:val="22"/>
+        </w:rPr>
+        <w:t xml:space="preserve"> </w:t>
+      </w:r>
+      <w:r>
+        <w:rPr>
+          <w:rFonts w:ascii="Courier New" w:hAnsi="Courier New" w:cs="Courier New"/>
+          <w:sz w:val="22"/>
+          <w:szCs w:val="22"/>
+        </w:rPr>
+        <w:t>P</w:t>
+      </w:r>
+      <w:r>
+        <w:rPr>
+          <w:rFonts w:ascii="Courier New" w:hAnsi="Courier New" w:cs="Courier New"/>
+          <w:sz w:val="22"/>
+          <w:szCs w:val="22"/>
+        </w:rPr>
+        <w:t>olitieke verbondenheid behoort in de eerste plaats gebaseerd te zijn op gedeelde democratische en constitutionele waarden, niet op etnische of culturele homogeniteit.</w:t>
+      </w:r>
+      <w:r>
+        <w:rPr>
+          <w:rFonts w:ascii="Courier New" w:hAnsi="Courier New" w:cs="Courier New"/>
+          <w:sz w:val="22"/>
+          <w:szCs w:val="22"/>
+        </w:rPr>
+        <w:t xml:space="preserve"> </w:t>
+      </w:r>
+      <w:r>
+        <w:rPr>
+          <w:rFonts w:ascii="Courier New" w:hAnsi="Courier New" w:cs="Courier New"/>
+          <w:sz w:val="22"/>
+          <w:szCs w:val="22"/>
+        </w:rPr>
+        <w:t>Ook tijdens de Duitse hereniging in 1989–1990 verdedig</w:t>
+      </w:r>
+      <w:r>
+        <w:rPr>
+          <w:rFonts w:ascii="Courier New" w:hAnsi="Courier New" w:cs="Courier New"/>
+          <w:sz w:val="22"/>
+          <w:szCs w:val="22"/>
+        </w:rPr>
+        <w:t>t</w:t>
+      </w:r>
+      <w:r>
+        <w:rPr>
+          <w:rFonts w:ascii="Courier New" w:hAnsi="Courier New" w:cs="Courier New"/>
+          <w:sz w:val="22"/>
+          <w:szCs w:val="22"/>
+        </w:rPr>
+        <w:t xml:space="preserve"> Habermas het belang van democratische legitimiteit en publieke discussie. Hij waarschuw</w:t>
+      </w:r>
+      <w:r>
+        <w:rPr>
+          <w:rFonts w:ascii="Courier New" w:hAnsi="Courier New" w:cs="Courier New"/>
+          <w:sz w:val="22"/>
+          <w:szCs w:val="22"/>
+        </w:rPr>
+        <w:t>t</w:t>
+      </w:r>
+      <w:r>
+        <w:rPr>
+          <w:rFonts w:ascii="Courier New" w:hAnsi="Courier New" w:cs="Courier New"/>
+          <w:sz w:val="22"/>
+          <w:szCs w:val="22"/>
+        </w:rPr>
+        <w:t xml:space="preserve"> voor een herenigingsproces waarin nationale sentimenten en bestuurlijke besluitvorming de overhand zouden krijgen.</w:t>
+      </w:r>
+      <w:r>
+        <w:rPr>
+          <w:rFonts w:ascii="Courier New" w:hAnsi="Courier New" w:cs="Courier New"/>
+          <w:sz w:val="22"/>
+          <w:szCs w:val="22"/>
+        </w:rPr>
+        <w:t xml:space="preserve"> </w:t>
+      </w:r>
+      <w:r>
+        <w:rPr>
+          <w:rFonts w:ascii="Courier New" w:hAnsi="Courier New" w:cs="Courier New"/>
+          <w:sz w:val="22"/>
+          <w:szCs w:val="22"/>
+        </w:rPr>
+        <w:t xml:space="preserve">Verovšek laat </w:t>
+      </w:r>
+      <w:r>
+        <w:rPr>
+          <w:rFonts w:ascii="Courier New" w:hAnsi="Courier New" w:cs="Courier New"/>
+          <w:sz w:val="22"/>
+          <w:szCs w:val="22"/>
+        </w:rPr>
+        <w:t xml:space="preserve">heel goed </w:t>
+      </w:r>
+      <w:r>
+        <w:rPr>
+          <w:rFonts w:ascii="Courier New" w:hAnsi="Courier New" w:cs="Courier New"/>
+          <w:sz w:val="22"/>
+          <w:szCs w:val="22"/>
+        </w:rPr>
+        <w:t>zien dat Habermas' publieke interventies steeds opnieuw voort</w:t>
+      </w:r>
+      <w:r>
+        <w:rPr>
+          <w:rFonts w:ascii="Courier New" w:hAnsi="Courier New" w:cs="Courier New"/>
+          <w:sz w:val="22"/>
+          <w:szCs w:val="22"/>
+        </w:rPr>
+        <w:t>omen</w:t>
+      </w:r>
+      <w:r>
+        <w:rPr>
+          <w:rFonts w:ascii="Courier New" w:hAnsi="Courier New" w:cs="Courier New"/>
+          <w:sz w:val="22"/>
+          <w:szCs w:val="22"/>
+        </w:rPr>
+        <w:t xml:space="preserve"> uit zijn bezorgdheid over de democratische kwaliteit van politieke besluitvorming.</w:t>
       </w:r>
     </w:p>
     <w:p>
@@ -925,7 +2698,520 @@
           <w:sz w:val="22"/>
           <w:szCs w:val="22"/>
         </w:rPr>
-        <w:t>De ervaringen met de studentenbeweging droegen bij aan zijn tijdelijke terugtrekking uit het directe politieke debat. Vanaf de jaren zeventig concentreerde hij zich sterker op theoretisch onderzoek, onder andere bij het Max-Planck-Institut in Starnberg.</w:t>
+        <w:t xml:space="preserve">Na de val van de Berlijnse Muur </w:t>
+      </w:r>
+      <w:r>
+        <w:rPr>
+          <w:rFonts w:ascii="Courier New" w:hAnsi="Courier New" w:cs="Courier New"/>
+          <w:sz w:val="22"/>
+          <w:szCs w:val="22"/>
+        </w:rPr>
+        <w:t xml:space="preserve">in 1989 </w:t>
+      </w:r>
+      <w:r>
+        <w:rPr>
+          <w:rFonts w:ascii="Courier New" w:hAnsi="Courier New" w:cs="Courier New"/>
+          <w:sz w:val="22"/>
+          <w:szCs w:val="22"/>
+        </w:rPr>
+        <w:t>versch</w:t>
+      </w:r>
+      <w:r>
+        <w:rPr>
+          <w:rFonts w:ascii="Courier New" w:hAnsi="Courier New" w:cs="Courier New"/>
+          <w:sz w:val="22"/>
+          <w:szCs w:val="22"/>
+        </w:rPr>
+        <w:t>uift</w:t>
+      </w:r>
+      <w:r>
+        <w:rPr>
+          <w:rFonts w:ascii="Courier New" w:hAnsi="Courier New" w:cs="Courier New"/>
+          <w:sz w:val="22"/>
+          <w:szCs w:val="22"/>
+        </w:rPr>
+        <w:t xml:space="preserve"> Habermas' aandacht geleidelijk van de Duitse nationale politiek naar de toekomst van Europa. Habermas beschouw</w:t>
+      </w:r>
+      <w:r>
+        <w:rPr>
+          <w:rFonts w:ascii="Courier New" w:hAnsi="Courier New" w:cs="Courier New"/>
+          <w:sz w:val="22"/>
+          <w:szCs w:val="22"/>
+        </w:rPr>
+        <w:t>t</w:t>
+      </w:r>
+      <w:r>
+        <w:rPr>
+          <w:rFonts w:ascii="Courier New" w:hAnsi="Courier New" w:cs="Courier New"/>
+          <w:sz w:val="22"/>
+          <w:szCs w:val="22"/>
+        </w:rPr>
+        <w:t xml:space="preserve"> de Europese integratie als een historische mogelijkheid om nationale tegenstellingen te overstijgen en democratische samenwerking op internationaal niveau te ontwikkelen.</w:t>
+      </w:r>
+      <w:r>
+        <w:rPr>
+          <w:rFonts w:ascii="Courier New" w:hAnsi="Courier New" w:cs="Courier New"/>
+          <w:sz w:val="22"/>
+          <w:szCs w:val="22"/>
+        </w:rPr>
+        <w:t xml:space="preserve"> </w:t>
+      </w:r>
+      <w:r>
+        <w:rPr>
+          <w:rFonts w:ascii="Courier New" w:hAnsi="Courier New" w:cs="Courier New"/>
+          <w:sz w:val="22"/>
+          <w:szCs w:val="22"/>
+        </w:rPr>
+        <w:t>Dat vraagt d</w:t>
+      </w:r>
+      <w:r>
+        <w:rPr>
+          <w:rFonts w:ascii="Courier New" w:hAnsi="Courier New" w:cs="Courier New"/>
+          <w:sz w:val="22"/>
+          <w:szCs w:val="22"/>
+        </w:rPr>
+        <w:t>emocratische legitimiteit van Europese instituties</w:t>
+      </w:r>
+      <w:r>
+        <w:rPr>
+          <w:rFonts w:ascii="Courier New" w:hAnsi="Courier New" w:cs="Courier New"/>
+          <w:sz w:val="22"/>
+          <w:szCs w:val="22"/>
+        </w:rPr>
+        <w:t>; e</w:t>
+      </w:r>
+      <w:r>
+        <w:rPr>
+          <w:rFonts w:ascii="Courier New" w:hAnsi="Courier New" w:cs="Courier New"/>
+          <w:sz w:val="22"/>
+          <w:szCs w:val="22"/>
+        </w:rPr>
+        <w:t xml:space="preserve">conomische integratie </w:t>
+      </w:r>
+      <w:r>
+        <w:rPr>
+          <w:rFonts w:ascii="Courier New" w:hAnsi="Courier New" w:cs="Courier New"/>
+          <w:sz w:val="22"/>
+          <w:szCs w:val="22"/>
+        </w:rPr>
+        <w:t>i</w:t>
+      </w:r>
+      <w:r>
+        <w:rPr>
+          <w:rFonts w:ascii="Courier New" w:hAnsi="Courier New" w:cs="Courier New"/>
+          <w:sz w:val="22"/>
+          <w:szCs w:val="22"/>
+        </w:rPr>
+        <w:t>s volgens hem onvoldoende wanneer zij niet gepaard g</w:t>
+      </w:r>
+      <w:r>
+        <w:rPr>
+          <w:rFonts w:ascii="Courier New" w:hAnsi="Courier New" w:cs="Courier New"/>
+          <w:sz w:val="22"/>
+          <w:szCs w:val="22"/>
+        </w:rPr>
+        <w:t>aat</w:t>
+      </w:r>
+      <w:r>
+        <w:rPr>
+          <w:rFonts w:ascii="Courier New" w:hAnsi="Courier New" w:cs="Courier New"/>
+          <w:sz w:val="22"/>
+          <w:szCs w:val="22"/>
+        </w:rPr>
+        <w:t xml:space="preserve"> met politieke democratisering en een Europese publieke sfeer.</w:t>
+      </w:r>
+      <w:r>
+        <w:rPr>
+          <w:rFonts w:ascii="Courier New" w:hAnsi="Courier New" w:cs="Courier New"/>
+          <w:sz w:val="22"/>
+          <w:szCs w:val="22"/>
+        </w:rPr>
+        <w:t xml:space="preserve"> </w:t>
+      </w:r>
+      <w:r>
+        <w:rPr>
+          <w:rFonts w:ascii="Courier New" w:hAnsi="Courier New" w:cs="Courier New"/>
+          <w:sz w:val="22"/>
+          <w:szCs w:val="22"/>
+        </w:rPr>
+        <w:t xml:space="preserve">Volgens </w:t>
+      </w:r>
+      <w:r>
+        <w:rPr>
+          <w:rFonts w:ascii="Courier New" w:hAnsi="Courier New" w:cs="Courier New"/>
+          <w:sz w:val="22"/>
+          <w:szCs w:val="22"/>
+        </w:rPr>
+        <w:t>Verovšek</w:t>
+      </w:r>
+      <w:r>
+        <w:rPr>
+          <w:rFonts w:ascii="Courier New" w:hAnsi="Courier New" w:cs="Courier New"/>
+          <w:sz w:val="22"/>
+          <w:szCs w:val="22"/>
+        </w:rPr>
+        <w:t xml:space="preserve"> wordt z</w:t>
+      </w:r>
+      <w:r>
+        <w:rPr>
+          <w:rFonts w:ascii="Courier New" w:hAnsi="Courier New" w:cs="Courier New"/>
+          <w:sz w:val="22"/>
+          <w:szCs w:val="22"/>
+        </w:rPr>
+        <w:t>ijn politieke horizon internationaler, terwijl zijn fundamentele uitgangspunten grotendeels dezelfde bl</w:t>
+      </w:r>
+      <w:r>
+        <w:rPr>
+          <w:rFonts w:ascii="Courier New" w:hAnsi="Courier New" w:cs="Courier New"/>
+          <w:sz w:val="22"/>
+          <w:szCs w:val="22"/>
+        </w:rPr>
+        <w:t>ij</w:t>
+      </w:r>
+      <w:r>
+        <w:rPr>
+          <w:rFonts w:ascii="Courier New" w:hAnsi="Courier New" w:cs="Courier New"/>
+          <w:sz w:val="22"/>
+          <w:szCs w:val="22"/>
+        </w:rPr>
+        <w:t>ven.</w:t>
+      </w:r>
+      <w:r>
+        <w:rPr>
+          <w:rFonts w:ascii="Courier New" w:hAnsi="Courier New" w:cs="Courier New"/>
+          <w:sz w:val="22"/>
+          <w:szCs w:val="22"/>
+        </w:rPr>
+        <w:t xml:space="preserve"> </w:t>
+      </w:r>
+      <w:r>
+        <w:rPr>
+          <w:rFonts w:ascii="Courier New" w:hAnsi="Courier New" w:cs="Courier New"/>
+          <w:sz w:val="22"/>
+          <w:szCs w:val="22"/>
+        </w:rPr>
+        <w:t xml:space="preserve">Habermas had altijd verdedigd dat intellectuelen afstand </w:t>
+      </w:r>
+      <w:r>
+        <w:rPr>
+          <w:rFonts w:ascii="Courier New" w:hAnsi="Courier New" w:cs="Courier New"/>
+          <w:sz w:val="22"/>
+          <w:szCs w:val="22"/>
+        </w:rPr>
+        <w:t>hebben te</w:t>
+      </w:r>
+      <w:r>
+        <w:rPr>
+          <w:rFonts w:ascii="Courier New" w:hAnsi="Courier New" w:cs="Courier New"/>
+          <w:sz w:val="22"/>
+          <w:szCs w:val="22"/>
+        </w:rPr>
+        <w:t xml:space="preserve"> bewaren tot de politieke macht. Zijn betrokkenheid bij de Europese integratie br</w:t>
+      </w:r>
+      <w:r>
+        <w:rPr>
+          <w:rFonts w:ascii="Courier New" w:hAnsi="Courier New" w:cs="Courier New"/>
+          <w:sz w:val="22"/>
+          <w:szCs w:val="22"/>
+        </w:rPr>
+        <w:t>engt</w:t>
+      </w:r>
+      <w:r>
+        <w:rPr>
+          <w:rFonts w:ascii="Courier New" w:hAnsi="Courier New" w:cs="Courier New"/>
+          <w:sz w:val="22"/>
+          <w:szCs w:val="22"/>
+        </w:rPr>
+        <w:t xml:space="preserve"> hem steeds dichter bij concrete politieke projecten en politici.</w:t>
+      </w:r>
+      <w:r>
+        <w:rPr>
+          <w:rFonts w:ascii="Courier New" w:hAnsi="Courier New" w:cs="Courier New"/>
+          <w:sz w:val="22"/>
+          <w:szCs w:val="22"/>
+        </w:rPr>
+        <w:t xml:space="preserve"> </w:t>
+      </w:r>
+      <w:r>
+        <w:rPr>
+          <w:rFonts w:ascii="Courier New" w:hAnsi="Courier New" w:cs="Courier New"/>
+          <w:sz w:val="22"/>
+          <w:szCs w:val="22"/>
+        </w:rPr>
+        <w:t xml:space="preserve">Die spanning wordt volgens </w:t>
+      </w:r>
+      <w:r>
+        <w:rPr>
+          <w:rFonts w:ascii="Courier New" w:hAnsi="Courier New" w:cs="Courier New"/>
+          <w:sz w:val="22"/>
+          <w:szCs w:val="22"/>
+        </w:rPr>
+        <w:t xml:space="preserve">Verovšek zichtbaar </w:t>
+      </w:r>
+      <w:r>
+        <w:rPr>
+          <w:rFonts w:ascii="Courier New" w:hAnsi="Courier New" w:cs="Courier New"/>
+          <w:sz w:val="22"/>
+          <w:szCs w:val="22"/>
+        </w:rPr>
+        <w:t>wanneer</w:t>
+      </w:r>
+      <w:r>
+        <w:rPr>
+          <w:rFonts w:ascii="Courier New" w:hAnsi="Courier New" w:cs="Courier New"/>
+          <w:sz w:val="22"/>
+          <w:szCs w:val="22"/>
+        </w:rPr>
+        <w:t xml:space="preserve"> Habermas zich nadrukkelijker verb</w:t>
+      </w:r>
+      <w:r>
+        <w:rPr>
+          <w:rFonts w:ascii="Courier New" w:hAnsi="Courier New" w:cs="Courier New"/>
+          <w:sz w:val="22"/>
+          <w:szCs w:val="22"/>
+        </w:rPr>
+        <w:t>indt</w:t>
+      </w:r>
+      <w:r>
+        <w:rPr>
+          <w:rFonts w:ascii="Courier New" w:hAnsi="Courier New" w:cs="Courier New"/>
+          <w:sz w:val="22"/>
+          <w:szCs w:val="22"/>
+        </w:rPr>
+        <w:t xml:space="preserve"> aan het Europese integratieproject. De Europese schuldencrisis na 2008 vorm</w:t>
+      </w:r>
+      <w:r>
+        <w:rPr>
+          <w:rFonts w:ascii="Courier New" w:hAnsi="Courier New" w:cs="Courier New"/>
+          <w:sz w:val="22"/>
+          <w:szCs w:val="22"/>
+        </w:rPr>
+        <w:t>t voor Habermas</w:t>
+      </w:r>
+      <w:r>
+        <w:rPr>
+          <w:rFonts w:ascii="Courier New" w:hAnsi="Courier New" w:cs="Courier New"/>
+          <w:sz w:val="22"/>
+          <w:szCs w:val="22"/>
+        </w:rPr>
+        <w:t xml:space="preserve"> een nieuwe aanleiding om zich intensief in het politieke debat te mengen.</w:t>
+      </w:r>
+      <w:r>
+        <w:rPr>
+          <w:rFonts w:ascii="Courier New" w:hAnsi="Courier New" w:cs="Courier New"/>
+          <w:sz w:val="22"/>
+          <w:szCs w:val="22"/>
+        </w:rPr>
+        <w:t xml:space="preserve"> </w:t>
+      </w:r>
+      <w:r>
+        <w:rPr>
+          <w:rFonts w:ascii="Courier New" w:hAnsi="Courier New" w:cs="Courier New"/>
+          <w:sz w:val="22"/>
+          <w:szCs w:val="22"/>
+        </w:rPr>
+        <w:t xml:space="preserve">Hij maakt zich zorgen over de toenemende invloed van financiële markten, technocratische instituties en economische belangen op democratische </w:t>
+      </w:r>
+      <w:r>
+        <w:rPr>
+          <w:rFonts w:ascii="Courier New" w:hAnsi="Courier New" w:cs="Courier New"/>
+          <w:sz w:val="22"/>
+          <w:szCs w:val="22"/>
+        </w:rPr>
+        <w:lastRenderedPageBreak/>
+        <w:t>besluitvorming.</w:t>
+      </w:r>
+      <w:r>
+        <w:rPr>
+          <w:rFonts w:ascii="Courier New" w:hAnsi="Courier New" w:cs="Courier New"/>
+          <w:sz w:val="22"/>
+          <w:szCs w:val="22"/>
+        </w:rPr>
+        <w:t xml:space="preserve"> </w:t>
+      </w:r>
+      <w:r>
+        <w:rPr>
+          <w:rFonts w:ascii="Courier New" w:hAnsi="Courier New" w:cs="Courier New"/>
+          <w:sz w:val="22"/>
+          <w:szCs w:val="22"/>
+        </w:rPr>
+        <w:t>Deze ontwikkeling sl</w:t>
+      </w:r>
+      <w:r>
+        <w:rPr>
+          <w:rFonts w:ascii="Courier New" w:hAnsi="Courier New" w:cs="Courier New"/>
+          <w:sz w:val="22"/>
+          <w:szCs w:val="22"/>
+        </w:rPr>
+        <w:t>ui</w:t>
+      </w:r>
+      <w:r>
+        <w:rPr>
+          <w:rFonts w:ascii="Courier New" w:hAnsi="Courier New" w:cs="Courier New"/>
+          <w:sz w:val="22"/>
+          <w:szCs w:val="22"/>
+        </w:rPr>
+        <w:t xml:space="preserve">t aan bij zijn oudere theorie over de </w:t>
+      </w:r>
+      <w:r>
+        <w:rPr>
+          <w:rFonts w:ascii="Courier New" w:hAnsi="Courier New" w:cs="Courier New"/>
+          <w:sz w:val="22"/>
+          <w:szCs w:val="22"/>
+        </w:rPr>
+        <w:t>‘</w:t>
+      </w:r>
+      <w:r>
+        <w:rPr>
+          <w:rFonts w:ascii="Courier New" w:hAnsi="Courier New" w:cs="Courier New"/>
+          <w:sz w:val="22"/>
+          <w:szCs w:val="22"/>
+        </w:rPr>
+        <w:t>kolonisering van de leefwereld</w:t>
+      </w:r>
+      <w:r>
+        <w:rPr>
+          <w:rFonts w:ascii="Courier New" w:hAnsi="Courier New" w:cs="Courier New"/>
+          <w:sz w:val="22"/>
+          <w:szCs w:val="22"/>
+        </w:rPr>
+        <w:t>’</w:t>
+      </w:r>
+      <w:r>
+        <w:rPr>
+          <w:rFonts w:ascii="Courier New" w:hAnsi="Courier New" w:cs="Courier New"/>
+          <w:sz w:val="22"/>
+          <w:szCs w:val="22"/>
+        </w:rPr>
+        <w:t xml:space="preserve">. Daarmee bedoelde hij dat economische en bureaucratische systemen steeds verder doordringen in maatschappelijke verhoudingen </w:t>
+      </w:r>
+      <w:r>
+        <w:rPr>
+          <w:rFonts w:ascii="Courier New" w:hAnsi="Courier New" w:cs="Courier New"/>
+          <w:sz w:val="22"/>
+          <w:szCs w:val="22"/>
+        </w:rPr>
+        <w:t xml:space="preserve">en persoonlijke relaties </w:t>
+      </w:r>
+      <w:r>
+        <w:rPr>
+          <w:rFonts w:ascii="Courier New" w:hAnsi="Courier New" w:cs="Courier New"/>
+          <w:sz w:val="22"/>
+          <w:szCs w:val="22"/>
+        </w:rPr>
+        <w:t>die eigenlijk door communicatie, solidariteit en onderling begrip zouden moeten worden gereguleerd.</w:t>
+      </w:r>
+      <w:r>
+        <w:rPr>
+          <w:rFonts w:ascii="Courier New" w:hAnsi="Courier New" w:cs="Courier New"/>
+          <w:sz w:val="22"/>
+          <w:szCs w:val="22"/>
+        </w:rPr>
+        <w:t xml:space="preserve"> </w:t>
+      </w:r>
+      <w:r>
+        <w:rPr>
+          <w:rFonts w:ascii="Courier New" w:hAnsi="Courier New" w:cs="Courier New"/>
+          <w:sz w:val="22"/>
+          <w:szCs w:val="22"/>
+        </w:rPr>
+        <w:t>In de Europese politiek z</w:t>
+      </w:r>
+      <w:r>
+        <w:rPr>
+          <w:rFonts w:ascii="Courier New" w:hAnsi="Courier New" w:cs="Courier New"/>
+          <w:sz w:val="22"/>
+          <w:szCs w:val="22"/>
+        </w:rPr>
+        <w:t xml:space="preserve">iet Habermas </w:t>
+      </w:r>
+      <w:r>
+        <w:rPr>
+          <w:rFonts w:ascii="Courier New" w:hAnsi="Courier New" w:cs="Courier New"/>
+          <w:sz w:val="22"/>
+          <w:szCs w:val="22"/>
+        </w:rPr>
+        <w:t>dat economische noodzakelijkheden w</w:t>
+      </w:r>
+      <w:r>
+        <w:rPr>
+          <w:rFonts w:ascii="Courier New" w:hAnsi="Courier New" w:cs="Courier New"/>
+          <w:sz w:val="22"/>
+          <w:szCs w:val="22"/>
+        </w:rPr>
+        <w:t>o</w:t>
+      </w:r>
+      <w:r>
+        <w:rPr>
+          <w:rFonts w:ascii="Courier New" w:hAnsi="Courier New" w:cs="Courier New"/>
+          <w:sz w:val="22"/>
+          <w:szCs w:val="22"/>
+        </w:rPr>
+        <w:t>rden voorgesteld als onvermijdelijke feiten waarover burgers nauwelijks nog democratische zeggenschap h</w:t>
+      </w:r>
+      <w:r>
+        <w:rPr>
+          <w:rFonts w:ascii="Courier New" w:hAnsi="Courier New" w:cs="Courier New"/>
+          <w:sz w:val="22"/>
+          <w:szCs w:val="22"/>
+        </w:rPr>
+        <w:t>ebb</w:t>
+      </w:r>
+      <w:r>
+        <w:rPr>
+          <w:rFonts w:ascii="Courier New" w:hAnsi="Courier New" w:cs="Courier New"/>
+          <w:sz w:val="22"/>
+          <w:szCs w:val="22"/>
+        </w:rPr>
+        <w:t>en.</w:t>
+      </w:r>
+      <w:r>
+        <w:rPr>
+          <w:rFonts w:ascii="Courier New" w:hAnsi="Courier New" w:cs="Courier New"/>
+          <w:sz w:val="22"/>
+          <w:szCs w:val="22"/>
+        </w:rPr>
+        <w:t xml:space="preserve"> </w:t>
+      </w:r>
+      <w:r>
+        <w:rPr>
+          <w:rFonts w:ascii="Courier New" w:hAnsi="Courier New" w:cs="Courier New"/>
+          <w:sz w:val="22"/>
+          <w:szCs w:val="22"/>
+        </w:rPr>
+        <w:t>Politieke beslissingen moeten volgens hem onderwerp blijven van openbare discussie en democratische verantwoording.</w:t>
+      </w:r>
+      <w:r>
+        <w:rPr>
+          <w:rFonts w:ascii="Courier New" w:hAnsi="Courier New" w:cs="Courier New"/>
+          <w:sz w:val="22"/>
+          <w:szCs w:val="22"/>
+        </w:rPr>
+        <w:t xml:space="preserve"> </w:t>
+      </w:r>
+      <w:r>
+        <w:rPr>
+          <w:rFonts w:ascii="Courier New" w:hAnsi="Courier New" w:cs="Courier New"/>
+          <w:sz w:val="22"/>
+          <w:szCs w:val="22"/>
+        </w:rPr>
+        <w:t>Verovšek signaleert hier een opvallende ontwikkeling. Terwijl Habermas theoretisch vasthield aan het onderscheid tussen filosofische reflectie en politieke besluitvorming, tr</w:t>
+      </w:r>
+      <w:r>
+        <w:rPr>
+          <w:rFonts w:ascii="Courier New" w:hAnsi="Courier New" w:cs="Courier New"/>
+          <w:sz w:val="22"/>
+          <w:szCs w:val="22"/>
+        </w:rPr>
+        <w:t>eedt</w:t>
+      </w:r>
+      <w:r>
+        <w:rPr>
+          <w:rFonts w:ascii="Courier New" w:hAnsi="Courier New" w:cs="Courier New"/>
+          <w:sz w:val="22"/>
+          <w:szCs w:val="22"/>
+        </w:rPr>
+        <w:t xml:space="preserve"> hij in de praktijk soms op als een uitgesproken pleitbezorger van Europese hervormingen. Hij verscheen zelfs samen met politici op publieke bijeenkomsten en fungeerde in zekere zin als informeel adviseur.</w:t>
       </w:r>
     </w:p>
     <w:p>
@@ -943,7 +3229,59 @@
           <w:sz w:val="22"/>
           <w:szCs w:val="22"/>
         </w:rPr>
-        <w:t>In deze periode werkte hij aan Theorie des kommunikativen Handelns (1981), waarin hij zijn opvattingen over rationaliteit, maatschappelijke integratie en de verhouding tussen systeem en leefwereld verder uitwerkte.</w:t>
+        <w:t>Daarmee kwam zijn eigen publieke optreden dichter bij de directe politieke beïnvloeding waarvoor hij eerder had gewaarschuwd.</w:t>
+      </w:r>
+    </w:p>
+    <w:p>
+      <w:pPr>
+        <w:spacing w:line="360" w:lineRule="auto"/>
+        <w:rPr>
+          <w:rFonts w:ascii="Courier New" w:hAnsi="Courier New" w:cs="Courier New"/>
+          <w:b/>
+          <w:bCs/>
+          <w:sz w:val="22"/>
+          <w:szCs w:val="22"/>
+        </w:rPr>
+      </w:pPr>
+    </w:p>
+    <w:p>
+      <w:pPr>
+        <w:spacing w:line="360" w:lineRule="auto"/>
+        <w:rPr>
+          <w:rFonts w:ascii="Courier New" w:hAnsi="Courier New" w:cs="Courier New"/>
+          <w:b/>
+          <w:bCs/>
+          <w:sz w:val="22"/>
+          <w:szCs w:val="22"/>
+        </w:rPr>
+      </w:pPr>
+    </w:p>
+    <w:p>
+      <w:pPr>
+        <w:spacing w:line="360" w:lineRule="auto"/>
+        <w:rPr>
+          <w:rFonts w:ascii="Courier New" w:hAnsi="Courier New" w:cs="Courier New"/>
+          <w:sz w:val="22"/>
+          <w:szCs w:val="22"/>
+        </w:rPr>
+      </w:pPr>
+    </w:p>
+    <w:p>
+      <w:pPr>
+        <w:spacing w:line="360" w:lineRule="auto"/>
+        <w:rPr>
+          <w:rFonts w:ascii="Courier New" w:hAnsi="Courier New" w:cs="Courier New"/>
+          <w:sz w:val="22"/>
+          <w:szCs w:val="22"/>
+        </w:rPr>
+      </w:pPr>
+      <w:r>
+        <w:rPr>
+          <w:rFonts w:ascii="Courier New" w:hAnsi="Courier New" w:cs="Courier New"/>
+          <w:sz w:val="22"/>
+          <w:szCs w:val="22"/>
+        </w:rPr>
+        <w:t>In het slothoofdstuk bespreekt Verovšek Habermas' publieke optreden tussen 2021 en 2025 en stelt hij de vraag of Habermas misschien een van de laatste vertegenwoordigers was van een bepaald type publieke intellectueel.</w:t>
       </w:r>
       <w:r>
         <w:rPr>
@@ -959,7 +3297,55 @@
           <w:sz w:val="22"/>
           <w:szCs w:val="22"/>
         </w:rPr>
-        <w:t xml:space="preserve">Verovšek interpreteert deze periode </w:t>
+        <w:t>Habermas behoorde tot een generatie waarin gezaghebbende denkers via kranten, tijdschriften en publieke lezingen langdurig invloed konden uitoefenen op nationale politieke discussies.</w:t>
+      </w:r>
+      <w:r>
+        <w:rPr>
+          <w:rFonts w:ascii="Courier New" w:hAnsi="Courier New" w:cs="Courier New"/>
+          <w:sz w:val="22"/>
+          <w:szCs w:val="22"/>
+        </w:rPr>
+        <w:t xml:space="preserve"> </w:t>
+      </w:r>
+      <w:r>
+        <w:rPr>
+          <w:rFonts w:ascii="Courier New" w:hAnsi="Courier New" w:cs="Courier New"/>
+          <w:sz w:val="22"/>
+          <w:szCs w:val="22"/>
+        </w:rPr>
+        <w:t>De hedendaagse publieke sfeer is ingrijpend veranderd. Sociale media, digitale platforms, politieke polarisatie en de versnippering van het medialandschap hebben de voorwaarden voor publieke meningsvorming veranderd.</w:t>
+      </w:r>
+      <w:r>
+        <w:rPr>
+          <w:rFonts w:ascii="Courier New" w:hAnsi="Courier New" w:cs="Courier New"/>
+          <w:sz w:val="22"/>
+          <w:szCs w:val="22"/>
+        </w:rPr>
+        <w:t xml:space="preserve"> </w:t>
+      </w:r>
+      <w:r>
+        <w:rPr>
+          <w:rFonts w:ascii="Courier New" w:hAnsi="Courier New" w:cs="Courier New"/>
+          <w:sz w:val="22"/>
+          <w:szCs w:val="22"/>
+        </w:rPr>
+        <w:t>Verovšek onderzoekt wat deze veranderingen betekenen voor de mogelijkheid van een intellectueel om een breed publiek te bereiken. Ook de discussies rond de oorlog in Oekraïne en het conflict in Gaza laten zien hoe moeilijk het is geworden om complexe politieke standpunten in een gepolariseerde publieke omgeving over te brengen.</w:t>
+      </w:r>
+      <w:r>
+        <w:rPr>
+          <w:rFonts w:ascii="Courier New" w:hAnsi="Courier New" w:cs="Courier New"/>
+          <w:sz w:val="22"/>
+          <w:szCs w:val="22"/>
+        </w:rPr>
+        <w:t xml:space="preserve"> </w:t>
+      </w:r>
+      <w:r>
+        <w:rPr>
+          <w:rFonts w:ascii="Courier New" w:hAnsi="Courier New" w:cs="Courier New"/>
+          <w:sz w:val="22"/>
+          <w:szCs w:val="22"/>
+        </w:rPr>
+        <w:t xml:space="preserve">De vraag of Habermas de laatste publieke intellectueel was, moet daarom niet letterlijk worden </w:t>
       </w:r>
       <w:r>
         <w:rPr>
@@ -968,7 +3354,23 @@
           <w:szCs w:val="22"/>
         </w:rPr>
         <w:lastRenderedPageBreak/>
-        <w:t>niet als een afscheid van politiek engagement, maar als een fase waarin Habermas zijn theoretische grondslagen verdiepte. </w:t>
+        <w:t>opgevat. Het gaat om de vraag of de maatschappelijke omstandigheden waarin een onafhankelijke filosoof gedurende tientallen jaren het publieke debat kon beïnvloeden, nog bestaan.</w:t>
+      </w:r>
+      <w:r>
+        <w:rPr>
+          <w:rFonts w:ascii="Courier New" w:hAnsi="Courier New" w:cs="Courier New"/>
+          <w:sz w:val="22"/>
+          <w:szCs w:val="22"/>
+        </w:rPr>
+        <w:t xml:space="preserve"> </w:t>
+      </w:r>
+      <w:r>
+        <w:rPr>
+          <w:rFonts w:ascii="Courier New" w:hAnsi="Courier New" w:cs="Courier New"/>
+          <w:sz w:val="22"/>
+          <w:szCs w:val="22"/>
+        </w:rPr>
+        <w:t>De betekenis van Habermas ligt volgens Verovšek uiteindelijk niet alleen in zijn filosofische publicaties, maar ook in zijn voorbeeld van intellectuele verantwoordelijkheid: deelnemen aan het publieke debat, kritisch blijven tegenover politieke macht en de democratische discussie verdedigen. </w:t>
       </w:r>
     </w:p>
     <w:p>
@@ -987,25 +3389,7 @@
           <w:sz w:val="22"/>
           <w:szCs w:val="22"/>
         </w:rPr>
-        <w:t>Vanaf de jaren tachtig nam Habermas opnieuw een prominente plaats in het Duitse publieke debat in. Vooral zijn deelname aan de zogenoemde Historikerstreit van 1986 maakte hem opnieuw tot een nationaal invloedrijke intellectueel.</w:t>
-      </w:r>
-    </w:p>
-    <w:p>
-      <w:pPr>
-        <w:spacing w:line="360" w:lineRule="auto"/>
-        <w:rPr>
-          <w:rFonts w:ascii="Courier New" w:hAnsi="Courier New" w:cs="Courier New"/>
-          <w:sz w:val="22"/>
-          <w:szCs w:val="22"/>
-        </w:rPr>
-      </w:pPr>
-      <w:r>
-        <w:rPr>
-          <w:rFonts w:ascii="Courier New" w:hAnsi="Courier New" w:cs="Courier New"/>
-          <w:sz w:val="22"/>
-          <w:szCs w:val="22"/>
-        </w:rPr>
-        <w:t>In deze discussie verzette Habermas zich tegen historici die</w:t>
+        <w:t>De belangrijkste bijdrage van Verovšeks boek is dat het Habermas presenteert als een denker bij wie filosofie en maatschappelijk engagement voortdurend op elkaar betrokken waren. Zijn theoretische werk kan niet volledig worden begrepen zonder zijn politieke interventies, terwijl zijn politieke standpunten mede voortkwamen uit zijn filosofische overtuigingen.</w:t>
       </w:r>
       <w:r>
         <w:rPr>
@@ -1021,7 +3405,7 @@
           <w:sz w:val="22"/>
           <w:szCs w:val="22"/>
         </w:rPr>
-        <w:t>volgens hem de bijzondere betekenis van de</w:t>
+        <w:t>Het boek maakt bovendien duidelijk dat kritisch denken niet noodzakelijk betekent dat intellectuelen zelf politieke macht moeten nastreven. Hun bijdrage kan juist bestaan uit het kritisch onderzoeken van bestaande machtsverhoudingen, het verduidelijken van publieke problemen en het stimuleren van democratische meningsvorming.</w:t>
       </w:r>
       <w:r>
         <w:rPr>
@@ -1037,87 +3421,23 @@
           <w:sz w:val="22"/>
           <w:szCs w:val="22"/>
         </w:rPr>
-        <w:t>nationaal</w:t>
-      </w:r>
-      <w:r>
-        <w:rPr>
-          <w:rFonts w:ascii="Courier New" w:hAnsi="Courier New" w:cs="Courier New"/>
-          <w:sz w:val="22"/>
-          <w:szCs w:val="22"/>
-        </w:rPr>
-        <w:t>-</w:t>
-      </w:r>
-      <w:r>
-        <w:rPr>
-          <w:rFonts w:ascii="Courier New" w:hAnsi="Courier New" w:cs="Courier New"/>
-          <w:sz w:val="22"/>
-          <w:szCs w:val="22"/>
-        </w:rPr>
-        <w:t>socialistische misdaden relativeerden door deze te vergelijken met andere historische vormen van massaal geweld.</w:t>
-      </w:r>
-      <w:r>
-        <w:rPr>
-          <w:rFonts w:ascii="Courier New" w:hAnsi="Courier New" w:cs="Courier New"/>
-          <w:sz w:val="22"/>
-          <w:szCs w:val="22"/>
-        </w:rPr>
-        <w:t xml:space="preserve"> </w:t>
-      </w:r>
-      <w:r>
-        <w:rPr>
-          <w:rFonts w:ascii="Courier New" w:hAnsi="Courier New" w:cs="Courier New"/>
-          <w:sz w:val="22"/>
-          <w:szCs w:val="22"/>
-        </w:rPr>
-        <w:t>Voor Habermas ging het niet uitsluitend om historische interpretaties. De discussie raakte aan de politieke identiteit van de Bondsrepubliek. Een democratisch Duitsland moest volgens hem zijn legitimiteit niet ontlenen aan nationale trots of historische continuïteit, maar aan de beginselen van de democratische rechtsstaat.</w:t>
-      </w:r>
-      <w:r>
-        <w:rPr>
-          <w:rFonts w:ascii="Courier New" w:hAnsi="Courier New" w:cs="Courier New"/>
-          <w:sz w:val="22"/>
-          <w:szCs w:val="22"/>
-        </w:rPr>
-        <w:t xml:space="preserve"> </w:t>
-      </w:r>
-      <w:r>
-        <w:rPr>
-          <w:rFonts w:ascii="Courier New" w:hAnsi="Courier New" w:cs="Courier New"/>
-          <w:sz w:val="22"/>
-          <w:szCs w:val="22"/>
-        </w:rPr>
-        <w:t>Hiermee hangt zijn begrip constitutioneel patriottisme samen: politieke verbondenheid behoort in de eerste plaats gebaseerd te zijn op gedeelde democratische en constitutionele waarden, niet op etnische of culturele homogeniteit.</w:t>
-      </w:r>
-      <w:r>
-        <w:rPr>
-          <w:rFonts w:ascii="Courier New" w:hAnsi="Courier New" w:cs="Courier New"/>
-          <w:sz w:val="22"/>
-          <w:szCs w:val="22"/>
-        </w:rPr>
-        <w:t xml:space="preserve"> </w:t>
-      </w:r>
-      <w:r>
-        <w:rPr>
-          <w:rFonts w:ascii="Courier New" w:hAnsi="Courier New" w:cs="Courier New"/>
-          <w:sz w:val="22"/>
-          <w:szCs w:val="22"/>
-        </w:rPr>
-        <w:t>Ook tijdens de Duitse hereniging in 1989–1990 verdedigde Habermas het belang van democratische legitimiteit en publieke discussie. Hij waarschuwde voor een herenigingsproces waarin nationale sentimenten en bestuurlijke besluitvorming de overhand zouden krijgen.</w:t>
-      </w:r>
-      <w:r>
-        <w:rPr>
-          <w:rFonts w:ascii="Courier New" w:hAnsi="Courier New" w:cs="Courier New"/>
-          <w:sz w:val="22"/>
-          <w:szCs w:val="22"/>
-        </w:rPr>
-        <w:t xml:space="preserve"> </w:t>
-      </w:r>
-      <w:r>
-        <w:rPr>
-          <w:rFonts w:ascii="Courier New" w:hAnsi="Courier New" w:cs="Courier New"/>
-          <w:sz w:val="22"/>
-          <w:szCs w:val="22"/>
-        </w:rPr>
-        <w:t>Verovšek laat zien dat Habermas' publieke interventies steeds opnieuw voortkwamen uit zijn bezorgdheid over de democratische kwaliteit van politieke besluitvorming.</w:t>
+        <w:t>Daarbij blijft een spanning bestaan tussen betrokkenheid</w:t>
+      </w:r>
+      <w:r>
+        <w:rPr>
+          <w:rFonts w:ascii="Courier New" w:hAnsi="Courier New" w:cs="Courier New"/>
+          <w:sz w:val="22"/>
+          <w:szCs w:val="22"/>
+        </w:rPr>
+        <w:t xml:space="preserve"> en onafhankelijkheid, deelname en distantie</w:t>
+      </w:r>
+      <w:r>
+        <w:rPr>
+          <w:rFonts w:ascii="Courier New" w:hAnsi="Courier New" w:cs="Courier New"/>
+          <w:sz w:val="22"/>
+          <w:szCs w:val="22"/>
+        </w:rPr>
+        <w:t>. Wie zich intensief mengt in politieke discussies, loopt het risico onderdeel te worden van de politieke strijd die hij kritisch wil onderzoeken. Habermas wist die spanning niet altijd op te lossen. Verovšek maakt juist deze wisselwerking tot een belangrijk onderwerp van zijn analyse.</w:t>
       </w:r>
     </w:p>
     <w:p>
@@ -1136,7 +3456,7 @@
           <w:sz w:val="22"/>
           <w:szCs w:val="22"/>
         </w:rPr>
-        <w:t>Na de val van de Berlijnse Muur verschoof Habermas' aandacht geleidelijk van de Duitse nationale politiek naar de toekomst van Europa. Deze ontwikkeling vormt een belangrijk onderdeel van Verovšeks boek.</w:t>
+        <w:t>Uiteindelijk draait het boek om een fundamentele vraag: welke verantwoordelijkheid dragen intellectuelen voor de democratische samenleving waarin zij leven? Habermas' antwoord was dat filosofen niet boven de democratie staan, maar er als kritische burgers aan moeten deelnemen. Hun gezag berust niet op hun academische positie, maar op de overtuigingskracht van hun argumenten.</w:t>
       </w:r>
       <w:r>
         <w:rPr>
@@ -1152,48 +3472,7 @@
           <w:sz w:val="22"/>
           <w:szCs w:val="22"/>
         </w:rPr>
-        <w:t>Habermas beschouwde de Europese integratie als een historische mogelijkheid om nationale tegenstellingen te overstijgen en democratische samenwerking op internationaal niveau te ontwikkelen.</w:t>
-      </w:r>
-      <w:r>
-        <w:rPr>
-          <w:rFonts w:ascii="Courier New" w:hAnsi="Courier New" w:cs="Courier New"/>
-          <w:sz w:val="22"/>
-          <w:szCs w:val="22"/>
-        </w:rPr>
-        <w:t xml:space="preserve"> </w:t>
-      </w:r>
-      <w:r>
-        <w:rPr>
-          <w:rFonts w:ascii="Courier New" w:hAnsi="Courier New" w:cs="Courier New"/>
-          <w:sz w:val="22"/>
-          <w:szCs w:val="22"/>
-        </w:rPr>
-        <w:t>Tegelijkertijd bekritiseerde hij de beperkte democratische legitimiteit van Europese instituties. Economische integratie was volgens hem onvoldoende wanneer zij niet gepaard ging met politieke democratisering en een Europese publieke sfeer.</w:t>
-      </w:r>
-      <w:r>
-        <w:rPr>
-          <w:rFonts w:ascii="Courier New" w:hAnsi="Courier New" w:cs="Courier New"/>
-          <w:sz w:val="22"/>
-          <w:szCs w:val="22"/>
-        </w:rPr>
-        <w:t xml:space="preserve"> </w:t>
-      </w:r>
-      <w:r>
-        <w:rPr>
-          <w:rFonts w:ascii="Courier New" w:hAnsi="Courier New" w:cs="Courier New"/>
-          <w:sz w:val="22"/>
-          <w:szCs w:val="22"/>
-        </w:rPr>
-        <w:t xml:space="preserve">Zijn pleidooi voor een Europese constitutie en een sterker democratisch Europa vloeide rechtstreeks voort uit zijn filosofische overtuiging </w:t>
-      </w:r>
-      <w:r>
-        <w:rPr>
-          <w:rFonts w:ascii="Courier New" w:hAnsi="Courier New" w:cs="Courier New"/>
-          <w:sz w:val="22"/>
-          <w:szCs w:val="22"/>
-        </w:rPr>
-        <w:lastRenderedPageBreak/>
-        <w:t>dat politieke macht gerechtvaardigd moet kunnen worden tegenover degenen die eraan onderworpen zijn.</w:t>
+        <w:t>Verovšek laat daarmee zien dat Habermas' levenslange verdediging van democratische openbaarheid zowel een filosofisch project als een maatschappelijke praktijk was. De publieke intellectueel is in deze benadering niet degene die de samenleving vertelt wat zij moet denken, maar degene die helpt de voorwaarden in stand te houden waaronder burgers zelfstandig, kritisch en gezamenlijk kunnen oordelen.</w:t>
       </w:r>
     </w:p>
     <w:p>
@@ -1205,401 +3484,6 @@
           <w:szCs w:val="22"/>
         </w:rPr>
       </w:pPr>
-      <w:r>
-        <w:rPr>
-          <w:rFonts w:ascii="Courier New" w:hAnsi="Courier New" w:cs="Courier New"/>
-          <w:sz w:val="22"/>
-          <w:szCs w:val="22"/>
-        </w:rPr>
-        <w:t>Verovšek benadrukt dat Habermas hiermee een nieuwe fase in zijn publieke optreden bereikte. Zijn politieke horizon werd internationaler, terwijl zijn fundamentele uitgangspunten grotendeels dezelfde bleven.</w:t>
-      </w:r>
-      <w:r>
-        <w:rPr>
-          <w:rFonts w:ascii="Courier New" w:hAnsi="Courier New" w:cs="Courier New"/>
-          <w:sz w:val="22"/>
-          <w:szCs w:val="22"/>
-        </w:rPr>
-        <w:t xml:space="preserve"> </w:t>
-      </w:r>
-      <w:r>
-        <w:rPr>
-          <w:rFonts w:ascii="Courier New" w:hAnsi="Courier New" w:cs="Courier New"/>
-          <w:sz w:val="22"/>
-          <w:szCs w:val="22"/>
-        </w:rPr>
-        <w:t>Er ontstond echter ook een spanning. Habermas had altijd verdedigd dat intellectuelen afstand moesten bewaren tot de politieke macht. Zijn betrokkenheid bij de Europese integratie bracht hem steeds dichter bij concrete politieke projecten en politici.</w:t>
-      </w:r>
-      <w:r>
-        <w:rPr>
-          <w:rFonts w:ascii="Courier New" w:hAnsi="Courier New" w:cs="Courier New"/>
-          <w:sz w:val="22"/>
-          <w:szCs w:val="22"/>
-        </w:rPr>
-        <w:t xml:space="preserve"> </w:t>
-      </w:r>
-      <w:r>
-        <w:rPr>
-          <w:rFonts w:ascii="Courier New" w:hAnsi="Courier New" w:cs="Courier New"/>
-          <w:sz w:val="22"/>
-          <w:szCs w:val="22"/>
-        </w:rPr>
-        <w:t>Volgens Verovšek werd deze spanning vooral zichtbaar toen Habermas zich nadrukkelijker verbond aan het Europese integratieproject. </w:t>
-      </w:r>
-    </w:p>
-    <w:p>
-      <w:pPr>
-        <w:spacing w:line="360" w:lineRule="auto"/>
-        <w:ind w:firstLine="720"/>
-        <w:rPr>
-          <w:rFonts w:ascii="Courier New" w:hAnsi="Courier New" w:cs="Courier New"/>
-          <w:sz w:val="22"/>
-          <w:szCs w:val="22"/>
-        </w:rPr>
-      </w:pPr>
-      <w:r>
-        <w:rPr>
-          <w:rFonts w:ascii="Courier New" w:hAnsi="Courier New" w:cs="Courier New"/>
-          <w:sz w:val="22"/>
-          <w:szCs w:val="22"/>
-        </w:rPr>
-        <w:t>De Europese schuldencrisis na 2008 vormde een nieuwe aanleiding voor Habermas om zich intensief in het politieke debat te mengen.</w:t>
-      </w:r>
-      <w:r>
-        <w:rPr>
-          <w:rFonts w:ascii="Courier New" w:hAnsi="Courier New" w:cs="Courier New"/>
-          <w:sz w:val="22"/>
-          <w:szCs w:val="22"/>
-        </w:rPr>
-        <w:t xml:space="preserve"> </w:t>
-      </w:r>
-      <w:r>
-        <w:rPr>
-          <w:rFonts w:ascii="Courier New" w:hAnsi="Courier New" w:cs="Courier New"/>
-          <w:sz w:val="22"/>
-          <w:szCs w:val="22"/>
-        </w:rPr>
-        <w:t>Hij maakte zich zorgen over de toenemende invloed van financiële markten, technocratische instituties en economische belangen op democratische besluitvorming.</w:t>
-      </w:r>
-      <w:r>
-        <w:rPr>
-          <w:rFonts w:ascii="Courier New" w:hAnsi="Courier New" w:cs="Courier New"/>
-          <w:sz w:val="22"/>
-          <w:szCs w:val="22"/>
-        </w:rPr>
-        <w:t xml:space="preserve"> </w:t>
-      </w:r>
-      <w:r>
-        <w:rPr>
-          <w:rFonts w:ascii="Courier New" w:hAnsi="Courier New" w:cs="Courier New"/>
-          <w:sz w:val="22"/>
-          <w:szCs w:val="22"/>
-        </w:rPr>
-        <w:t>Deze ontwikkeling sloot aan bij zijn oudere theorie over de kolonisering van de leefwereld. Daarmee bedoelde hij dat economische en bureaucratische systemen steeds verder doordringen in maatschappelijke verhoudingen die eigenlijk door communicatie, solidariteit en onderling begrip zouden moeten worden gereguleerd.</w:t>
-      </w:r>
-      <w:r>
-        <w:rPr>
-          <w:rFonts w:ascii="Courier New" w:hAnsi="Courier New" w:cs="Courier New"/>
-          <w:sz w:val="22"/>
-          <w:szCs w:val="22"/>
-        </w:rPr>
-        <w:t xml:space="preserve"> </w:t>
-      </w:r>
-      <w:r>
-        <w:rPr>
-          <w:rFonts w:ascii="Courier New" w:hAnsi="Courier New" w:cs="Courier New"/>
-          <w:sz w:val="22"/>
-          <w:szCs w:val="22"/>
-        </w:rPr>
-        <w:t>In de Europese politiek zag Habermas het gevaar dat economische noodzakelijkheden werden voorgesteld als onvermijdelijke feiten waarover burgers nauwelijks nog democratische zeggenschap hadden.</w:t>
-      </w:r>
-      <w:r>
-        <w:rPr>
-          <w:rFonts w:ascii="Courier New" w:hAnsi="Courier New" w:cs="Courier New"/>
-          <w:sz w:val="22"/>
-          <w:szCs w:val="22"/>
-        </w:rPr>
-        <w:t xml:space="preserve"> </w:t>
-      </w:r>
-      <w:r>
-        <w:rPr>
-          <w:rFonts w:ascii="Courier New" w:hAnsi="Courier New" w:cs="Courier New"/>
-          <w:sz w:val="22"/>
-          <w:szCs w:val="22"/>
-        </w:rPr>
-        <w:t>Zijn kritiek op het crisisbeleid was daarom niet uitsluitend economisch, maar vooral democratisch van aard. Politieke beslissingen moesten volgens hem onderwerp blijven van openbare discussie en democratische verantwoording.</w:t>
-      </w:r>
-      <w:r>
-        <w:rPr>
-          <w:rFonts w:ascii="Courier New" w:hAnsi="Courier New" w:cs="Courier New"/>
-          <w:sz w:val="22"/>
-          <w:szCs w:val="22"/>
-        </w:rPr>
-        <w:t xml:space="preserve"> </w:t>
-      </w:r>
-      <w:r>
-        <w:rPr>
-          <w:rFonts w:ascii="Courier New" w:hAnsi="Courier New" w:cs="Courier New"/>
-          <w:sz w:val="22"/>
-          <w:szCs w:val="22"/>
-        </w:rPr>
-        <w:t>Verovšek signaleert hier een opvallende ontwikkeling. Terwijl Habermas theoretisch vasthield aan het onderscheid tussen filosofische reflectie en politieke besluitvorming, trad hij in de praktijk soms op als een uitgesproken pleitbezorger van Europese politieke hervormingen. Hij verscheen zelfs samen met politici op publieke bijeenkomsten en fungeerde in zekere zin als informeel adviseur.</w:t>
-      </w:r>
-    </w:p>
-    <w:p>
-      <w:pPr>
-        <w:spacing w:line="360" w:lineRule="auto"/>
-        <w:rPr>
-          <w:rFonts w:ascii="Courier New" w:hAnsi="Courier New" w:cs="Courier New"/>
-          <w:sz w:val="22"/>
-          <w:szCs w:val="22"/>
-        </w:rPr>
-      </w:pPr>
-      <w:r>
-        <w:rPr>
-          <w:rFonts w:ascii="Courier New" w:hAnsi="Courier New" w:cs="Courier New"/>
-          <w:sz w:val="22"/>
-          <w:szCs w:val="22"/>
-        </w:rPr>
-        <w:t>Daarmee kwam zijn eigen publieke optreden dichter bij de directe politieke beïnvloeding waarvoor hij eerder had gewaarschuwd.</w:t>
-      </w:r>
-    </w:p>
-    <w:p>
-      <w:pPr>
-        <w:spacing w:line="360" w:lineRule="auto"/>
-        <w:rPr>
-          <w:rFonts w:ascii="Courier New" w:hAnsi="Courier New" w:cs="Courier New"/>
-          <w:b/>
-          <w:bCs/>
-          <w:sz w:val="22"/>
-          <w:szCs w:val="22"/>
-        </w:rPr>
-      </w:pPr>
-    </w:p>
-    <w:p>
-      <w:pPr>
-        <w:spacing w:line="360" w:lineRule="auto"/>
-        <w:rPr>
-          <w:rFonts w:ascii="Courier New" w:hAnsi="Courier New" w:cs="Courier New"/>
-          <w:b/>
-          <w:bCs/>
-          <w:sz w:val="22"/>
-          <w:szCs w:val="22"/>
-        </w:rPr>
-      </w:pPr>
-    </w:p>
-    <w:p>
-      <w:pPr>
-        <w:spacing w:line="360" w:lineRule="auto"/>
-        <w:rPr>
-          <w:rFonts w:ascii="Courier New" w:hAnsi="Courier New" w:cs="Courier New"/>
-          <w:sz w:val="22"/>
-          <w:szCs w:val="22"/>
-        </w:rPr>
-      </w:pPr>
-      <w:r>
-        <w:rPr>
-          <w:rFonts w:ascii="Courier New" w:hAnsi="Courier New" w:cs="Courier New"/>
-          <w:sz w:val="22"/>
-          <w:szCs w:val="22"/>
-        </w:rPr>
-        <w:t>In het slothoofdstuk bespreekt Verovšek Habermas' publieke optreden tussen 2021 en 2025 en stelt hij de vraag of Habermas misschien een van de laatste vertegenwoordigers was van een bepaald type publieke intellectueel.</w:t>
-      </w:r>
-      <w:r>
-        <w:rPr>
-          <w:rFonts w:ascii="Courier New" w:hAnsi="Courier New" w:cs="Courier New"/>
-          <w:sz w:val="22"/>
-          <w:szCs w:val="22"/>
-        </w:rPr>
-        <w:t xml:space="preserve"> </w:t>
-      </w:r>
-      <w:r>
-        <w:rPr>
-          <w:rFonts w:ascii="Courier New" w:hAnsi="Courier New" w:cs="Courier New"/>
-          <w:sz w:val="22"/>
-          <w:szCs w:val="22"/>
-        </w:rPr>
-        <w:t>Habermas behoorde tot een generatie waarin gezaghebbende denkers via kranten, tijdschriften en publieke lezingen langdurig invloed konden uitoefenen op nationale politieke discussies.</w:t>
-      </w:r>
-      <w:r>
-        <w:rPr>
-          <w:rFonts w:ascii="Courier New" w:hAnsi="Courier New" w:cs="Courier New"/>
-          <w:sz w:val="22"/>
-          <w:szCs w:val="22"/>
-        </w:rPr>
-        <w:t xml:space="preserve"> </w:t>
-      </w:r>
-      <w:r>
-        <w:rPr>
-          <w:rFonts w:ascii="Courier New" w:hAnsi="Courier New" w:cs="Courier New"/>
-          <w:sz w:val="22"/>
-          <w:szCs w:val="22"/>
-        </w:rPr>
-        <w:t>De hedendaagse publieke sfeer is ingrijpend veranderd. Sociale media, digitale platforms, politieke polarisatie en de versnippering van het medialandschap hebben de voorwaarden voor publieke meningsvorming veranderd.</w:t>
-      </w:r>
-    </w:p>
-    <w:p>
-      <w:pPr>
-        <w:spacing w:line="360" w:lineRule="auto"/>
-        <w:rPr>
-          <w:rFonts w:ascii="Courier New" w:hAnsi="Courier New" w:cs="Courier New"/>
-          <w:sz w:val="22"/>
-          <w:szCs w:val="22"/>
-        </w:rPr>
-      </w:pPr>
-      <w:r>
-        <w:rPr>
-          <w:rFonts w:ascii="Courier New" w:hAnsi="Courier New" w:cs="Courier New"/>
-          <w:sz w:val="22"/>
-          <w:szCs w:val="22"/>
-        </w:rPr>
-        <w:t>Verovšek onderzoekt wat deze veranderingen betekenen voor de mogelijkheid van een intellectueel om een breed publiek te bereiken. Ook de discussies rond de oorlog in Oekraïne en het conflict in Gaza laten zien hoe moeilijk het is geworden om complexe politieke standpunten in een gepolariseerde publieke omgeving over te brengen.</w:t>
-      </w:r>
-    </w:p>
-    <w:p>
-      <w:pPr>
-        <w:spacing w:line="360" w:lineRule="auto"/>
-        <w:ind w:firstLine="720"/>
-        <w:rPr>
-          <w:rFonts w:ascii="Courier New" w:hAnsi="Courier New" w:cs="Courier New"/>
-          <w:sz w:val="22"/>
-          <w:szCs w:val="22"/>
-        </w:rPr>
-      </w:pPr>
-      <w:r>
-        <w:rPr>
-          <w:rFonts w:ascii="Courier New" w:hAnsi="Courier New" w:cs="Courier New"/>
-          <w:sz w:val="22"/>
-          <w:szCs w:val="22"/>
-        </w:rPr>
-        <w:t>De vraag of Habermas de laatste publieke intellectueel was, moet daarom niet letterlijk worden opgevat. Het gaat om de vraag of de maatschappelijke omstandigheden waarin een onafhankelijke filosoof gedurende tientallen jaren het publieke debat kon beïnvloeden, nog bestaan.</w:t>
-      </w:r>
-      <w:r>
-        <w:rPr>
-          <w:rFonts w:ascii="Courier New" w:hAnsi="Courier New" w:cs="Courier New"/>
-          <w:sz w:val="22"/>
-          <w:szCs w:val="22"/>
-        </w:rPr>
-        <w:t xml:space="preserve"> </w:t>
-      </w:r>
-      <w:r>
-        <w:rPr>
-          <w:rFonts w:ascii="Courier New" w:hAnsi="Courier New" w:cs="Courier New"/>
-          <w:sz w:val="22"/>
-          <w:szCs w:val="22"/>
-        </w:rPr>
-        <w:t>De betekenis van Habermas ligt volgens Verovšek uiteindelijk niet alleen in zijn filosofische publicaties, maar ook in zijn voorbeeld van intellectuele verantwoordelijkheid: deelnemen aan het publieke debat, kritisch blijven tegenover politieke macht en de democratische discussie verdedigen. </w:t>
-      </w:r>
-    </w:p>
-    <w:p>
-      <w:pPr>
-        <w:spacing w:line="360" w:lineRule="auto"/>
-        <w:ind w:firstLine="720"/>
-        <w:rPr>
-          <w:rFonts w:ascii="Courier New" w:hAnsi="Courier New" w:cs="Courier New"/>
-          <w:sz w:val="22"/>
-          <w:szCs w:val="22"/>
-        </w:rPr>
-      </w:pPr>
-      <w:r>
-        <w:rPr>
-          <w:rFonts w:ascii="Courier New" w:hAnsi="Courier New" w:cs="Courier New"/>
-          <w:sz w:val="22"/>
-          <w:szCs w:val="22"/>
-        </w:rPr>
-        <w:t>De belangrijkste bijdrage van Verovšeks boek is dat het Habermas presenteert als een denker bij wie filosofie en maatschappelijk engagement voortdurend op elkaar betrokken waren. Zijn theoretische werk kan niet volledig worden begrepen zonder zijn politieke interventies, terwijl zijn politieke standpunten mede voortkwamen uit zijn filosofische overtuigingen.</w:t>
-      </w:r>
-      <w:r>
-        <w:rPr>
-          <w:rFonts w:ascii="Courier New" w:hAnsi="Courier New" w:cs="Courier New"/>
-          <w:sz w:val="22"/>
-          <w:szCs w:val="22"/>
-        </w:rPr>
-        <w:t xml:space="preserve"> </w:t>
-      </w:r>
-      <w:r>
-        <w:rPr>
-          <w:rFonts w:ascii="Courier New" w:hAnsi="Courier New" w:cs="Courier New"/>
-          <w:sz w:val="22"/>
-          <w:szCs w:val="22"/>
-        </w:rPr>
-        <w:t>Het boek maakt bovendien duidelijk dat kritisch denken niet noodzakelijk betekent dat intellectuelen zelf politieke macht moeten nastreven. Hun bijdrage kan juist bestaan uit het kritisch onderzoeken van bestaande machtsverhoudingen, het verduidelijken van publieke problemen en het stimuleren van democratische meningsvorming.</w:t>
-      </w:r>
-    </w:p>
-    <w:p>
-      <w:pPr>
-        <w:spacing w:line="360" w:lineRule="auto"/>
-        <w:ind w:firstLine="720"/>
-        <w:rPr>
-          <w:rFonts w:ascii="Courier New" w:hAnsi="Courier New" w:cs="Courier New"/>
-          <w:sz w:val="22"/>
-          <w:szCs w:val="22"/>
-        </w:rPr>
-      </w:pPr>
-      <w:r>
-        <w:rPr>
-          <w:rFonts w:ascii="Courier New" w:hAnsi="Courier New" w:cs="Courier New"/>
-          <w:sz w:val="22"/>
-          <w:szCs w:val="22"/>
-        </w:rPr>
-        <w:lastRenderedPageBreak/>
-        <w:t>Daarbij blijft een spanning bestaan tussen onafhankelijkheid en betrokkenheid. Wie zich intensief mengt in politieke discussies, loopt het risico onderdeel te worden van de politieke strijd die hij kritisch wil onderzoeken. Habermas wist die spanning niet altijd op te lossen. Verovšek maakt juist deze wisselwerking tot een belangrijk onderwerp van zijn analyse.</w:t>
-      </w:r>
-    </w:p>
-    <w:p>
-      <w:pPr>
-        <w:spacing w:line="360" w:lineRule="auto"/>
-        <w:rPr>
-          <w:rFonts w:ascii="Courier New" w:hAnsi="Courier New" w:cs="Courier New"/>
-          <w:sz w:val="22"/>
-          <w:szCs w:val="22"/>
-        </w:rPr>
-      </w:pPr>
-      <w:r>
-        <w:rPr>
-          <w:rFonts w:ascii="Courier New" w:hAnsi="Courier New" w:cs="Courier New"/>
-          <w:sz w:val="22"/>
-          <w:szCs w:val="22"/>
-        </w:rPr>
-        <w:t>De filosoof Max Pensky benadrukt in zijn bespreking voor Notre Dame Philosophical Reviews hoe grondig Verovšek de lange publieke loopbaan van Habermas reconstrueert. Ook andere recensenten wijzen op de spanning tussen Habermas' theoretische uitgangspunten en zijn concrete politieke interventies. </w:t>
-      </w:r>
-    </w:p>
-    <w:p>
-      <w:pPr>
-        <w:spacing w:line="360" w:lineRule="auto"/>
-        <w:ind w:firstLine="720"/>
-        <w:rPr>
-          <w:rFonts w:ascii="Courier New" w:hAnsi="Courier New" w:cs="Courier New"/>
-          <w:sz w:val="22"/>
-          <w:szCs w:val="22"/>
-        </w:rPr>
-      </w:pPr>
-      <w:r>
-        <w:rPr>
-          <w:rFonts w:ascii="Courier New" w:hAnsi="Courier New" w:cs="Courier New"/>
-          <w:sz w:val="22"/>
-          <w:szCs w:val="22"/>
-        </w:rPr>
-        <w:t>Uiteindelijk draait het boek om een fundamentele vraag: welke verantwoordelijkheid dragen intellectuelen voor de democratische samenleving waarin zij leven? Habermas' antwoord was dat filosofen niet boven de democratie staan, maar er als kritische burgers aan moeten deelnemen. Hun gezag berust niet op hun academische positie, maar op de overtuigingskracht van hun argumenten.</w:t>
-      </w:r>
-    </w:p>
-    <w:p>
-      <w:pPr>
-        <w:spacing w:line="360" w:lineRule="auto"/>
-        <w:ind w:firstLine="720"/>
-        <w:rPr>
-          <w:rFonts w:ascii="Courier New" w:hAnsi="Courier New" w:cs="Courier New"/>
-          <w:sz w:val="22"/>
-          <w:szCs w:val="22"/>
-        </w:rPr>
-      </w:pPr>
-      <w:r>
-        <w:rPr>
-          <w:rFonts w:ascii="Courier New" w:hAnsi="Courier New" w:cs="Courier New"/>
-          <w:sz w:val="22"/>
-          <w:szCs w:val="22"/>
-        </w:rPr>
-        <w:t>Verovšek laat daarmee zien dat Habermas' levenslange verdediging van democratische openbaarheid zowel een filosofisch project als een maatschappelijke praktijk was. De publieke intellectueel is in deze benadering niet degene die de samenleving vertelt wat zij moet denken, maar degene die helpt de voorwaarden in stand te houden waaronder burgers zelfstandig, kritisch en gezamenlijk kunnen oordelen.</w:t>
-      </w:r>
     </w:p>
     <w:p>
       <w:pPr>
@@ -2391,6 +4275,7 @@
   <w:style w:type="character" w:default="1" w:styleId="DefaultParagraphFont">
     <w:name w:val="Default Paragraph Font"/>
     <w:uiPriority w:val="1"/>
+    <w:semiHidden/>
     <w:unhideWhenUsed/>
   </w:style>
   <w:style w:type="table" w:default="1" w:styleId="TableNormal">

</xml_diff>

<commit_message>
26-10-25, Deelname en distantie
</commit_message>
<xml_diff>
--- a/BlogsWord/Deelnameendistantie.docx
+++ b/BlogsWord/Deelnameendistantie.docx
@@ -218,7 +218,31 @@
           <w:sz w:val="22"/>
           <w:szCs w:val="22"/>
         </w:rPr>
-        <w:t xml:space="preserve">Daarnaast mengde hij zich sinds de jaren vijftig in allerlei </w:t>
+        <w:t>Habermas</w:t>
+      </w:r>
+      <w:r>
+        <w:rPr>
+          <w:rFonts w:ascii="Courier New" w:hAnsi="Courier New" w:cs="Courier New"/>
+          <w:sz w:val="22"/>
+          <w:szCs w:val="22"/>
+        </w:rPr>
+        <w:t xml:space="preserve"> mengde hij zich </w:t>
+      </w:r>
+      <w:r>
+        <w:rPr>
+          <w:rFonts w:ascii="Courier New" w:hAnsi="Courier New" w:cs="Courier New"/>
+          <w:sz w:val="22"/>
+          <w:szCs w:val="22"/>
+        </w:rPr>
+        <w:t xml:space="preserve">namelijk </w:t>
+      </w:r>
+      <w:r>
+        <w:rPr>
+          <w:rFonts w:ascii="Courier New" w:hAnsi="Courier New" w:cs="Courier New"/>
+          <w:sz w:val="22"/>
+          <w:szCs w:val="22"/>
+        </w:rPr>
+        <w:t xml:space="preserve">sinds de jaren vijftig in allerlei </w:t>
       </w:r>
       <w:r>
         <w:rPr>
@@ -286,7 +310,23 @@
           <w:sz w:val="22"/>
           <w:szCs w:val="22"/>
         </w:rPr>
-        <w:t>Habermas was niet alleen een van d</w:t>
+        <w:t xml:space="preserve">Habermas was </w:t>
+      </w:r>
+      <w:r>
+        <w:rPr>
+          <w:rFonts w:ascii="Courier New" w:hAnsi="Courier New" w:cs="Courier New"/>
+          <w:sz w:val="22"/>
+          <w:szCs w:val="22"/>
+        </w:rPr>
+        <w:t xml:space="preserve">uiteindelijk </w:t>
+      </w:r>
+      <w:r>
+        <w:rPr>
+          <w:rFonts w:ascii="Courier New" w:hAnsi="Courier New" w:cs="Courier New"/>
+          <w:sz w:val="22"/>
+          <w:szCs w:val="22"/>
+        </w:rPr>
+        <w:t>niet alleen d</w:t>
       </w:r>
       <w:r>
         <w:rPr>
@@ -350,7 +390,15 @@
           <w:sz w:val="22"/>
           <w:szCs w:val="22"/>
         </w:rPr>
-        <w:t>, waar dit boek over gaat</w:t>
+        <w:t xml:space="preserve">. Over dat laatste gaat </w:t>
+      </w:r>
+      <w:r>
+        <w:rPr>
+          <w:rFonts w:ascii="Courier New" w:hAnsi="Courier New" w:cs="Courier New"/>
+          <w:sz w:val="22"/>
+          <w:szCs w:val="22"/>
+        </w:rPr>
+        <w:t>dit boek</w:t>
       </w:r>
       <w:r>
         <w:rPr>
@@ -447,38 +495,6 @@
           <w:szCs w:val="22"/>
         </w:rPr>
         <w:t xml:space="preserve">. </w:t>
-      </w:r>
-      <w:r>
-        <w:rPr>
-          <w:rFonts w:ascii="Courier New" w:hAnsi="Courier New" w:cs="Courier New"/>
-          <w:sz w:val="22"/>
-          <w:szCs w:val="22"/>
-        </w:rPr>
-        <w:t xml:space="preserve">Het is volgens </w:t>
-      </w:r>
-      <w:r>
-        <w:rPr>
-          <w:rFonts w:ascii="Courier New" w:hAnsi="Courier New" w:cs="Courier New"/>
-          <w:sz w:val="22"/>
-          <w:szCs w:val="22"/>
-        </w:rPr>
-        <w:t>Verovšek</w:t>
-      </w:r>
-      <w:r>
-        <w:rPr>
-          <w:rFonts w:ascii="Courier New" w:hAnsi="Courier New" w:cs="Courier New"/>
-          <w:sz w:val="22"/>
-          <w:szCs w:val="22"/>
-        </w:rPr>
-        <w:t xml:space="preserve"> duidelijk. </w:t>
-      </w:r>
-      <w:r>
-        <w:rPr>
-          <w:rFonts w:ascii="Courier New" w:hAnsi="Courier New" w:cs="Courier New"/>
-          <w:sz w:val="22"/>
-          <w:szCs w:val="22"/>
-        </w:rPr>
-        <w:t xml:space="preserve">Habermas’ filosofische inzichten en zijn politieke interventies kunnen eigenlijk niet los van elkaar worden gezien. </w:t>
       </w:r>
       <w:r>
         <w:rPr>
@@ -593,7 +609,7 @@
           <w:sz w:val="22"/>
           <w:szCs w:val="22"/>
         </w:rPr>
-        <w:t xml:space="preserve"> en </w:t>
+        <w:t xml:space="preserve">en </w:t>
       </w:r>
       <w:r>
         <w:rPr>
@@ -609,7 +625,23 @@
           <w:sz w:val="22"/>
           <w:szCs w:val="22"/>
         </w:rPr>
-        <w:t xml:space="preserve">de relatie tussen </w:t>
+        <w:t xml:space="preserve">de </w:t>
+      </w:r>
+      <w:r>
+        <w:rPr>
+          <w:rFonts w:ascii="Courier New" w:hAnsi="Courier New" w:cs="Courier New"/>
+          <w:sz w:val="22"/>
+          <w:szCs w:val="22"/>
+        </w:rPr>
+        <w:t xml:space="preserve">ingewikkelde </w:t>
+      </w:r>
+      <w:r>
+        <w:rPr>
+          <w:rFonts w:ascii="Courier New" w:hAnsi="Courier New" w:cs="Courier New"/>
+          <w:sz w:val="22"/>
+          <w:szCs w:val="22"/>
+        </w:rPr>
+        <w:t xml:space="preserve">relatie tussen </w:t>
       </w:r>
       <w:r>
         <w:rPr>
@@ -633,7 +665,79 @@
           <w:sz w:val="22"/>
           <w:szCs w:val="22"/>
         </w:rPr>
-        <w:t xml:space="preserve">Politieke en maatschappelijke discussies waren </w:t>
+        <w:t>Politieke en maatschappelijke discussies waren voor</w:t>
+      </w:r>
+      <w:r>
+        <w:rPr>
+          <w:rFonts w:ascii="Courier New" w:hAnsi="Courier New" w:cs="Courier New"/>
+          <w:sz w:val="22"/>
+          <w:szCs w:val="22"/>
+        </w:rPr>
+        <w:t xml:space="preserve"> hem </w:t>
+      </w:r>
+      <w:r>
+        <w:rPr>
+          <w:rFonts w:ascii="Courier New" w:hAnsi="Courier New" w:cs="Courier New"/>
+          <w:sz w:val="22"/>
+          <w:szCs w:val="22"/>
+        </w:rPr>
+        <w:t>democratische gesprek</w:t>
+      </w:r>
+      <w:r>
+        <w:rPr>
+          <w:rFonts w:ascii="Courier New" w:hAnsi="Courier New" w:cs="Courier New"/>
+          <w:sz w:val="22"/>
+          <w:szCs w:val="22"/>
+        </w:rPr>
+        <w:t>ken</w:t>
+      </w:r>
+      <w:r>
+        <w:rPr>
+          <w:rFonts w:ascii="Courier New" w:hAnsi="Courier New" w:cs="Courier New"/>
+          <w:sz w:val="22"/>
+          <w:szCs w:val="22"/>
+        </w:rPr>
+        <w:t xml:space="preserve"> </w:t>
+      </w:r>
+      <w:r>
+        <w:rPr>
+          <w:rFonts w:ascii="Courier New" w:hAnsi="Courier New" w:cs="Courier New"/>
+          <w:sz w:val="22"/>
+          <w:szCs w:val="22"/>
+        </w:rPr>
+        <w:t>waaraan hij wilde meedoen</w:t>
+      </w:r>
+      <w:r>
+        <w:rPr>
+          <w:rFonts w:ascii="Courier New" w:hAnsi="Courier New" w:cs="Courier New"/>
+          <w:sz w:val="22"/>
+          <w:szCs w:val="22"/>
+        </w:rPr>
+        <w:t xml:space="preserve">, zonder daarbij overigens </w:t>
+      </w:r>
+      <w:r>
+        <w:rPr>
+          <w:rFonts w:ascii="Courier New" w:hAnsi="Courier New" w:cs="Courier New"/>
+          <w:sz w:val="22"/>
+          <w:szCs w:val="22"/>
+        </w:rPr>
+        <w:t xml:space="preserve">als hoogleraar filosofie </w:t>
+      </w:r>
+      <w:r>
+        <w:rPr>
+          <w:rFonts w:ascii="Courier New" w:hAnsi="Courier New" w:cs="Courier New"/>
+          <w:sz w:val="22"/>
+          <w:szCs w:val="22"/>
+        </w:rPr>
+        <w:t>a</w:t>
+      </w:r>
+      <w:r>
+        <w:rPr>
+          <w:rFonts w:ascii="Courier New" w:hAnsi="Courier New" w:cs="Courier New"/>
+          <w:sz w:val="22"/>
+          <w:szCs w:val="22"/>
+        </w:rPr>
+        <w:t xml:space="preserve">anspraak te </w:t>
       </w:r>
       <w:r>
         <w:rPr>
@@ -642,31 +746,15 @@
           <w:szCs w:val="22"/>
         </w:rPr>
         <w:lastRenderedPageBreak/>
-        <w:t>voor</w:t>
-      </w:r>
-      <w:r>
-        <w:rPr>
-          <w:rFonts w:ascii="Courier New" w:hAnsi="Courier New" w:cs="Courier New"/>
-          <w:sz w:val="22"/>
-          <w:szCs w:val="22"/>
-        </w:rPr>
-        <w:t xml:space="preserve"> hem </w:t>
-      </w:r>
-      <w:r>
-        <w:rPr>
-          <w:rFonts w:ascii="Courier New" w:hAnsi="Courier New" w:cs="Courier New"/>
-          <w:sz w:val="22"/>
-          <w:szCs w:val="22"/>
-        </w:rPr>
-        <w:t>democratische gesprek</w:t>
-      </w:r>
-      <w:r>
-        <w:rPr>
-          <w:rFonts w:ascii="Courier New" w:hAnsi="Courier New" w:cs="Courier New"/>
-          <w:sz w:val="22"/>
-          <w:szCs w:val="22"/>
-        </w:rPr>
-        <w:t>ken</w:t>
+        <w:t>willen maken</w:t>
+      </w:r>
+      <w:r>
+        <w:rPr>
+          <w:rFonts w:ascii="Courier New" w:hAnsi="Courier New" w:cs="Courier New"/>
+          <w:sz w:val="22"/>
+          <w:szCs w:val="22"/>
+        </w:rPr>
+        <w:t xml:space="preserve"> op een bevoorrechte positie.</w:t>
       </w:r>
       <w:r>
         <w:rPr>
@@ -682,47 +770,7 @@
           <w:sz w:val="22"/>
           <w:szCs w:val="22"/>
         </w:rPr>
-        <w:t>waaraan hij wilde meedoen</w:t>
-      </w:r>
-      <w:r>
-        <w:rPr>
-          <w:rFonts w:ascii="Courier New" w:hAnsi="Courier New" w:cs="Courier New"/>
-          <w:sz w:val="22"/>
-          <w:szCs w:val="22"/>
-        </w:rPr>
-        <w:t xml:space="preserve">, zonder daarbij overigens </w:t>
-      </w:r>
-      <w:r>
-        <w:rPr>
-          <w:rFonts w:ascii="Courier New" w:hAnsi="Courier New" w:cs="Courier New"/>
-          <w:sz w:val="22"/>
-          <w:szCs w:val="22"/>
-        </w:rPr>
-        <w:t xml:space="preserve">als hoogleraar filosofie </w:t>
-      </w:r>
-      <w:r>
-        <w:rPr>
-          <w:rFonts w:ascii="Courier New" w:hAnsi="Courier New" w:cs="Courier New"/>
-          <w:sz w:val="22"/>
-          <w:szCs w:val="22"/>
-        </w:rPr>
-        <w:t>a</w:t>
-      </w:r>
-      <w:r>
-        <w:rPr>
-          <w:rFonts w:ascii="Courier New" w:hAnsi="Courier New" w:cs="Courier New"/>
-          <w:sz w:val="22"/>
-          <w:szCs w:val="22"/>
-        </w:rPr>
-        <w:t>anspraak te willen maken</w:t>
-      </w:r>
-      <w:r>
-        <w:rPr>
-          <w:rFonts w:ascii="Courier New" w:hAnsi="Courier New" w:cs="Courier New"/>
-          <w:sz w:val="22"/>
-          <w:szCs w:val="22"/>
-        </w:rPr>
-        <w:t xml:space="preserve"> op een bevoorrechte positie.</w:t>
+        <w:t>Democratie</w:t>
       </w:r>
       <w:r>
         <w:rPr>
@@ -738,63 +786,135 @@
           <w:sz w:val="22"/>
           <w:szCs w:val="22"/>
         </w:rPr>
-        <w:t>Hij wilde</w:t>
-      </w:r>
-      <w:r>
-        <w:rPr>
-          <w:rFonts w:ascii="Courier New" w:hAnsi="Courier New" w:cs="Courier New"/>
-          <w:sz w:val="22"/>
-          <w:szCs w:val="22"/>
-        </w:rPr>
-        <w:t xml:space="preserve"> democratie te </w:t>
-      </w:r>
-      <w:r>
-        <w:rPr>
-          <w:rFonts w:ascii="Courier New" w:hAnsi="Courier New" w:cs="Courier New"/>
-          <w:sz w:val="22"/>
-          <w:szCs w:val="22"/>
-        </w:rPr>
-        <w:t>versterken door argumenten aan te dragen</w:t>
-      </w:r>
-      <w:r>
-        <w:rPr>
-          <w:rFonts w:ascii="Courier New" w:hAnsi="Courier New" w:cs="Courier New"/>
-          <w:sz w:val="22"/>
-          <w:szCs w:val="22"/>
-        </w:rPr>
-        <w:t xml:space="preserve"> zodat er betere beslissingen </w:t>
-      </w:r>
-      <w:r>
-        <w:rPr>
-          <w:rFonts w:ascii="Courier New" w:hAnsi="Courier New" w:cs="Courier New"/>
-          <w:sz w:val="22"/>
-          <w:szCs w:val="22"/>
-        </w:rPr>
-        <w:t xml:space="preserve">konden worden </w:t>
-      </w:r>
-      <w:r>
-        <w:rPr>
-          <w:rFonts w:ascii="Courier New" w:hAnsi="Courier New" w:cs="Courier New"/>
-          <w:sz w:val="22"/>
-          <w:szCs w:val="22"/>
-        </w:rPr>
-        <w:t xml:space="preserve">genomen </w:t>
-      </w:r>
-      <w:r>
-        <w:rPr>
-          <w:rFonts w:ascii="Courier New" w:hAnsi="Courier New" w:cs="Courier New"/>
-          <w:sz w:val="22"/>
-          <w:szCs w:val="22"/>
-        </w:rPr>
-        <w:t xml:space="preserve">in </w:t>
-      </w:r>
-      <w:r>
-        <w:rPr>
-          <w:rFonts w:ascii="Courier New" w:hAnsi="Courier New" w:cs="Courier New"/>
-          <w:sz w:val="22"/>
-          <w:szCs w:val="22"/>
-        </w:rPr>
-        <w:t>de samenleving.</w:t>
+        <w:t>heeft</w:t>
+      </w:r>
+      <w:r>
+        <w:rPr>
+          <w:rFonts w:ascii="Courier New" w:hAnsi="Courier New" w:cs="Courier New"/>
+          <w:sz w:val="22"/>
+          <w:szCs w:val="22"/>
+        </w:rPr>
+        <w:t xml:space="preserve"> maatschappelijke ruimten</w:t>
+      </w:r>
+      <w:r>
+        <w:rPr>
+          <w:rFonts w:ascii="Courier New" w:hAnsi="Courier New" w:cs="Courier New"/>
+          <w:sz w:val="22"/>
+          <w:szCs w:val="22"/>
+        </w:rPr>
+        <w:t> </w:t>
+      </w:r>
+      <w:r>
+        <w:rPr>
+          <w:rFonts w:ascii="Courier New" w:hAnsi="Courier New" w:cs="Courier New"/>
+          <w:sz w:val="22"/>
+          <w:szCs w:val="22"/>
+        </w:rPr>
+        <w:t xml:space="preserve">nodig </w:t>
+      </w:r>
+      <w:r>
+        <w:rPr>
+          <w:rFonts w:ascii="Courier New" w:hAnsi="Courier New" w:cs="Courier New"/>
+          <w:sz w:val="22"/>
+          <w:szCs w:val="22"/>
+        </w:rPr>
+        <w:t>waar</w:t>
+      </w:r>
+      <w:r>
+        <w:rPr>
+          <w:rFonts w:ascii="Courier New" w:hAnsi="Courier New" w:cs="Courier New"/>
+          <w:sz w:val="22"/>
+          <w:szCs w:val="22"/>
+        </w:rPr>
+        <w:t xml:space="preserve"> burgers </w:t>
+      </w:r>
+      <w:r>
+        <w:rPr>
+          <w:rFonts w:ascii="Courier New" w:hAnsi="Courier New" w:cs="Courier New"/>
+          <w:sz w:val="22"/>
+          <w:szCs w:val="22"/>
+        </w:rPr>
+        <w:t xml:space="preserve">met elkaar </w:t>
+      </w:r>
+      <w:r>
+        <w:rPr>
+          <w:rFonts w:ascii="Courier New" w:hAnsi="Courier New" w:cs="Courier New"/>
+          <w:sz w:val="22"/>
+          <w:szCs w:val="22"/>
+        </w:rPr>
+        <w:t xml:space="preserve">informatie uitwisselen, argumenten bespreken en </w:t>
+      </w:r>
+      <w:r>
+        <w:rPr>
+          <w:rFonts w:ascii="Courier New" w:hAnsi="Courier New" w:cs="Courier New"/>
+          <w:sz w:val="22"/>
+          <w:szCs w:val="22"/>
+        </w:rPr>
+        <w:t xml:space="preserve">waar </w:t>
+      </w:r>
+      <w:r>
+        <w:rPr>
+          <w:rFonts w:ascii="Courier New" w:hAnsi="Courier New" w:cs="Courier New"/>
+          <w:sz w:val="22"/>
+          <w:szCs w:val="22"/>
+        </w:rPr>
+        <w:t xml:space="preserve">uiteindelijk </w:t>
+      </w:r>
+      <w:r>
+        <w:rPr>
+          <w:rFonts w:ascii="Courier New" w:hAnsi="Courier New" w:cs="Courier New"/>
+          <w:sz w:val="22"/>
+          <w:szCs w:val="22"/>
+        </w:rPr>
+        <w:t xml:space="preserve">gezamenlijk oordelen </w:t>
+      </w:r>
+      <w:r>
+        <w:rPr>
+          <w:rFonts w:ascii="Courier New" w:hAnsi="Courier New" w:cs="Courier New"/>
+          <w:sz w:val="22"/>
+          <w:szCs w:val="22"/>
+        </w:rPr>
+        <w:t>worden ge</w:t>
+      </w:r>
+      <w:r>
+        <w:rPr>
+          <w:rFonts w:ascii="Courier New" w:hAnsi="Courier New" w:cs="Courier New"/>
+          <w:sz w:val="22"/>
+          <w:szCs w:val="22"/>
+        </w:rPr>
+        <w:t>vorm</w:t>
+      </w:r>
+      <w:r>
+        <w:rPr>
+          <w:rFonts w:ascii="Courier New" w:hAnsi="Courier New" w:cs="Courier New"/>
+          <w:sz w:val="22"/>
+          <w:szCs w:val="22"/>
+        </w:rPr>
+        <w:t>d</w:t>
+      </w:r>
+      <w:r>
+        <w:rPr>
+          <w:rFonts w:ascii="Courier New" w:hAnsi="Courier New" w:cs="Courier New"/>
+          <w:sz w:val="22"/>
+          <w:szCs w:val="22"/>
+        </w:rPr>
+        <w:t xml:space="preserve"> over </w:t>
+      </w:r>
+      <w:r>
+        <w:rPr>
+          <w:rFonts w:ascii="Courier New" w:hAnsi="Courier New" w:cs="Courier New"/>
+          <w:sz w:val="22"/>
+          <w:szCs w:val="22"/>
+        </w:rPr>
+        <w:t>zaken die iedereen aangaan</w:t>
+      </w:r>
+      <w:r>
+        <w:rPr>
+          <w:rFonts w:ascii="Courier New" w:hAnsi="Courier New" w:cs="Courier New"/>
+          <w:sz w:val="22"/>
+          <w:szCs w:val="22"/>
+        </w:rPr>
+        <w:t>.</w:t>
       </w:r>
       <w:r>
         <w:rPr>
@@ -810,7 +930,103 @@
           <w:sz w:val="22"/>
           <w:szCs w:val="22"/>
         </w:rPr>
-        <w:t>Democratie</w:t>
+        <w:t>D</w:t>
+      </w:r>
+      <w:r>
+        <w:rPr>
+          <w:rFonts w:ascii="Courier New" w:hAnsi="Courier New" w:cs="Courier New"/>
+          <w:sz w:val="22"/>
+          <w:szCs w:val="22"/>
+        </w:rPr>
+        <w:t xml:space="preserve">emocratie </w:t>
+      </w:r>
+      <w:r>
+        <w:rPr>
+          <w:rFonts w:ascii="Courier New" w:hAnsi="Courier New" w:cs="Courier New"/>
+          <w:sz w:val="22"/>
+          <w:szCs w:val="22"/>
+        </w:rPr>
+        <w:t>is zoveel meer dan</w:t>
+      </w:r>
+      <w:r>
+        <w:rPr>
+          <w:rFonts w:ascii="Courier New" w:hAnsi="Courier New" w:cs="Courier New"/>
+          <w:sz w:val="22"/>
+          <w:szCs w:val="22"/>
+        </w:rPr>
+        <w:t xml:space="preserve"> verkiezingen, parlementen en juridische procedures</w:t>
+      </w:r>
+      <w:r>
+        <w:rPr>
+          <w:rFonts w:ascii="Courier New" w:hAnsi="Courier New" w:cs="Courier New"/>
+          <w:sz w:val="22"/>
+          <w:szCs w:val="22"/>
+        </w:rPr>
+        <w:t>. Ze</w:t>
+      </w:r>
+      <w:r>
+        <w:rPr>
+          <w:rFonts w:ascii="Courier New" w:hAnsi="Courier New" w:cs="Courier New"/>
+          <w:sz w:val="22"/>
+          <w:szCs w:val="22"/>
+        </w:rPr>
+        <w:t xml:space="preserve"> vraagt ook een</w:t>
+      </w:r>
+      <w:r>
+        <w:rPr>
+          <w:rFonts w:ascii="Courier New" w:hAnsi="Courier New" w:cs="Courier New"/>
+          <w:sz w:val="22"/>
+          <w:szCs w:val="22"/>
+        </w:rPr>
+        <w:t xml:space="preserve"> levende publieke cultuur waarin burgers hun opvattingen kunnen </w:t>
+      </w:r>
+      <w:r>
+        <w:rPr>
+          <w:rFonts w:ascii="Courier New" w:hAnsi="Courier New" w:cs="Courier New"/>
+          <w:sz w:val="22"/>
+          <w:szCs w:val="22"/>
+        </w:rPr>
+        <w:t xml:space="preserve">vormen en </w:t>
+      </w:r>
+      <w:r>
+        <w:rPr>
+          <w:rFonts w:ascii="Courier New" w:hAnsi="Courier New" w:cs="Courier New"/>
+          <w:sz w:val="22"/>
+          <w:szCs w:val="22"/>
+        </w:rPr>
+        <w:t xml:space="preserve">ontwikkelen en </w:t>
+      </w:r>
+      <w:r>
+        <w:rPr>
+          <w:rFonts w:ascii="Courier New" w:hAnsi="Courier New" w:cs="Courier New"/>
+          <w:sz w:val="22"/>
+          <w:szCs w:val="22"/>
+        </w:rPr>
+        <w:t xml:space="preserve">waarin </w:t>
+      </w:r>
+      <w:r>
+        <w:rPr>
+          <w:rFonts w:ascii="Courier New" w:hAnsi="Courier New" w:cs="Courier New"/>
+          <w:sz w:val="22"/>
+          <w:szCs w:val="22"/>
+        </w:rPr>
+        <w:t xml:space="preserve">machthebbers ter verantwoording kunnen </w:t>
+      </w:r>
+      <w:r>
+        <w:rPr>
+          <w:rFonts w:ascii="Courier New" w:hAnsi="Courier New" w:cs="Courier New"/>
+          <w:sz w:val="22"/>
+          <w:szCs w:val="22"/>
+        </w:rPr>
+        <w:t>worden ge</w:t>
+      </w:r>
+      <w:r>
+        <w:rPr>
+          <w:rFonts w:ascii="Courier New" w:hAnsi="Courier New" w:cs="Courier New"/>
+          <w:sz w:val="22"/>
+          <w:szCs w:val="22"/>
+        </w:rPr>
+        <w:t>roepen.</w:t>
       </w:r>
       <w:r>
         <w:rPr>
@@ -826,127 +1042,39 @@
           <w:sz w:val="22"/>
           <w:szCs w:val="22"/>
         </w:rPr>
-        <w:t>heeft</w:t>
-      </w:r>
-      <w:r>
-        <w:rPr>
-          <w:rFonts w:ascii="Courier New" w:hAnsi="Courier New" w:cs="Courier New"/>
-          <w:sz w:val="22"/>
-          <w:szCs w:val="22"/>
-        </w:rPr>
-        <w:t xml:space="preserve"> maatschappelijke ruimten</w:t>
-      </w:r>
-      <w:r>
-        <w:rPr>
-          <w:rFonts w:ascii="Courier New" w:hAnsi="Courier New" w:cs="Courier New"/>
-          <w:sz w:val="22"/>
-          <w:szCs w:val="22"/>
-        </w:rPr>
-        <w:t> </w:t>
-      </w:r>
-      <w:r>
-        <w:rPr>
-          <w:rFonts w:ascii="Courier New" w:hAnsi="Courier New" w:cs="Courier New"/>
-          <w:sz w:val="22"/>
-          <w:szCs w:val="22"/>
-        </w:rPr>
-        <w:t xml:space="preserve">nodig </w:t>
-      </w:r>
-      <w:r>
-        <w:rPr>
-          <w:rFonts w:ascii="Courier New" w:hAnsi="Courier New" w:cs="Courier New"/>
-          <w:sz w:val="22"/>
-          <w:szCs w:val="22"/>
-        </w:rPr>
-        <w:t>waar</w:t>
-      </w:r>
-      <w:r>
-        <w:rPr>
-          <w:rFonts w:ascii="Courier New" w:hAnsi="Courier New" w:cs="Courier New"/>
-          <w:sz w:val="22"/>
-          <w:szCs w:val="22"/>
-        </w:rPr>
-        <w:t xml:space="preserve"> burgers </w:t>
-      </w:r>
-      <w:r>
-        <w:rPr>
-          <w:rFonts w:ascii="Courier New" w:hAnsi="Courier New" w:cs="Courier New"/>
-          <w:sz w:val="22"/>
-          <w:szCs w:val="22"/>
-        </w:rPr>
-        <w:t xml:space="preserve">met elkaar </w:t>
-      </w:r>
-      <w:r>
-        <w:rPr>
-          <w:rFonts w:ascii="Courier New" w:hAnsi="Courier New" w:cs="Courier New"/>
-          <w:sz w:val="22"/>
-          <w:szCs w:val="22"/>
-        </w:rPr>
-        <w:t xml:space="preserve">informatie uitwisselen, argumenten bespreken en </w:t>
-      </w:r>
-      <w:r>
-        <w:rPr>
-          <w:rFonts w:ascii="Courier New" w:hAnsi="Courier New" w:cs="Courier New"/>
-          <w:sz w:val="22"/>
-          <w:szCs w:val="22"/>
-        </w:rPr>
-        <w:t xml:space="preserve">waar </w:t>
-      </w:r>
-      <w:r>
-        <w:rPr>
-          <w:rFonts w:ascii="Courier New" w:hAnsi="Courier New" w:cs="Courier New"/>
-          <w:sz w:val="22"/>
-          <w:szCs w:val="22"/>
-        </w:rPr>
-        <w:t xml:space="preserve">uiteindelijk </w:t>
-      </w:r>
-      <w:r>
-        <w:rPr>
-          <w:rFonts w:ascii="Courier New" w:hAnsi="Courier New" w:cs="Courier New"/>
-          <w:sz w:val="22"/>
-          <w:szCs w:val="22"/>
-        </w:rPr>
-        <w:t xml:space="preserve">gezamenlijk oordelen </w:t>
-      </w:r>
-      <w:r>
-        <w:rPr>
-          <w:rFonts w:ascii="Courier New" w:hAnsi="Courier New" w:cs="Courier New"/>
-          <w:sz w:val="22"/>
-          <w:szCs w:val="22"/>
-        </w:rPr>
-        <w:t>worden ge</w:t>
-      </w:r>
-      <w:r>
-        <w:rPr>
-          <w:rFonts w:ascii="Courier New" w:hAnsi="Courier New" w:cs="Courier New"/>
-          <w:sz w:val="22"/>
-          <w:szCs w:val="22"/>
-        </w:rPr>
-        <w:t>vorm</w:t>
-      </w:r>
-      <w:r>
-        <w:rPr>
-          <w:rFonts w:ascii="Courier New" w:hAnsi="Courier New" w:cs="Courier New"/>
-          <w:sz w:val="22"/>
-          <w:szCs w:val="22"/>
-        </w:rPr>
-        <w:t>d</w:t>
-      </w:r>
-      <w:r>
-        <w:rPr>
-          <w:rFonts w:ascii="Courier New" w:hAnsi="Courier New" w:cs="Courier New"/>
-          <w:sz w:val="22"/>
-          <w:szCs w:val="22"/>
-        </w:rPr>
-        <w:t xml:space="preserve"> over </w:t>
-      </w:r>
-      <w:r>
-        <w:rPr>
-          <w:rFonts w:ascii="Courier New" w:hAnsi="Courier New" w:cs="Courier New"/>
-          <w:sz w:val="22"/>
-          <w:szCs w:val="22"/>
-        </w:rPr>
-        <w:t>zaken die iedereen aangaan</w:t>
+        <w:t>Politiek is zoveel meer dan</w:t>
+      </w:r>
+      <w:r>
+        <w:rPr>
+          <w:rFonts w:ascii="Courier New" w:hAnsi="Courier New" w:cs="Courier New"/>
+          <w:sz w:val="22"/>
+          <w:szCs w:val="22"/>
+        </w:rPr>
+        <w:t xml:space="preserve"> macht, traditie of economisch belang</w:t>
+      </w:r>
+      <w:r>
+        <w:rPr>
+          <w:rFonts w:ascii="Courier New" w:hAnsi="Courier New" w:cs="Courier New"/>
+          <w:sz w:val="22"/>
+          <w:szCs w:val="22"/>
+        </w:rPr>
+        <w:t xml:space="preserve"> en dan komt</w:t>
+      </w:r>
+      <w:r>
+        <w:rPr>
+          <w:rFonts w:ascii="Courier New" w:hAnsi="Courier New" w:cs="Courier New"/>
+          <w:sz w:val="22"/>
+          <w:szCs w:val="22"/>
+        </w:rPr>
+        <w:t xml:space="preserve"> het vermogen elkaar argumenten voor te leggen en tot wederzijds begrip te komen</w:t>
+      </w:r>
+      <w:r>
+        <w:rPr>
+          <w:rFonts w:ascii="Courier New" w:hAnsi="Courier New" w:cs="Courier New"/>
+          <w:sz w:val="22"/>
+          <w:szCs w:val="22"/>
+        </w:rPr>
+        <w:t xml:space="preserve"> om de hoek kijken</w:t>
       </w:r>
       <w:r>
         <w:rPr>
@@ -962,199 +1090,7 @@
           <w:sz w:val="22"/>
           <w:szCs w:val="22"/>
         </w:rPr>
-        <w:t xml:space="preserve"> </w:t>
-      </w:r>
-      <w:r>
-        <w:rPr>
-          <w:rFonts w:ascii="Courier New" w:hAnsi="Courier New" w:cs="Courier New"/>
-          <w:sz w:val="22"/>
-          <w:szCs w:val="22"/>
-        </w:rPr>
-        <w:t>D</w:t>
-      </w:r>
-      <w:r>
-        <w:rPr>
-          <w:rFonts w:ascii="Courier New" w:hAnsi="Courier New" w:cs="Courier New"/>
-          <w:sz w:val="22"/>
-          <w:szCs w:val="22"/>
-        </w:rPr>
-        <w:t xml:space="preserve">emocratie </w:t>
-      </w:r>
-      <w:r>
-        <w:rPr>
-          <w:rFonts w:ascii="Courier New" w:hAnsi="Courier New" w:cs="Courier New"/>
-          <w:sz w:val="22"/>
-          <w:szCs w:val="22"/>
-        </w:rPr>
-        <w:t>is zoveel meer dan</w:t>
-      </w:r>
-      <w:r>
-        <w:rPr>
-          <w:rFonts w:ascii="Courier New" w:hAnsi="Courier New" w:cs="Courier New"/>
-          <w:sz w:val="22"/>
-          <w:szCs w:val="22"/>
-        </w:rPr>
-        <w:t xml:space="preserve"> verkiezingen, parlementen en juridische procedures</w:t>
-      </w:r>
-      <w:r>
-        <w:rPr>
-          <w:rFonts w:ascii="Courier New" w:hAnsi="Courier New" w:cs="Courier New"/>
-          <w:sz w:val="22"/>
-          <w:szCs w:val="22"/>
-        </w:rPr>
-        <w:t>. Ze</w:t>
-      </w:r>
-      <w:r>
-        <w:rPr>
-          <w:rFonts w:ascii="Courier New" w:hAnsi="Courier New" w:cs="Courier New"/>
-          <w:sz w:val="22"/>
-          <w:szCs w:val="22"/>
-        </w:rPr>
-        <w:t xml:space="preserve"> vraagt ook een</w:t>
-      </w:r>
-      <w:r>
-        <w:rPr>
-          <w:rFonts w:ascii="Courier New" w:hAnsi="Courier New" w:cs="Courier New"/>
-          <w:sz w:val="22"/>
-          <w:szCs w:val="22"/>
-        </w:rPr>
-        <w:t xml:space="preserve"> levende publieke cultuur waarin burgers hun opvattingen kunnen </w:t>
-      </w:r>
-      <w:r>
-        <w:rPr>
-          <w:rFonts w:ascii="Courier New" w:hAnsi="Courier New" w:cs="Courier New"/>
-          <w:sz w:val="22"/>
-          <w:szCs w:val="22"/>
-        </w:rPr>
-        <w:t xml:space="preserve">vormen en </w:t>
-      </w:r>
-      <w:r>
-        <w:rPr>
-          <w:rFonts w:ascii="Courier New" w:hAnsi="Courier New" w:cs="Courier New"/>
-          <w:sz w:val="22"/>
-          <w:szCs w:val="22"/>
-        </w:rPr>
-        <w:t xml:space="preserve">ontwikkelen en </w:t>
-      </w:r>
-      <w:r>
-        <w:rPr>
-          <w:rFonts w:ascii="Courier New" w:hAnsi="Courier New" w:cs="Courier New"/>
-          <w:sz w:val="22"/>
-          <w:szCs w:val="22"/>
-        </w:rPr>
-        <w:t xml:space="preserve">waarin </w:t>
-      </w:r>
-      <w:r>
-        <w:rPr>
-          <w:rFonts w:ascii="Courier New" w:hAnsi="Courier New" w:cs="Courier New"/>
-          <w:sz w:val="22"/>
-          <w:szCs w:val="22"/>
-        </w:rPr>
-        <w:t xml:space="preserve">machthebbers ter verantwoording kunnen </w:t>
-      </w:r>
-      <w:r>
-        <w:rPr>
-          <w:rFonts w:ascii="Courier New" w:hAnsi="Courier New" w:cs="Courier New"/>
-          <w:sz w:val="22"/>
-          <w:szCs w:val="22"/>
-        </w:rPr>
-        <w:t>worden ge</w:t>
-      </w:r>
-      <w:r>
-        <w:rPr>
-          <w:rFonts w:ascii="Courier New" w:hAnsi="Courier New" w:cs="Courier New"/>
-          <w:sz w:val="22"/>
-          <w:szCs w:val="22"/>
-        </w:rPr>
-        <w:t>roepen.</w:t>
-      </w:r>
-      <w:r>
-        <w:rPr>
-          <w:rFonts w:ascii="Courier New" w:hAnsi="Courier New" w:cs="Courier New"/>
-          <w:sz w:val="22"/>
-          <w:szCs w:val="22"/>
-        </w:rPr>
-        <w:t xml:space="preserve"> </w:t>
-      </w:r>
-      <w:r>
-        <w:rPr>
-          <w:rFonts w:ascii="Courier New" w:hAnsi="Courier New" w:cs="Courier New"/>
-          <w:sz w:val="22"/>
-          <w:szCs w:val="22"/>
-        </w:rPr>
-        <w:t xml:space="preserve">Politiek </w:t>
-      </w:r>
-      <w:r>
-        <w:rPr>
-          <w:rFonts w:ascii="Courier New" w:hAnsi="Courier New" w:cs="Courier New"/>
-          <w:sz w:val="22"/>
-          <w:szCs w:val="22"/>
-        </w:rPr>
-        <w:t>is zoveel meer</w:t>
-      </w:r>
-      <w:r>
-        <w:rPr>
-          <w:rFonts w:ascii="Courier New" w:hAnsi="Courier New" w:cs="Courier New"/>
-          <w:sz w:val="22"/>
-          <w:szCs w:val="22"/>
-        </w:rPr>
-        <w:t xml:space="preserve"> dan</w:t>
-      </w:r>
-      <w:r>
-        <w:rPr>
-          <w:rFonts w:ascii="Courier New" w:hAnsi="Courier New" w:cs="Courier New"/>
-          <w:sz w:val="22"/>
-          <w:szCs w:val="22"/>
-        </w:rPr>
-        <w:t xml:space="preserve"> macht, traditie of economisch belang</w:t>
-      </w:r>
-      <w:r>
-        <w:rPr>
-          <w:rFonts w:ascii="Courier New" w:hAnsi="Courier New" w:cs="Courier New"/>
-          <w:sz w:val="22"/>
-          <w:szCs w:val="22"/>
-        </w:rPr>
-        <w:t xml:space="preserve"> en dan komt</w:t>
-      </w:r>
-      <w:r>
-        <w:rPr>
-          <w:rFonts w:ascii="Courier New" w:hAnsi="Courier New" w:cs="Courier New"/>
-          <w:sz w:val="22"/>
-          <w:szCs w:val="22"/>
-        </w:rPr>
-        <w:t xml:space="preserve"> het vermogen elkaar argumenten voor te leggen en tot wederzijds begrip te komen</w:t>
-      </w:r>
-      <w:r>
-        <w:rPr>
-          <w:rFonts w:ascii="Courier New" w:hAnsi="Courier New" w:cs="Courier New"/>
-          <w:sz w:val="22"/>
-          <w:szCs w:val="22"/>
-        </w:rPr>
-        <w:t xml:space="preserve"> om de hoek kijken</w:t>
-      </w:r>
-      <w:r>
-        <w:rPr>
-          <w:rFonts w:ascii="Courier New" w:hAnsi="Courier New" w:cs="Courier New"/>
-          <w:sz w:val="22"/>
-          <w:szCs w:val="22"/>
-        </w:rPr>
-        <w:t>.</w:t>
-      </w:r>
-      <w:r>
-        <w:rPr>
-          <w:rFonts w:ascii="Courier New" w:hAnsi="Courier New" w:cs="Courier New"/>
-          <w:sz w:val="22"/>
-          <w:szCs w:val="22"/>
-        </w:rPr>
-        <w:t xml:space="preserve"> </w:t>
-      </w:r>
-      <w:r>
-        <w:rPr>
-          <w:rFonts w:ascii="Courier New" w:hAnsi="Courier New" w:cs="Courier New"/>
-          <w:sz w:val="22"/>
-          <w:szCs w:val="22"/>
-        </w:rPr>
-        <w:t xml:space="preserve">En niet om het altijd maar met elkaar eens te worden. </w:t>
+        <w:t xml:space="preserve"> En niet om het altijd maar met elkaar eens te worden. </w:t>
       </w:r>
       <w:r>
         <w:rPr>
@@ -1659,15 +1595,31 @@
           <w:sz w:val="22"/>
           <w:szCs w:val="22"/>
         </w:rPr>
-        <w:t xml:space="preserve"> hij als jonge filosoof ook zo fel in</w:t>
-      </w:r>
-      <w:r>
-        <w:rPr>
-          <w:rFonts w:ascii="Courier New" w:hAnsi="Courier New" w:cs="Courier New"/>
-          <w:sz w:val="22"/>
-          <w:szCs w:val="22"/>
-        </w:rPr>
-        <w:t xml:space="preserve"> 1953 op de </w:t>
+        <w:t xml:space="preserve"> hij </w:t>
+      </w:r>
+      <w:r>
+        <w:rPr>
+          <w:rFonts w:ascii="Courier New" w:hAnsi="Courier New" w:cs="Courier New"/>
+          <w:sz w:val="22"/>
+          <w:szCs w:val="22"/>
+        </w:rPr>
+        <w:t xml:space="preserve">in 1953 </w:t>
+      </w:r>
+      <w:r>
+        <w:rPr>
+          <w:rFonts w:ascii="Courier New" w:hAnsi="Courier New" w:cs="Courier New"/>
+          <w:sz w:val="22"/>
+          <w:szCs w:val="22"/>
+        </w:rPr>
+        <w:t xml:space="preserve">als jonge filosoof ook zo fel </w:t>
+      </w:r>
+      <w:r>
+        <w:rPr>
+          <w:rFonts w:ascii="Courier New" w:hAnsi="Courier New" w:cs="Courier New"/>
+          <w:sz w:val="22"/>
+          <w:szCs w:val="22"/>
+        </w:rPr>
+        <w:t xml:space="preserve">op de </w:t>
       </w:r>
       <w:r>
         <w:rPr>
@@ -1691,7 +1643,31 @@
           <w:sz w:val="22"/>
           <w:szCs w:val="22"/>
         </w:rPr>
-        <w:t xml:space="preserve"> waar hijzelf zo door was beïnvloed en die zijn</w:t>
+        <w:t>,</w:t>
+      </w:r>
+      <w:r>
+        <w:rPr>
+          <w:rFonts w:ascii="Courier New" w:hAnsi="Courier New" w:cs="Courier New"/>
+          <w:sz w:val="22"/>
+          <w:szCs w:val="22"/>
+        </w:rPr>
+        <w:t xml:space="preserve"> waar hijzelf zo door was beïnvloed</w:t>
+      </w:r>
+      <w:r>
+        <w:rPr>
+          <w:rFonts w:ascii="Courier New" w:hAnsi="Courier New" w:cs="Courier New"/>
+          <w:sz w:val="22"/>
+          <w:szCs w:val="22"/>
+        </w:rPr>
+        <w:t>,</w:t>
+      </w:r>
+      <w:r>
+        <w:rPr>
+          <w:rFonts w:ascii="Courier New" w:hAnsi="Courier New" w:cs="Courier New"/>
+          <w:sz w:val="22"/>
+          <w:szCs w:val="22"/>
+        </w:rPr>
+        <w:t xml:space="preserve"> en die zijn</w:t>
       </w:r>
       <w:r>
         <w:rPr>
@@ -1739,6 +1715,14 @@
           <w:sz w:val="22"/>
           <w:szCs w:val="22"/>
         </w:rPr>
+        <w:t xml:space="preserve"> Dat is een centrale vraag voor Habermas.</w:t>
+      </w:r>
+      <w:r>
+        <w:rPr>
+          <w:rFonts w:ascii="Courier New" w:hAnsi="Courier New" w:cs="Courier New"/>
+          <w:sz w:val="22"/>
+          <w:szCs w:val="22"/>
+        </w:rPr>
         <w:t xml:space="preserve"> </w:t>
       </w:r>
       <w:r>
@@ -1763,7 +1747,23 @@
           <w:sz w:val="22"/>
           <w:szCs w:val="22"/>
         </w:rPr>
-        <w:t>als journalist en publiceer</w:t>
+        <w:t xml:space="preserve">als journalist en </w:t>
+      </w:r>
+      <w:r>
+        <w:rPr>
+          <w:rFonts w:ascii="Courier New" w:hAnsi="Courier New" w:cs="Courier New"/>
+          <w:sz w:val="22"/>
+          <w:szCs w:val="22"/>
+        </w:rPr>
+        <w:t xml:space="preserve">hij </w:t>
+      </w:r>
+      <w:r>
+        <w:rPr>
+          <w:rFonts w:ascii="Courier New" w:hAnsi="Courier New" w:cs="Courier New"/>
+          <w:sz w:val="22"/>
+          <w:szCs w:val="22"/>
+        </w:rPr>
+        <w:t>publiceer</w:t>
       </w:r>
       <w:r>
         <w:rPr>
@@ -1779,16 +1779,7 @@
           <w:sz w:val="22"/>
           <w:szCs w:val="22"/>
         </w:rPr>
-        <w:t xml:space="preserve"> hij regelmatig over filosofische en </w:t>
-      </w:r>
-      <w:r>
-        <w:rPr>
-          <w:rFonts w:ascii="Courier New" w:hAnsi="Courier New" w:cs="Courier New"/>
-          <w:sz w:val="22"/>
-          <w:szCs w:val="22"/>
-        </w:rPr>
-        <w:lastRenderedPageBreak/>
-        <w:t xml:space="preserve">politieke kwesties. Zijn belangstelling voor de publieke meningsvorming </w:t>
+        <w:t xml:space="preserve"> regelmatig over filosofische en politieke kwesties. Zijn belangstelling voor de publieke meningsvorming </w:t>
       </w:r>
       <w:r>
         <w:rPr>
@@ -1804,7 +1795,23 @@
           <w:sz w:val="22"/>
           <w:szCs w:val="22"/>
         </w:rPr>
-        <w:t xml:space="preserve">hij een academische reputatie had opgebouwd. </w:t>
+        <w:t xml:space="preserve">hij </w:t>
+      </w:r>
+      <w:r>
+        <w:rPr>
+          <w:rFonts w:ascii="Courier New" w:hAnsi="Courier New" w:cs="Courier New"/>
+          <w:sz w:val="22"/>
+          <w:szCs w:val="22"/>
+        </w:rPr>
+        <w:t>zijn</w:t>
+      </w:r>
+      <w:r>
+        <w:rPr>
+          <w:rFonts w:ascii="Courier New" w:hAnsi="Courier New" w:cs="Courier New"/>
+          <w:sz w:val="22"/>
+          <w:szCs w:val="22"/>
+        </w:rPr>
+        <w:t xml:space="preserve"> academische reputatie had opgebouwd. </w:t>
       </w:r>
     </w:p>
     <w:p>
@@ -1823,6 +1830,7 @@
           <w:sz w:val="22"/>
           <w:szCs w:val="22"/>
         </w:rPr>
+        <w:lastRenderedPageBreak/>
         <w:t>Wanneer</w:t>
       </w:r>
       <w:r>
@@ -2390,15 +2398,31 @@
           <w:sz w:val="22"/>
           <w:szCs w:val="22"/>
         </w:rPr>
-        <w:t>Verovšek interpreteert deze periode niet als een afscheid van politiek engagement, maar als een fase waarin Habermas zijn theoretische grondslagen verdiepte. </w:t>
-      </w:r>
-      <w:r>
-        <w:rPr>
-          <w:rFonts w:ascii="Courier New" w:hAnsi="Courier New" w:cs="Courier New"/>
-          <w:sz w:val="22"/>
-          <w:szCs w:val="22"/>
-        </w:rPr>
-        <w:t>Met deze kennis in de zak neemt Habermas</w:t>
+        <w:t>Verovšek interpreteert deze periode niet als een afscheid van politiek engagement, maar als een fase waarin Habermas zijn theoretische grondslagen verdiept. </w:t>
+      </w:r>
+      <w:r>
+        <w:rPr>
+          <w:rFonts w:ascii="Courier New" w:hAnsi="Courier New" w:cs="Courier New"/>
+          <w:sz w:val="22"/>
+          <w:szCs w:val="22"/>
+        </w:rPr>
+        <w:t xml:space="preserve">Met deze kennis in de </w:t>
+      </w:r>
+      <w:r>
+        <w:rPr>
+          <w:rFonts w:ascii="Courier New" w:hAnsi="Courier New" w:cs="Courier New"/>
+          <w:sz w:val="22"/>
+          <w:szCs w:val="22"/>
+        </w:rPr>
+        <w:t>achter</w:t>
+      </w:r>
+      <w:r>
+        <w:rPr>
+          <w:rFonts w:ascii="Courier New" w:hAnsi="Courier New" w:cs="Courier New"/>
+          <w:sz w:val="22"/>
+          <w:szCs w:val="22"/>
+        </w:rPr>
+        <w:t>zak neemt Habermas</w:t>
       </w:r>
       <w:r>
         <w:rPr>
@@ -2438,7 +2462,7 @@
           <w:sz w:val="22"/>
           <w:szCs w:val="22"/>
         </w:rPr>
-        <w:t> van 1986 maakte hem opnieuw tot een nationaal invloedrijke intellectueel.</w:t>
+        <w:t> van 1986 maakt hem opnieuw tot een nationaal invloedrijke intellectueel.</w:t>
       </w:r>
       <w:r>
         <w:rPr>
@@ -2454,7 +2478,87 @@
           <w:sz w:val="22"/>
           <w:szCs w:val="22"/>
         </w:rPr>
-        <w:t xml:space="preserve">Habermas zich </w:t>
+        <w:t>Habermas zich tegen historici die</w:t>
+      </w:r>
+      <w:r>
+        <w:rPr>
+          <w:rFonts w:ascii="Courier New" w:hAnsi="Courier New" w:cs="Courier New"/>
+          <w:sz w:val="22"/>
+          <w:szCs w:val="22"/>
+        </w:rPr>
+        <w:t xml:space="preserve"> </w:t>
+      </w:r>
+      <w:r>
+        <w:rPr>
+          <w:rFonts w:ascii="Courier New" w:hAnsi="Courier New" w:cs="Courier New"/>
+          <w:sz w:val="22"/>
+          <w:szCs w:val="22"/>
+        </w:rPr>
+        <w:t>volgens hem de bijzondere betekenis van de</w:t>
+      </w:r>
+      <w:r>
+        <w:rPr>
+          <w:rFonts w:ascii="Courier New" w:hAnsi="Courier New" w:cs="Courier New"/>
+          <w:sz w:val="22"/>
+          <w:szCs w:val="22"/>
+        </w:rPr>
+        <w:t xml:space="preserve"> </w:t>
+      </w:r>
+      <w:r>
+        <w:rPr>
+          <w:rFonts w:ascii="Courier New" w:hAnsi="Courier New" w:cs="Courier New"/>
+          <w:sz w:val="22"/>
+          <w:szCs w:val="22"/>
+        </w:rPr>
+        <w:t>nationaal</w:t>
+      </w:r>
+      <w:r>
+        <w:rPr>
+          <w:rFonts w:ascii="Courier New" w:hAnsi="Courier New" w:cs="Courier New"/>
+          <w:sz w:val="22"/>
+          <w:szCs w:val="22"/>
+        </w:rPr>
+        <w:t>-</w:t>
+      </w:r>
+      <w:r>
+        <w:rPr>
+          <w:rFonts w:ascii="Courier New" w:hAnsi="Courier New" w:cs="Courier New"/>
+          <w:sz w:val="22"/>
+          <w:szCs w:val="22"/>
+        </w:rPr>
+        <w:t>socialistische misdaden relative</w:t>
+      </w:r>
+      <w:r>
+        <w:rPr>
+          <w:rFonts w:ascii="Courier New" w:hAnsi="Courier New" w:cs="Courier New"/>
+          <w:sz w:val="22"/>
+          <w:szCs w:val="22"/>
+        </w:rPr>
+        <w:t>ren</w:t>
+      </w:r>
+      <w:r>
+        <w:rPr>
+          <w:rFonts w:ascii="Courier New" w:hAnsi="Courier New" w:cs="Courier New"/>
+          <w:sz w:val="22"/>
+          <w:szCs w:val="22"/>
+        </w:rPr>
+        <w:t xml:space="preserve"> door deze te vergelijken met andere historische vormen van massaal geweld. De</w:t>
+      </w:r>
+      <w:r>
+        <w:rPr>
+          <w:rFonts w:ascii="Courier New" w:hAnsi="Courier New" w:cs="Courier New"/>
+          <w:sz w:val="22"/>
+          <w:szCs w:val="22"/>
+        </w:rPr>
+        <w:t>ze</w:t>
+      </w:r>
+      <w:r>
+        <w:rPr>
+          <w:rFonts w:ascii="Courier New" w:hAnsi="Courier New" w:cs="Courier New"/>
+          <w:sz w:val="22"/>
+          <w:szCs w:val="22"/>
+        </w:rPr>
+        <w:t xml:space="preserve"> </w:t>
       </w:r>
       <w:r>
         <w:rPr>
@@ -2463,7 +2567,55 @@
           <w:szCs w:val="22"/>
         </w:rPr>
         <w:lastRenderedPageBreak/>
-        <w:t>tegen historici die</w:t>
+        <w:t>discussie raakt</w:t>
+      </w:r>
+      <w:r>
+        <w:rPr>
+          <w:rFonts w:ascii="Courier New" w:hAnsi="Courier New" w:cs="Courier New"/>
+          <w:sz w:val="22"/>
+          <w:szCs w:val="22"/>
+        </w:rPr>
+        <w:t xml:space="preserve"> voor hem</w:t>
+      </w:r>
+      <w:r>
+        <w:rPr>
+          <w:rFonts w:ascii="Courier New" w:hAnsi="Courier New" w:cs="Courier New"/>
+          <w:sz w:val="22"/>
+          <w:szCs w:val="22"/>
+        </w:rPr>
+        <w:t xml:space="preserve"> aan de politieke identiteit van de Bondsrepubliek. Een democratisch Duitsland </w:t>
+      </w:r>
+      <w:r>
+        <w:rPr>
+          <w:rFonts w:ascii="Courier New" w:hAnsi="Courier New" w:cs="Courier New"/>
+          <w:sz w:val="22"/>
+          <w:szCs w:val="22"/>
+        </w:rPr>
+        <w:t>heeft</w:t>
+      </w:r>
+      <w:r>
+        <w:rPr>
+          <w:rFonts w:ascii="Courier New" w:hAnsi="Courier New" w:cs="Courier New"/>
+          <w:sz w:val="22"/>
+          <w:szCs w:val="22"/>
+        </w:rPr>
+        <w:t xml:space="preserve"> volgens hem zijn legitimiteit niet </w:t>
+      </w:r>
+      <w:r>
+        <w:rPr>
+          <w:rFonts w:ascii="Courier New" w:hAnsi="Courier New" w:cs="Courier New"/>
+          <w:sz w:val="22"/>
+          <w:szCs w:val="22"/>
+        </w:rPr>
+        <w:t xml:space="preserve">te </w:t>
+      </w:r>
+      <w:r>
+        <w:rPr>
+          <w:rFonts w:ascii="Courier New" w:hAnsi="Courier New" w:cs="Courier New"/>
+          <w:sz w:val="22"/>
+          <w:szCs w:val="22"/>
+        </w:rPr>
+        <w:t>ontlenen aan nationale trots of historische continuïteit, maar aan de beginselen van de democratische rechtsstaat.</w:t>
       </w:r>
       <w:r>
         <w:rPr>
@@ -2479,7 +2631,31 @@
           <w:sz w:val="22"/>
           <w:szCs w:val="22"/>
         </w:rPr>
-        <w:t>volgens hem de bijzondere betekenis van de</w:t>
+        <w:t>P</w:t>
+      </w:r>
+      <w:r>
+        <w:rPr>
+          <w:rFonts w:ascii="Courier New" w:hAnsi="Courier New" w:cs="Courier New"/>
+          <w:sz w:val="22"/>
+          <w:szCs w:val="22"/>
+        </w:rPr>
+        <w:t xml:space="preserve">olitieke verbondenheid behoort in </w:t>
+      </w:r>
+      <w:r>
+        <w:rPr>
+          <w:rFonts w:ascii="Courier New" w:hAnsi="Courier New" w:cs="Courier New"/>
+          <w:sz w:val="22"/>
+          <w:szCs w:val="22"/>
+        </w:rPr>
+        <w:t>zijn constitutioneel patriotisme</w:t>
+      </w:r>
+      <w:r>
+        <w:rPr>
+          <w:rFonts w:ascii="Courier New" w:hAnsi="Courier New" w:cs="Courier New"/>
+          <w:sz w:val="22"/>
+          <w:szCs w:val="22"/>
+        </w:rPr>
+        <w:t xml:space="preserve"> gebaseerd te zijn op gedeelde democratische en constitutionele waarden, niet op etnische of culturele homogeniteit.</w:t>
       </w:r>
       <w:r>
         <w:rPr>
@@ -2495,110 +2671,6 @@
           <w:sz w:val="22"/>
           <w:szCs w:val="22"/>
         </w:rPr>
-        <w:t>nationaal</w:t>
-      </w:r>
-      <w:r>
-        <w:rPr>
-          <w:rFonts w:ascii="Courier New" w:hAnsi="Courier New" w:cs="Courier New"/>
-          <w:sz w:val="22"/>
-          <w:szCs w:val="22"/>
-        </w:rPr>
-        <w:t>-</w:t>
-      </w:r>
-      <w:r>
-        <w:rPr>
-          <w:rFonts w:ascii="Courier New" w:hAnsi="Courier New" w:cs="Courier New"/>
-          <w:sz w:val="22"/>
-          <w:szCs w:val="22"/>
-        </w:rPr>
-        <w:t>socialistische misdaden relative</w:t>
-      </w:r>
-      <w:r>
-        <w:rPr>
-          <w:rFonts w:ascii="Courier New" w:hAnsi="Courier New" w:cs="Courier New"/>
-          <w:sz w:val="22"/>
-          <w:szCs w:val="22"/>
-        </w:rPr>
-        <w:t>ren</w:t>
-      </w:r>
-      <w:r>
-        <w:rPr>
-          <w:rFonts w:ascii="Courier New" w:hAnsi="Courier New" w:cs="Courier New"/>
-          <w:sz w:val="22"/>
-          <w:szCs w:val="22"/>
-        </w:rPr>
-        <w:t xml:space="preserve"> door deze te vergelijken met andere historische vormen van massaal geweld. De</w:t>
-      </w:r>
-      <w:r>
-        <w:rPr>
-          <w:rFonts w:ascii="Courier New" w:hAnsi="Courier New" w:cs="Courier New"/>
-          <w:sz w:val="22"/>
-          <w:szCs w:val="22"/>
-        </w:rPr>
-        <w:t>ze</w:t>
-      </w:r>
-      <w:r>
-        <w:rPr>
-          <w:rFonts w:ascii="Courier New" w:hAnsi="Courier New" w:cs="Courier New"/>
-          <w:sz w:val="22"/>
-          <w:szCs w:val="22"/>
-        </w:rPr>
-        <w:t xml:space="preserve"> discussie raakt</w:t>
-      </w:r>
-      <w:r>
-        <w:rPr>
-          <w:rFonts w:ascii="Courier New" w:hAnsi="Courier New" w:cs="Courier New"/>
-          <w:sz w:val="22"/>
-          <w:szCs w:val="22"/>
-        </w:rPr>
-        <w:t xml:space="preserve"> voor hem</w:t>
-      </w:r>
-      <w:r>
-        <w:rPr>
-          <w:rFonts w:ascii="Courier New" w:hAnsi="Courier New" w:cs="Courier New"/>
-          <w:sz w:val="22"/>
-          <w:szCs w:val="22"/>
-        </w:rPr>
-        <w:t xml:space="preserve"> aan de politieke identiteit van de Bondsrepubliek. Een democratisch Duitsland moest volgens hem zijn legitimiteit niet ontlenen aan nationale trots of historische continuïteit, maar aan de beginselen van de democratische rechtsstaat.</w:t>
-      </w:r>
-      <w:r>
-        <w:rPr>
-          <w:rFonts w:ascii="Courier New" w:hAnsi="Courier New" w:cs="Courier New"/>
-          <w:sz w:val="22"/>
-          <w:szCs w:val="22"/>
-        </w:rPr>
-        <w:t xml:space="preserve"> </w:t>
-      </w:r>
-      <w:r>
-        <w:rPr>
-          <w:rFonts w:ascii="Courier New" w:hAnsi="Courier New" w:cs="Courier New"/>
-          <w:sz w:val="22"/>
-          <w:szCs w:val="22"/>
-        </w:rPr>
-        <w:t>P</w:t>
-      </w:r>
-      <w:r>
-        <w:rPr>
-          <w:rFonts w:ascii="Courier New" w:hAnsi="Courier New" w:cs="Courier New"/>
-          <w:sz w:val="22"/>
-          <w:szCs w:val="22"/>
-        </w:rPr>
-        <w:t>olitieke verbondenheid behoort in de eerste plaats gebaseerd te zijn op gedeelde democratische en constitutionele waarden, niet op etnische of culturele homogeniteit.</w:t>
-      </w:r>
-      <w:r>
-        <w:rPr>
-          <w:rFonts w:ascii="Courier New" w:hAnsi="Courier New" w:cs="Courier New"/>
-          <w:sz w:val="22"/>
-          <w:szCs w:val="22"/>
-        </w:rPr>
-        <w:t xml:space="preserve"> </w:t>
-      </w:r>
-      <w:r>
-        <w:rPr>
-          <w:rFonts w:ascii="Courier New" w:hAnsi="Courier New" w:cs="Courier New"/>
-          <w:sz w:val="22"/>
-          <w:szCs w:val="22"/>
-        </w:rPr>
         <w:t>Ook tijdens de Duitse hereniging in 1989–1990 verdedig</w:t>
       </w:r>
       <w:r>
@@ -2631,7 +2703,23 @@
           <w:sz w:val="22"/>
           <w:szCs w:val="22"/>
         </w:rPr>
-        <w:t xml:space="preserve"> voor een herenigingsproces waarin nationale sentimenten en bestuurlijke besluitvorming de overhand zouden krijgen.</w:t>
+        <w:t xml:space="preserve"> voor een herenigingsproces waarin nationale sentimenten en bestuurlijke besluitvorming de overhand </w:t>
+      </w:r>
+      <w:r>
+        <w:rPr>
+          <w:rFonts w:ascii="Courier New" w:hAnsi="Courier New" w:cs="Courier New"/>
+          <w:sz w:val="22"/>
+          <w:szCs w:val="22"/>
+        </w:rPr>
+        <w:t>hebben</w:t>
+      </w:r>
+      <w:r>
+        <w:rPr>
+          <w:rFonts w:ascii="Courier New" w:hAnsi="Courier New" w:cs="Courier New"/>
+          <w:sz w:val="22"/>
+          <w:szCs w:val="22"/>
+        </w:rPr>
+        <w:t>.</w:t>
       </w:r>
       <w:r>
         <w:rPr>
@@ -2874,7 +2962,39 @@
           <w:sz w:val="22"/>
           <w:szCs w:val="22"/>
         </w:rPr>
-        <w:t>ven.</w:t>
+        <w:t>ven</w:t>
+      </w:r>
+      <w:r>
+        <w:rPr>
+          <w:rFonts w:ascii="Courier New" w:hAnsi="Courier New" w:cs="Courier New"/>
+          <w:sz w:val="22"/>
+          <w:szCs w:val="22"/>
+        </w:rPr>
+        <w:t xml:space="preserve">. </w:t>
+      </w:r>
+      <w:r>
+        <w:rPr>
+          <w:rFonts w:ascii="Courier New" w:hAnsi="Courier New" w:cs="Courier New"/>
+          <w:sz w:val="22"/>
+          <w:szCs w:val="22"/>
+        </w:rPr>
+        <w:t>De Europese schuldencrisis na 2008 vorm</w:t>
+      </w:r>
+      <w:r>
+        <w:rPr>
+          <w:rFonts w:ascii="Courier New" w:hAnsi="Courier New" w:cs="Courier New"/>
+          <w:sz w:val="22"/>
+          <w:szCs w:val="22"/>
+        </w:rPr>
+        <w:t>t voor Habermas</w:t>
+      </w:r>
+      <w:r>
+        <w:rPr>
+          <w:rFonts w:ascii="Courier New" w:hAnsi="Courier New" w:cs="Courier New"/>
+          <w:sz w:val="22"/>
+          <w:szCs w:val="22"/>
+        </w:rPr>
+        <w:t xml:space="preserve"> een nieuwe aanleiding om zich intensief in het politieke debat te mengen.</w:t>
       </w:r>
       <w:r>
         <w:rPr>
@@ -2890,39 +3010,7 @@
           <w:sz w:val="22"/>
           <w:szCs w:val="22"/>
         </w:rPr>
-        <w:t xml:space="preserve">Habermas had altijd verdedigd dat intellectuelen afstand </w:t>
-      </w:r>
-      <w:r>
-        <w:rPr>
-          <w:rFonts w:ascii="Courier New" w:hAnsi="Courier New" w:cs="Courier New"/>
-          <w:sz w:val="22"/>
-          <w:szCs w:val="22"/>
-        </w:rPr>
-        <w:t>hebben te</w:t>
-      </w:r>
-      <w:r>
-        <w:rPr>
-          <w:rFonts w:ascii="Courier New" w:hAnsi="Courier New" w:cs="Courier New"/>
-          <w:sz w:val="22"/>
-          <w:szCs w:val="22"/>
-        </w:rPr>
-        <w:t xml:space="preserve"> bewaren tot de politieke macht. Zijn betrokkenheid bij de Europese integratie br</w:t>
-      </w:r>
-      <w:r>
-        <w:rPr>
-          <w:rFonts w:ascii="Courier New" w:hAnsi="Courier New" w:cs="Courier New"/>
-          <w:sz w:val="22"/>
-          <w:szCs w:val="22"/>
-        </w:rPr>
-        <w:t>engt</w:t>
-      </w:r>
-      <w:r>
-        <w:rPr>
-          <w:rFonts w:ascii="Courier New" w:hAnsi="Courier New" w:cs="Courier New"/>
-          <w:sz w:val="22"/>
-          <w:szCs w:val="22"/>
-        </w:rPr>
-        <w:t xml:space="preserve"> hem steeds dichter bij concrete politieke projecten en politici.</w:t>
+        <w:t>Hij maakt zich zorgen over de toenemende invloed van financiële markten, technocratische instituties en economische belangen op democratische besluitvorming.</w:t>
       </w:r>
       <w:r>
         <w:rPr>
@@ -2938,63 +3026,95 @@
           <w:sz w:val="22"/>
           <w:szCs w:val="22"/>
         </w:rPr>
-        <w:t xml:space="preserve">Die spanning wordt volgens </w:t>
-      </w:r>
-      <w:r>
-        <w:rPr>
-          <w:rFonts w:ascii="Courier New" w:hAnsi="Courier New" w:cs="Courier New"/>
-          <w:sz w:val="22"/>
-          <w:szCs w:val="22"/>
-        </w:rPr>
-        <w:t xml:space="preserve">Verovšek zichtbaar </w:t>
-      </w:r>
-      <w:r>
-        <w:rPr>
-          <w:rFonts w:ascii="Courier New" w:hAnsi="Courier New" w:cs="Courier New"/>
-          <w:sz w:val="22"/>
-          <w:szCs w:val="22"/>
-        </w:rPr>
-        <w:t>wanneer</w:t>
-      </w:r>
-      <w:r>
-        <w:rPr>
-          <w:rFonts w:ascii="Courier New" w:hAnsi="Courier New" w:cs="Courier New"/>
-          <w:sz w:val="22"/>
-          <w:szCs w:val="22"/>
-        </w:rPr>
-        <w:t xml:space="preserve"> Habermas zich nadrukkelijker verb</w:t>
-      </w:r>
-      <w:r>
-        <w:rPr>
-          <w:rFonts w:ascii="Courier New" w:hAnsi="Courier New" w:cs="Courier New"/>
-          <w:sz w:val="22"/>
-          <w:szCs w:val="22"/>
-        </w:rPr>
-        <w:t>indt</w:t>
-      </w:r>
-      <w:r>
-        <w:rPr>
-          <w:rFonts w:ascii="Courier New" w:hAnsi="Courier New" w:cs="Courier New"/>
-          <w:sz w:val="22"/>
-          <w:szCs w:val="22"/>
-        </w:rPr>
-        <w:t xml:space="preserve"> aan het Europese integratieproject. De Europese schuldencrisis na 2008 vorm</w:t>
-      </w:r>
-      <w:r>
-        <w:rPr>
-          <w:rFonts w:ascii="Courier New" w:hAnsi="Courier New" w:cs="Courier New"/>
-          <w:sz w:val="22"/>
-          <w:szCs w:val="22"/>
-        </w:rPr>
-        <w:t>t voor Habermas</w:t>
-      </w:r>
-      <w:r>
-        <w:rPr>
-          <w:rFonts w:ascii="Courier New" w:hAnsi="Courier New" w:cs="Courier New"/>
-          <w:sz w:val="22"/>
-          <w:szCs w:val="22"/>
-        </w:rPr>
-        <w:t xml:space="preserve"> een nieuwe aanleiding om zich intensief in het politieke debat te mengen.</w:t>
+        <w:t>Deze ontwikkeling sl</w:t>
+      </w:r>
+      <w:r>
+        <w:rPr>
+          <w:rFonts w:ascii="Courier New" w:hAnsi="Courier New" w:cs="Courier New"/>
+          <w:sz w:val="22"/>
+          <w:szCs w:val="22"/>
+        </w:rPr>
+        <w:t>ui</w:t>
+      </w:r>
+      <w:r>
+        <w:rPr>
+          <w:rFonts w:ascii="Courier New" w:hAnsi="Courier New" w:cs="Courier New"/>
+          <w:sz w:val="22"/>
+          <w:szCs w:val="22"/>
+        </w:rPr>
+        <w:t xml:space="preserve">t aan bij zijn oudere theorie over de </w:t>
+      </w:r>
+      <w:r>
+        <w:rPr>
+          <w:rFonts w:ascii="Courier New" w:hAnsi="Courier New" w:cs="Courier New"/>
+          <w:sz w:val="22"/>
+          <w:szCs w:val="22"/>
+        </w:rPr>
+        <w:t>‘</w:t>
+      </w:r>
+      <w:r>
+        <w:rPr>
+          <w:rFonts w:ascii="Courier New" w:hAnsi="Courier New" w:cs="Courier New"/>
+          <w:sz w:val="22"/>
+          <w:szCs w:val="22"/>
+        </w:rPr>
+        <w:t>kolonisering van de leefwereld</w:t>
+      </w:r>
+      <w:r>
+        <w:rPr>
+          <w:rFonts w:ascii="Courier New" w:hAnsi="Courier New" w:cs="Courier New"/>
+          <w:sz w:val="22"/>
+          <w:szCs w:val="22"/>
+        </w:rPr>
+        <w:t>’</w:t>
+      </w:r>
+      <w:r>
+        <w:rPr>
+          <w:rFonts w:ascii="Courier New" w:hAnsi="Courier New" w:cs="Courier New"/>
+          <w:sz w:val="22"/>
+          <w:szCs w:val="22"/>
+        </w:rPr>
+        <w:t xml:space="preserve">, waarmee hij </w:t>
+      </w:r>
+      <w:r>
+        <w:rPr>
+          <w:rFonts w:ascii="Courier New" w:hAnsi="Courier New" w:cs="Courier New"/>
+          <w:sz w:val="22"/>
+          <w:szCs w:val="22"/>
+        </w:rPr>
+        <w:t>bedoel</w:t>
+      </w:r>
+      <w:r>
+        <w:rPr>
+          <w:rFonts w:ascii="Courier New" w:hAnsi="Courier New" w:cs="Courier New"/>
+          <w:sz w:val="22"/>
+          <w:szCs w:val="22"/>
+        </w:rPr>
+        <w:t>t</w:t>
+      </w:r>
+      <w:r>
+        <w:rPr>
+          <w:rFonts w:ascii="Courier New" w:hAnsi="Courier New" w:cs="Courier New"/>
+          <w:sz w:val="22"/>
+          <w:szCs w:val="22"/>
+        </w:rPr>
+        <w:t xml:space="preserve"> dat economische en bureaucratische systemen steeds verder doordringen in maatschappelijke verhoudingen </w:t>
+      </w:r>
+      <w:r>
+        <w:rPr>
+          <w:rFonts w:ascii="Courier New" w:hAnsi="Courier New" w:cs="Courier New"/>
+          <w:sz w:val="22"/>
+          <w:szCs w:val="22"/>
+        </w:rPr>
+        <w:t xml:space="preserve">en persoonlijke relaties </w:t>
+      </w:r>
+      <w:r>
+        <w:rPr>
+          <w:rFonts w:ascii="Courier New" w:hAnsi="Courier New" w:cs="Courier New"/>
+          <w:sz w:val="22"/>
+          <w:szCs w:val="22"/>
+        </w:rPr>
+        <w:t>die eigenlijk door communicatie, solidariteit en onderling begrip zouden moeten worden gereguleerd.</w:t>
       </w:r>
       <w:r>
         <w:rPr>
@@ -3010,7 +3130,39 @@
           <w:sz w:val="22"/>
           <w:szCs w:val="22"/>
         </w:rPr>
-        <w:t xml:space="preserve">Hij maakt zich zorgen over de toenemende invloed van financiële markten, technocratische instituties en economische belangen op democratische </w:t>
+        <w:t>In de Europese politiek z</w:t>
+      </w:r>
+      <w:r>
+        <w:rPr>
+          <w:rFonts w:ascii="Courier New" w:hAnsi="Courier New" w:cs="Courier New"/>
+          <w:sz w:val="22"/>
+          <w:szCs w:val="22"/>
+        </w:rPr>
+        <w:t xml:space="preserve">iet Habermas </w:t>
+      </w:r>
+      <w:r>
+        <w:rPr>
+          <w:rFonts w:ascii="Courier New" w:hAnsi="Courier New" w:cs="Courier New"/>
+          <w:sz w:val="22"/>
+          <w:szCs w:val="22"/>
+        </w:rPr>
+        <w:t>dat economische noodzakelijkheden w</w:t>
+      </w:r>
+      <w:r>
+        <w:rPr>
+          <w:rFonts w:ascii="Courier New" w:hAnsi="Courier New" w:cs="Courier New"/>
+          <w:sz w:val="22"/>
+          <w:szCs w:val="22"/>
+        </w:rPr>
+        <w:t>o</w:t>
+      </w:r>
+      <w:r>
+        <w:rPr>
+          <w:rFonts w:ascii="Courier New" w:hAnsi="Courier New" w:cs="Courier New"/>
+          <w:sz w:val="22"/>
+          <w:szCs w:val="22"/>
+        </w:rPr>
+        <w:t xml:space="preserve">rden voorgesteld als onvermijdelijke feiten waarover burgers nauwelijks nog democratische zeggenschap </w:t>
       </w:r>
       <w:r>
         <w:rPr>
@@ -3019,7 +3171,23 @@
           <w:szCs w:val="22"/>
         </w:rPr>
         <w:lastRenderedPageBreak/>
-        <w:t>besluitvorming.</w:t>
+        <w:t>h</w:t>
+      </w:r>
+      <w:r>
+        <w:rPr>
+          <w:rFonts w:ascii="Courier New" w:hAnsi="Courier New" w:cs="Courier New"/>
+          <w:sz w:val="22"/>
+          <w:szCs w:val="22"/>
+        </w:rPr>
+        <w:t>ebb</w:t>
+      </w:r>
+      <w:r>
+        <w:rPr>
+          <w:rFonts w:ascii="Courier New" w:hAnsi="Courier New" w:cs="Courier New"/>
+          <w:sz w:val="22"/>
+          <w:szCs w:val="22"/>
+        </w:rPr>
+        <w:t>en.</w:t>
       </w:r>
       <w:r>
         <w:rPr>
@@ -3035,71 +3203,7 @@
           <w:sz w:val="22"/>
           <w:szCs w:val="22"/>
         </w:rPr>
-        <w:t>Deze ontwikkeling sl</w:t>
-      </w:r>
-      <w:r>
-        <w:rPr>
-          <w:rFonts w:ascii="Courier New" w:hAnsi="Courier New" w:cs="Courier New"/>
-          <w:sz w:val="22"/>
-          <w:szCs w:val="22"/>
-        </w:rPr>
-        <w:t>ui</w:t>
-      </w:r>
-      <w:r>
-        <w:rPr>
-          <w:rFonts w:ascii="Courier New" w:hAnsi="Courier New" w:cs="Courier New"/>
-          <w:sz w:val="22"/>
-          <w:szCs w:val="22"/>
-        </w:rPr>
-        <w:t xml:space="preserve">t aan bij zijn oudere theorie over de </w:t>
-      </w:r>
-      <w:r>
-        <w:rPr>
-          <w:rFonts w:ascii="Courier New" w:hAnsi="Courier New" w:cs="Courier New"/>
-          <w:sz w:val="22"/>
-          <w:szCs w:val="22"/>
-        </w:rPr>
-        <w:t>‘</w:t>
-      </w:r>
-      <w:r>
-        <w:rPr>
-          <w:rFonts w:ascii="Courier New" w:hAnsi="Courier New" w:cs="Courier New"/>
-          <w:sz w:val="22"/>
-          <w:szCs w:val="22"/>
-        </w:rPr>
-        <w:t>kolonisering van de leefwereld</w:t>
-      </w:r>
-      <w:r>
-        <w:rPr>
-          <w:rFonts w:ascii="Courier New" w:hAnsi="Courier New" w:cs="Courier New"/>
-          <w:sz w:val="22"/>
-          <w:szCs w:val="22"/>
-        </w:rPr>
-        <w:t>’</w:t>
-      </w:r>
-      <w:r>
-        <w:rPr>
-          <w:rFonts w:ascii="Courier New" w:hAnsi="Courier New" w:cs="Courier New"/>
-          <w:sz w:val="22"/>
-          <w:szCs w:val="22"/>
-        </w:rPr>
-        <w:t xml:space="preserve">. Daarmee bedoelde hij dat economische en bureaucratische systemen steeds verder doordringen in maatschappelijke verhoudingen </w:t>
-      </w:r>
-      <w:r>
-        <w:rPr>
-          <w:rFonts w:ascii="Courier New" w:hAnsi="Courier New" w:cs="Courier New"/>
-          <w:sz w:val="22"/>
-          <w:szCs w:val="22"/>
-        </w:rPr>
-        <w:t xml:space="preserve">en persoonlijke relaties </w:t>
-      </w:r>
-      <w:r>
-        <w:rPr>
-          <w:rFonts w:ascii="Courier New" w:hAnsi="Courier New" w:cs="Courier New"/>
-          <w:sz w:val="22"/>
-          <w:szCs w:val="22"/>
-        </w:rPr>
-        <w:t>die eigenlijk door communicatie, solidariteit en onderling begrip zouden moeten worden gereguleerd.</w:t>
+        <w:t>Politieke beslissingen moeten volgens hem onderwerp blijven van openbare discussie en democratische verantwoording.</w:t>
       </w:r>
       <w:r>
         <w:rPr>
@@ -3115,55 +3219,7 @@
           <w:sz w:val="22"/>
           <w:szCs w:val="22"/>
         </w:rPr>
-        <w:t>In de Europese politiek z</w:t>
-      </w:r>
-      <w:r>
-        <w:rPr>
-          <w:rFonts w:ascii="Courier New" w:hAnsi="Courier New" w:cs="Courier New"/>
-          <w:sz w:val="22"/>
-          <w:szCs w:val="22"/>
-        </w:rPr>
-        <w:t xml:space="preserve">iet Habermas </w:t>
-      </w:r>
-      <w:r>
-        <w:rPr>
-          <w:rFonts w:ascii="Courier New" w:hAnsi="Courier New" w:cs="Courier New"/>
-          <w:sz w:val="22"/>
-          <w:szCs w:val="22"/>
-        </w:rPr>
-        <w:t>dat economische noodzakelijkheden w</w:t>
-      </w:r>
-      <w:r>
-        <w:rPr>
-          <w:rFonts w:ascii="Courier New" w:hAnsi="Courier New" w:cs="Courier New"/>
-          <w:sz w:val="22"/>
-          <w:szCs w:val="22"/>
-        </w:rPr>
-        <w:t>o</w:t>
-      </w:r>
-      <w:r>
-        <w:rPr>
-          <w:rFonts w:ascii="Courier New" w:hAnsi="Courier New" w:cs="Courier New"/>
-          <w:sz w:val="22"/>
-          <w:szCs w:val="22"/>
-        </w:rPr>
-        <w:t>rden voorgesteld als onvermijdelijke feiten waarover burgers nauwelijks nog democratische zeggenschap h</w:t>
-      </w:r>
-      <w:r>
-        <w:rPr>
-          <w:rFonts w:ascii="Courier New" w:hAnsi="Courier New" w:cs="Courier New"/>
-          <w:sz w:val="22"/>
-          <w:szCs w:val="22"/>
-        </w:rPr>
-        <w:t>ebb</w:t>
-      </w:r>
-      <w:r>
-        <w:rPr>
-          <w:rFonts w:ascii="Courier New" w:hAnsi="Courier New" w:cs="Courier New"/>
-          <w:sz w:val="22"/>
-          <w:szCs w:val="22"/>
-        </w:rPr>
-        <w:t>en.</w:t>
+        <w:t>Verovšek signaleert</w:t>
       </w:r>
       <w:r>
         <w:rPr>
@@ -3179,7 +3235,55 @@
           <w:sz w:val="22"/>
           <w:szCs w:val="22"/>
         </w:rPr>
-        <w:t>Politieke beslissingen moeten volgens hem onderwerp blijven van openbare discussie en democratische verantwoording.</w:t>
+        <w:t>een opvallende ontwikkeling. Terwijl Habermas theoretisch vasthield aan het onderscheid tussen filosofische reflectie en politieke besluitvorming, tr</w:t>
+      </w:r>
+      <w:r>
+        <w:rPr>
+          <w:rFonts w:ascii="Courier New" w:hAnsi="Courier New" w:cs="Courier New"/>
+          <w:sz w:val="22"/>
+          <w:szCs w:val="22"/>
+        </w:rPr>
+        <w:t>eedt</w:t>
+      </w:r>
+      <w:r>
+        <w:rPr>
+          <w:rFonts w:ascii="Courier New" w:hAnsi="Courier New" w:cs="Courier New"/>
+          <w:sz w:val="22"/>
+          <w:szCs w:val="22"/>
+        </w:rPr>
+        <w:t xml:space="preserve"> hij in de praktijk soms op als een uitgesproken pleitbezorger van Europese hervormingen. Hij versch</w:t>
+      </w:r>
+      <w:r>
+        <w:rPr>
+          <w:rFonts w:ascii="Courier New" w:hAnsi="Courier New" w:cs="Courier New"/>
+          <w:sz w:val="22"/>
+          <w:szCs w:val="22"/>
+        </w:rPr>
+        <w:t>ijnt</w:t>
+      </w:r>
+      <w:r>
+        <w:rPr>
+          <w:rFonts w:ascii="Courier New" w:hAnsi="Courier New" w:cs="Courier New"/>
+          <w:sz w:val="22"/>
+          <w:szCs w:val="22"/>
+        </w:rPr>
+        <w:t xml:space="preserve"> zelfs samen met politici op publieke bijeenkomsten en fungeer</w:t>
+      </w:r>
+      <w:r>
+        <w:rPr>
+          <w:rFonts w:ascii="Courier New" w:hAnsi="Courier New" w:cs="Courier New"/>
+          <w:sz w:val="22"/>
+          <w:szCs w:val="22"/>
+        </w:rPr>
+        <w:t>t</w:t>
+      </w:r>
+      <w:r>
+        <w:rPr>
+          <w:rFonts w:ascii="Courier New" w:hAnsi="Courier New" w:cs="Courier New"/>
+          <w:sz w:val="22"/>
+          <w:szCs w:val="22"/>
+        </w:rPr>
+        <w:t xml:space="preserve"> in zekere zin als informeel adviseur.</w:t>
       </w:r>
       <w:r>
         <w:rPr>
@@ -3195,41 +3299,23 @@
           <w:sz w:val="22"/>
           <w:szCs w:val="22"/>
         </w:rPr>
-        <w:t>Verovšek signaleert hier een opvallende ontwikkeling. Terwijl Habermas theoretisch vasthield aan het onderscheid tussen filosofische reflectie en politieke besluitvorming, tr</w:t>
-      </w:r>
-      <w:r>
-        <w:rPr>
-          <w:rFonts w:ascii="Courier New" w:hAnsi="Courier New" w:cs="Courier New"/>
-          <w:sz w:val="22"/>
-          <w:szCs w:val="22"/>
-        </w:rPr>
-        <w:t>eedt</w:t>
-      </w:r>
-      <w:r>
-        <w:rPr>
-          <w:rFonts w:ascii="Courier New" w:hAnsi="Courier New" w:cs="Courier New"/>
-          <w:sz w:val="22"/>
-          <w:szCs w:val="22"/>
-        </w:rPr>
-        <w:t xml:space="preserve"> hij in de praktijk soms op als een uitgesproken pleitbezorger van Europese hervormingen. Hij verscheen zelfs samen met politici op publieke bijeenkomsten en fungeerde in zekere zin als informeel adviseur.</w:t>
-      </w:r>
-    </w:p>
-    <w:p>
-      <w:pPr>
-        <w:spacing w:line="360" w:lineRule="auto"/>
-        <w:rPr>
-          <w:rFonts w:ascii="Courier New" w:hAnsi="Courier New" w:cs="Courier New"/>
-          <w:sz w:val="22"/>
-          <w:szCs w:val="22"/>
-        </w:rPr>
-      </w:pPr>
-      <w:r>
-        <w:rPr>
-          <w:rFonts w:ascii="Courier New" w:hAnsi="Courier New" w:cs="Courier New"/>
-          <w:sz w:val="22"/>
-          <w:szCs w:val="22"/>
-        </w:rPr>
-        <w:t>Daarmee kwam zijn eigen publieke optreden dichter bij de directe politieke beïnvloeding waarvoor hij eerder had gewaarschuwd.</w:t>
+        <w:t>Daarmee k</w:t>
+      </w:r>
+      <w:r>
+        <w:rPr>
+          <w:rFonts w:ascii="Courier New" w:hAnsi="Courier New" w:cs="Courier New"/>
+          <w:sz w:val="22"/>
+          <w:szCs w:val="22"/>
+        </w:rPr>
+        <w:t>omt</w:t>
+      </w:r>
+      <w:r>
+        <w:rPr>
+          <w:rFonts w:ascii="Courier New" w:hAnsi="Courier New" w:cs="Courier New"/>
+          <w:sz w:val="22"/>
+          <w:szCs w:val="22"/>
+        </w:rPr>
+        <w:t xml:space="preserve"> zijn eigen publieke optreden dichter bij de directe politieke beïnvloeding waarvoor hij eerder had gewaarschuwd.</w:t>
       </w:r>
     </w:p>
     <w:p>
@@ -3281,7 +3367,257 @@
           <w:sz w:val="22"/>
           <w:szCs w:val="22"/>
         </w:rPr>
-        <w:t>In het slothoofdstuk bespreekt Verovšek Habermas' publieke optreden tussen 2021 en 2025 en stelt hij de vraag of Habermas misschien een van de laatste vertegenwoordigers was van een bepaald type publieke intellectueel.</w:t>
+        <w:t xml:space="preserve">De laatste jaren van zijn leven neemt de productie van zijn politieke teksten af. Hij reageeert nog wel op de Russische invasie van Oekraïne van 24 februari 2022 en op het geweld van Israël in Gaza na de terroristische aanval van 7 oktober 2023. De Russische aanval is voor hem een schokkende ervaring, </w:t>
+      </w:r>
+      <w:r>
+        <w:rPr>
+          <w:rFonts w:ascii="Courier New" w:hAnsi="Courier New" w:cs="Courier New"/>
+          <w:sz w:val="22"/>
+          <w:szCs w:val="22"/>
+        </w:rPr>
+        <w:t>hij heeft begrip voor</w:t>
+      </w:r>
+      <w:r>
+        <w:rPr>
+          <w:rFonts w:ascii="Courier New" w:hAnsi="Courier New" w:cs="Courier New"/>
+          <w:sz w:val="22"/>
+          <w:szCs w:val="22"/>
+        </w:rPr>
+        <w:t xml:space="preserve"> zijn eigen president </w:t>
+      </w:r>
+      <w:r>
+        <w:rPr>
+          <w:rFonts w:ascii="Courier New" w:hAnsi="Courier New" w:cs="Courier New"/>
+          <w:sz w:val="22"/>
+          <w:szCs w:val="22"/>
+        </w:rPr>
+        <w:t xml:space="preserve">wanneer hij </w:t>
+      </w:r>
+      <w:r>
+        <w:rPr>
+          <w:rFonts w:ascii="Courier New" w:hAnsi="Courier New" w:cs="Courier New"/>
+          <w:sz w:val="22"/>
+          <w:szCs w:val="22"/>
+        </w:rPr>
+        <w:t xml:space="preserve">wat tijd neemt om zijn opties te onderzoeken en </w:t>
+      </w:r>
+      <w:r>
+        <w:rPr>
+          <w:rFonts w:ascii="Courier New" w:hAnsi="Courier New" w:cs="Courier New"/>
+          <w:sz w:val="22"/>
+          <w:szCs w:val="22"/>
+        </w:rPr>
+        <w:t xml:space="preserve">hij </w:t>
+      </w:r>
+      <w:r>
+        <w:rPr>
+          <w:rFonts w:ascii="Courier New" w:hAnsi="Courier New" w:cs="Courier New"/>
+          <w:sz w:val="22"/>
+          <w:szCs w:val="22"/>
+        </w:rPr>
+        <w:t>wijst er</w:t>
+      </w:r>
+      <w:r>
+        <w:rPr>
+          <w:rFonts w:ascii="Courier New" w:hAnsi="Courier New" w:cs="Courier New"/>
+          <w:sz w:val="22"/>
+          <w:szCs w:val="22"/>
+        </w:rPr>
+        <w:t xml:space="preserve"> fijntjes </w:t>
+      </w:r>
+      <w:r>
+        <w:rPr>
+          <w:rFonts w:ascii="Courier New" w:hAnsi="Courier New" w:cs="Courier New"/>
+          <w:sz w:val="22"/>
+          <w:szCs w:val="22"/>
+        </w:rPr>
+        <w:t xml:space="preserve">op dat een oorlog tegen een nucleaire macht nooit gewonnen kan worden. Oekraïne mag de oorlog niet verliezen, </w:t>
+      </w:r>
+      <w:r>
+        <w:rPr>
+          <w:rFonts w:ascii="Courier New" w:hAnsi="Courier New" w:cs="Courier New"/>
+          <w:sz w:val="22"/>
+          <w:szCs w:val="22"/>
+        </w:rPr>
+        <w:t xml:space="preserve">vindt hij, </w:t>
+      </w:r>
+      <w:r>
+        <w:rPr>
+          <w:rFonts w:ascii="Courier New" w:hAnsi="Courier New" w:cs="Courier New"/>
+          <w:sz w:val="22"/>
+          <w:szCs w:val="22"/>
+        </w:rPr>
+        <w:t>maar er zal toch ook onderhandeld moeten worden met de oorlogsmisdadiger Poetin.</w:t>
+      </w:r>
+      <w:r>
+        <w:rPr>
+          <w:rFonts w:ascii="Courier New" w:hAnsi="Courier New" w:cs="Courier New"/>
+          <w:sz w:val="22"/>
+          <w:szCs w:val="22"/>
+        </w:rPr>
+        <w:t xml:space="preserve"> Ten aanzien van Gaza ondertekent hij een algemene verklaring waarin solidariteit wordt uitgesproken voor Israël en de Joden in Duitsland. Het waren reacties voor de Duitse context</w:t>
+      </w:r>
+      <w:r>
+        <w:rPr>
+          <w:rFonts w:ascii="Courier New" w:hAnsi="Courier New" w:cs="Courier New"/>
+          <w:sz w:val="22"/>
+          <w:szCs w:val="22"/>
+        </w:rPr>
+        <w:t xml:space="preserve"> en</w:t>
+      </w:r>
+      <w:r>
+        <w:rPr>
+          <w:rFonts w:ascii="Courier New" w:hAnsi="Courier New" w:cs="Courier New"/>
+          <w:sz w:val="22"/>
+          <w:szCs w:val="22"/>
+        </w:rPr>
+        <w:t xml:space="preserve"> ondertussen </w:t>
+      </w:r>
+      <w:r>
+        <w:rPr>
+          <w:rFonts w:ascii="Courier New" w:hAnsi="Courier New" w:cs="Courier New"/>
+          <w:sz w:val="22"/>
+          <w:szCs w:val="22"/>
+        </w:rPr>
+        <w:t>i</w:t>
+      </w:r>
+      <w:r>
+        <w:rPr>
+          <w:rFonts w:ascii="Courier New" w:hAnsi="Courier New" w:cs="Courier New"/>
+          <w:sz w:val="22"/>
+          <w:szCs w:val="22"/>
+        </w:rPr>
+        <w:t xml:space="preserve">s de wereld </w:t>
+      </w:r>
+      <w:r>
+        <w:rPr>
+          <w:rFonts w:ascii="Courier New" w:hAnsi="Courier New" w:cs="Courier New"/>
+          <w:sz w:val="22"/>
+          <w:szCs w:val="22"/>
+        </w:rPr>
+        <w:t xml:space="preserve">sterk </w:t>
+      </w:r>
+      <w:r>
+        <w:rPr>
+          <w:rFonts w:ascii="Courier New" w:hAnsi="Courier New" w:cs="Courier New"/>
+          <w:sz w:val="22"/>
+          <w:szCs w:val="22"/>
+        </w:rPr>
+        <w:t xml:space="preserve">veranderd, zoals hij zelf al in zijn nieuwe uitgave van </w:t>
+      </w:r>
+      <w:r>
+        <w:rPr>
+          <w:rFonts w:ascii="Courier New" w:hAnsi="Courier New" w:cs="Courier New"/>
+          <w:i/>
+          <w:iCs/>
+          <w:sz w:val="22"/>
+          <w:szCs w:val="22"/>
+        </w:rPr>
+        <w:t>Structurele Transformatie</w:t>
+      </w:r>
+      <w:r>
+        <w:rPr>
+          <w:rFonts w:ascii="Courier New" w:hAnsi="Courier New" w:cs="Courier New"/>
+          <w:sz w:val="22"/>
+          <w:szCs w:val="22"/>
+        </w:rPr>
+        <w:t xml:space="preserve"> had geschreven. De teksten gaan tegenwoordig over landgrenzen heen, er is niet meer één leidend medium en het karakter van de hele deliberatie is veranderd. Het is </w:t>
+      </w:r>
+      <w:r>
+        <w:rPr>
+          <w:rFonts w:ascii="Courier New" w:hAnsi="Courier New" w:cs="Courier New"/>
+          <w:sz w:val="22"/>
+          <w:szCs w:val="22"/>
+        </w:rPr>
+        <w:t xml:space="preserve">allang </w:t>
+      </w:r>
+      <w:r>
+        <w:rPr>
+          <w:rFonts w:ascii="Courier New" w:hAnsi="Courier New" w:cs="Courier New"/>
+          <w:sz w:val="22"/>
+          <w:szCs w:val="22"/>
+        </w:rPr>
+        <w:t>niet meer Habermas’ wereld.</w:t>
+      </w:r>
+      <w:r>
+        <w:rPr>
+          <w:rFonts w:ascii="Courier New" w:hAnsi="Courier New" w:cs="Courier New"/>
+          <w:sz w:val="22"/>
+          <w:szCs w:val="22"/>
+        </w:rPr>
+        <w:t xml:space="preserve">  </w:t>
+      </w:r>
+      <w:r>
+        <w:rPr>
+          <w:rFonts w:ascii="Courier New" w:hAnsi="Courier New" w:cs="Courier New"/>
+          <w:sz w:val="22"/>
+          <w:szCs w:val="22"/>
+        </w:rPr>
+        <w:t xml:space="preserve">Verovšek </w:t>
+      </w:r>
+      <w:r>
+        <w:rPr>
+          <w:rFonts w:ascii="Courier New" w:hAnsi="Courier New" w:cs="Courier New"/>
+          <w:sz w:val="22"/>
+          <w:szCs w:val="22"/>
+        </w:rPr>
+        <w:t xml:space="preserve">vraagt zich </w:t>
+      </w:r>
+      <w:r>
+        <w:rPr>
+          <w:rFonts w:ascii="Courier New" w:hAnsi="Courier New" w:cs="Courier New"/>
+          <w:sz w:val="22"/>
+          <w:szCs w:val="22"/>
+        </w:rPr>
+        <w:t xml:space="preserve">aan het einde van het boek </w:t>
+      </w:r>
+      <w:r>
+        <w:rPr>
+          <w:rFonts w:ascii="Courier New" w:hAnsi="Courier New" w:cs="Courier New"/>
+          <w:sz w:val="22"/>
+          <w:szCs w:val="22"/>
+        </w:rPr>
+        <w:t xml:space="preserve">af of </w:t>
+      </w:r>
+      <w:r>
+        <w:rPr>
+          <w:rFonts w:ascii="Courier New" w:hAnsi="Courier New" w:cs="Courier New"/>
+          <w:sz w:val="22"/>
+          <w:szCs w:val="22"/>
+        </w:rPr>
+        <w:t xml:space="preserve">Habermas misschien </w:t>
+      </w:r>
+      <w:r>
+        <w:rPr>
+          <w:rFonts w:ascii="Courier New" w:hAnsi="Courier New" w:cs="Courier New"/>
+          <w:sz w:val="22"/>
+          <w:szCs w:val="22"/>
+        </w:rPr>
+        <w:t xml:space="preserve">niet </w:t>
+      </w:r>
+      <w:r>
+        <w:rPr>
+          <w:rFonts w:ascii="Courier New" w:hAnsi="Courier New" w:cs="Courier New"/>
+          <w:sz w:val="22"/>
+          <w:szCs w:val="22"/>
+        </w:rPr>
+        <w:t>een van de laatste publieke intellectue</w:t>
+      </w:r>
+      <w:r>
+        <w:rPr>
+          <w:rFonts w:ascii="Courier New" w:hAnsi="Courier New" w:cs="Courier New"/>
+          <w:sz w:val="22"/>
+          <w:szCs w:val="22"/>
+        </w:rPr>
+        <w:t xml:space="preserve">len </w:t>
+      </w:r>
+      <w:r>
+        <w:rPr>
+          <w:rFonts w:ascii="Courier New" w:hAnsi="Courier New" w:cs="Courier New"/>
+          <w:sz w:val="22"/>
+          <w:szCs w:val="22"/>
+        </w:rPr>
+        <w:t>is geweest; een van de laatste</w:t>
       </w:r>
       <w:r>
         <w:rPr>
@@ -3297,7 +3633,23 @@
           <w:sz w:val="22"/>
           <w:szCs w:val="22"/>
         </w:rPr>
-        <w:t>Habermas behoorde tot een generatie waarin gezaghebbende denkers via kranten, tijdschriften en publieke lezingen langdurig invloed konden uitoefenen op nationale politieke discussies.</w:t>
+        <w:t xml:space="preserve">gezaghebbende denkers </w:t>
+      </w:r>
+      <w:r>
+        <w:rPr>
+          <w:rFonts w:ascii="Courier New" w:hAnsi="Courier New" w:cs="Courier New"/>
+          <w:sz w:val="22"/>
+          <w:szCs w:val="22"/>
+        </w:rPr>
+        <w:t xml:space="preserve">die </w:t>
+      </w:r>
+      <w:r>
+        <w:rPr>
+          <w:rFonts w:ascii="Courier New" w:hAnsi="Courier New" w:cs="Courier New"/>
+          <w:sz w:val="22"/>
+          <w:szCs w:val="22"/>
+        </w:rPr>
+        <w:t>via kranten, tijdschriften en publieke lezingen langdurig invloed uitoefenen op nationale politieke discussies.</w:t>
       </w:r>
       <w:r>
         <w:rPr>
@@ -3313,7 +3665,48 @@
           <w:sz w:val="22"/>
           <w:szCs w:val="22"/>
         </w:rPr>
-        <w:t>De hedendaagse publieke sfeer is ingrijpend veranderd. Sociale media, digitale platforms, politieke polarisatie en de versnippering van het medialandschap hebben de voorwaarden voor publieke meningsvorming veranderd.</w:t>
+        <w:t xml:space="preserve">Sociale media, digitale platforms, politieke polarisatie en de versnippering van het medialandschap hebben de voorwaarden voor publieke </w:t>
+      </w:r>
+      <w:r>
+        <w:rPr>
+          <w:rFonts w:ascii="Courier New" w:hAnsi="Courier New" w:cs="Courier New"/>
+          <w:sz w:val="22"/>
+          <w:szCs w:val="22"/>
+        </w:rPr>
+        <w:lastRenderedPageBreak/>
+        <w:t xml:space="preserve">meningsvorming </w:t>
+      </w:r>
+      <w:r>
+        <w:rPr>
+          <w:rFonts w:ascii="Courier New" w:hAnsi="Courier New" w:cs="Courier New"/>
+          <w:sz w:val="22"/>
+          <w:szCs w:val="22"/>
+        </w:rPr>
+        <w:t xml:space="preserve">ingrijpend </w:t>
+      </w:r>
+      <w:r>
+        <w:rPr>
+          <w:rFonts w:ascii="Courier New" w:hAnsi="Courier New" w:cs="Courier New"/>
+          <w:sz w:val="22"/>
+          <w:szCs w:val="22"/>
+        </w:rPr>
+        <w:t>veranderd.</w:t>
+      </w:r>
+      <w:r>
+        <w:rPr>
+          <w:rFonts w:ascii="Courier New" w:hAnsi="Courier New" w:cs="Courier New"/>
+          <w:sz w:val="22"/>
+          <w:szCs w:val="22"/>
+        </w:rPr>
+        <w:t xml:space="preserve"> De</w:t>
+      </w:r>
+      <w:r>
+        <w:rPr>
+          <w:rFonts w:ascii="Courier New" w:hAnsi="Courier New" w:cs="Courier New"/>
+          <w:sz w:val="22"/>
+          <w:szCs w:val="22"/>
+        </w:rPr>
+        <w:t xml:space="preserve"> discussies rond de oorlog in Oekraïne en het conflict in Gaza laten zien hoe moeilijk het is geworden om complexe politieke standpunten in een gepolariseerde publieke omgeving over te brengen.</w:t>
       </w:r>
       <w:r>
         <w:rPr>
@@ -3329,7 +3722,39 @@
           <w:sz w:val="22"/>
           <w:szCs w:val="22"/>
         </w:rPr>
-        <w:t>Verovšek onderzoekt wat deze veranderingen betekenen voor de mogelijkheid van een intellectueel om een breed publiek te bereiken. Ook de discussies rond de oorlog in Oekraïne en het conflict in Gaza laten zien hoe moeilijk het is geworden om complexe politieke standpunten in een gepolariseerde publieke omgeving over te brengen.</w:t>
+        <w:t>De vraag of Habermas de laatste publieke intellectueel was</w:t>
+      </w:r>
+      <w:r>
+        <w:rPr>
+          <w:rFonts w:ascii="Courier New" w:hAnsi="Courier New" w:cs="Courier New"/>
+          <w:sz w:val="22"/>
+          <w:szCs w:val="22"/>
+        </w:rPr>
+        <w:t xml:space="preserve"> draait</w:t>
+      </w:r>
+      <w:r>
+        <w:rPr>
+          <w:rFonts w:ascii="Courier New" w:hAnsi="Courier New" w:cs="Courier New"/>
+          <w:sz w:val="22"/>
+          <w:szCs w:val="22"/>
+        </w:rPr>
+        <w:t xml:space="preserve"> om de vraag of de maatschappelijke omstandigheden waarin een onafhankelijke filosoof gedurende tientallen jaren het publieke debat kon beïnvloeden, nog </w:t>
+      </w:r>
+      <w:r>
+        <w:rPr>
+          <w:rFonts w:ascii="Courier New" w:hAnsi="Courier New" w:cs="Courier New"/>
+          <w:sz w:val="22"/>
+          <w:szCs w:val="22"/>
+        </w:rPr>
+        <w:t xml:space="preserve">wel </w:t>
+      </w:r>
+      <w:r>
+        <w:rPr>
+          <w:rFonts w:ascii="Courier New" w:hAnsi="Courier New" w:cs="Courier New"/>
+          <w:sz w:val="22"/>
+          <w:szCs w:val="22"/>
+        </w:rPr>
+        <w:t>bestaan.</w:t>
       </w:r>
       <w:r>
         <w:rPr>
@@ -3345,32 +3770,39 @@
           <w:sz w:val="22"/>
           <w:szCs w:val="22"/>
         </w:rPr>
-        <w:t xml:space="preserve">De vraag of Habermas de laatste publieke intellectueel was, moet daarom niet letterlijk worden </w:t>
-      </w:r>
-      <w:r>
-        <w:rPr>
-          <w:rFonts w:ascii="Courier New" w:hAnsi="Courier New" w:cs="Courier New"/>
-          <w:sz w:val="22"/>
-          <w:szCs w:val="22"/>
-        </w:rPr>
-        <w:lastRenderedPageBreak/>
-        <w:t>opgevat. Het gaat om de vraag of de maatschappelijke omstandigheden waarin een onafhankelijke filosoof gedurende tientallen jaren het publieke debat kon beïnvloeden, nog bestaan.</w:t>
-      </w:r>
-      <w:r>
-        <w:rPr>
-          <w:rFonts w:ascii="Courier New" w:hAnsi="Courier New" w:cs="Courier New"/>
-          <w:sz w:val="22"/>
-          <w:szCs w:val="22"/>
-        </w:rPr>
-        <w:t xml:space="preserve"> </w:t>
-      </w:r>
-      <w:r>
-        <w:rPr>
-          <w:rFonts w:ascii="Courier New" w:hAnsi="Courier New" w:cs="Courier New"/>
-          <w:sz w:val="22"/>
-          <w:szCs w:val="22"/>
-        </w:rPr>
-        <w:t>De betekenis van Habermas ligt volgens Verovšek uiteindelijk niet alleen in zijn filosofische publicaties, maar ook in zijn voorbeeld van intellectuele verantwoordelijkheid: deelnemen aan het publieke debat, kritisch blijven tegenover politieke macht en de democratische discussie verdedigen. </w:t>
+        <w:t xml:space="preserve">Hoe kun je </w:t>
+      </w:r>
+      <w:r>
+        <w:rPr>
+          <w:rFonts w:ascii="Courier New" w:hAnsi="Courier New" w:cs="Courier New"/>
+          <w:sz w:val="22"/>
+          <w:szCs w:val="22"/>
+        </w:rPr>
+        <w:t>deelnemen aan het publieke debat, kritisch blijven tegenover politieke macht en de democratische discussie verdedigen.</w:t>
+      </w:r>
+      <w:r>
+        <w:rPr>
+          <w:rFonts w:ascii="Courier New" w:hAnsi="Courier New" w:cs="Courier New"/>
+          <w:sz w:val="22"/>
+          <w:szCs w:val="22"/>
+        </w:rPr>
+        <w:t xml:space="preserve"> Habermas had daar zijn manier voor, maar tegenwoordig zijn er andere manieren voor en mensen als Heather Cox Richardson, Timothy Snyder en Anne Applebauwm in de Verenigde Staten, Judith Zeh in Duitsland en Beatrice de Graaf in eigen land zijn daar voorbeelden van.</w:t>
+      </w:r>
+      <w:r>
+        <w:rPr>
+          <w:rFonts w:ascii="Courier New" w:hAnsi="Courier New" w:cs="Courier New"/>
+          <w:sz w:val="22"/>
+          <w:szCs w:val="22"/>
+        </w:rPr>
+        <w:t xml:space="preserve"> Met een andere stijl, met kwaliteit en toch invloedrijk.</w:t>
+      </w:r>
+      <w:r>
+        <w:rPr>
+          <w:rFonts w:ascii="Courier New" w:hAnsi="Courier New" w:cs="Courier New"/>
+          <w:sz w:val="22"/>
+          <w:szCs w:val="22"/>
+        </w:rPr>
+        <w:t> </w:t>
       </w:r>
     </w:p>
     <w:p>
@@ -3389,7 +3821,119 @@
           <w:sz w:val="22"/>
           <w:szCs w:val="22"/>
         </w:rPr>
-        <w:t>De belangrijkste bijdrage van Verovšeks boek is dat het Habermas presenteert als een denker bij wie filosofie en maatschappelijk engagement voortdurend op elkaar betrokken waren. Zijn theoretische werk kan niet volledig worden begrepen zonder zijn politieke interventies, terwijl zijn politieke standpunten mede voortkwamen uit zijn filosofische overtuigingen.</w:t>
+        <w:t xml:space="preserve">Verovšeks </w:t>
+      </w:r>
+      <w:r>
+        <w:rPr>
+          <w:rFonts w:ascii="Courier New" w:hAnsi="Courier New" w:cs="Courier New"/>
+          <w:sz w:val="22"/>
+          <w:szCs w:val="22"/>
+        </w:rPr>
+        <w:t xml:space="preserve">laat </w:t>
+      </w:r>
+      <w:r>
+        <w:rPr>
+          <w:rFonts w:ascii="Courier New" w:hAnsi="Courier New" w:cs="Courier New"/>
+          <w:sz w:val="22"/>
+          <w:szCs w:val="22"/>
+        </w:rPr>
+        <w:t xml:space="preserve">in dit boek heel mooi </w:t>
+      </w:r>
+      <w:r>
+        <w:rPr>
+          <w:rFonts w:ascii="Courier New" w:hAnsi="Courier New" w:cs="Courier New"/>
+          <w:sz w:val="22"/>
+          <w:szCs w:val="22"/>
+        </w:rPr>
+        <w:t xml:space="preserve">zien hoe in het werk van Habermas </w:t>
+      </w:r>
+      <w:r>
+        <w:rPr>
+          <w:rFonts w:ascii="Courier New" w:hAnsi="Courier New" w:cs="Courier New"/>
+          <w:sz w:val="22"/>
+          <w:szCs w:val="22"/>
+        </w:rPr>
+        <w:t xml:space="preserve">filosofie en maatschappelijk engagement voortdurend op elkaar </w:t>
+      </w:r>
+      <w:r>
+        <w:rPr>
+          <w:rFonts w:ascii="Courier New" w:hAnsi="Courier New" w:cs="Courier New"/>
+          <w:sz w:val="22"/>
+          <w:szCs w:val="22"/>
+        </w:rPr>
+        <w:t xml:space="preserve">zijn </w:t>
+      </w:r>
+      <w:r>
+        <w:rPr>
+          <w:rFonts w:ascii="Courier New" w:hAnsi="Courier New" w:cs="Courier New"/>
+          <w:sz w:val="22"/>
+          <w:szCs w:val="22"/>
+        </w:rPr>
+        <w:t xml:space="preserve">betrokken. </w:t>
+      </w:r>
+      <w:r>
+        <w:rPr>
+          <w:rFonts w:ascii="Courier New" w:hAnsi="Courier New" w:cs="Courier New"/>
+          <w:sz w:val="22"/>
+          <w:szCs w:val="22"/>
+        </w:rPr>
+        <w:t>D</w:t>
+      </w:r>
+      <w:r>
+        <w:rPr>
+          <w:rFonts w:ascii="Courier New" w:hAnsi="Courier New" w:cs="Courier New"/>
+          <w:sz w:val="22"/>
+          <w:szCs w:val="22"/>
+        </w:rPr>
+        <w:t xml:space="preserve">at kritisch denken niet noodzakelijk betekent dat </w:t>
+      </w:r>
+      <w:r>
+        <w:rPr>
+          <w:rFonts w:ascii="Courier New" w:hAnsi="Courier New" w:cs="Courier New"/>
+          <w:sz w:val="22"/>
+          <w:szCs w:val="22"/>
+        </w:rPr>
+        <w:t>je als intellectureel</w:t>
+      </w:r>
+      <w:r>
+        <w:rPr>
+          <w:rFonts w:ascii="Courier New" w:hAnsi="Courier New" w:cs="Courier New"/>
+          <w:sz w:val="22"/>
+          <w:szCs w:val="22"/>
+        </w:rPr>
+        <w:t xml:space="preserve"> zelf politieke macht </w:t>
+      </w:r>
+      <w:r>
+        <w:rPr>
+          <w:rFonts w:ascii="Courier New" w:hAnsi="Courier New" w:cs="Courier New"/>
+          <w:sz w:val="22"/>
+          <w:szCs w:val="22"/>
+        </w:rPr>
+        <w:t xml:space="preserve">hebt na te </w:t>
+      </w:r>
+      <w:r>
+        <w:rPr>
+          <w:rFonts w:ascii="Courier New" w:hAnsi="Courier New" w:cs="Courier New"/>
+          <w:sz w:val="22"/>
+          <w:szCs w:val="22"/>
+        </w:rPr>
+        <w:t xml:space="preserve">streven. </w:t>
+      </w:r>
+      <w:r>
+        <w:rPr>
+          <w:rFonts w:ascii="Courier New" w:hAnsi="Courier New" w:cs="Courier New"/>
+          <w:sz w:val="22"/>
+          <w:szCs w:val="22"/>
+        </w:rPr>
+        <w:t>Een bijdrage kan ook liggen in het</w:t>
+      </w:r>
+      <w:r>
+        <w:rPr>
+          <w:rFonts w:ascii="Courier New" w:hAnsi="Courier New" w:cs="Courier New"/>
+          <w:sz w:val="22"/>
+          <w:szCs w:val="22"/>
+        </w:rPr>
+        <w:t xml:space="preserve"> kritisch onderzoeken van bestaande machtsverhoudingen, het verduidelijken van publieke problemen en het stimuleren van democratische meningsvorming.</w:t>
       </w:r>
       <w:r>
         <w:rPr>
@@ -3405,7 +3949,223 @@
           <w:sz w:val="22"/>
           <w:szCs w:val="22"/>
         </w:rPr>
-        <w:t>Het boek maakt bovendien duidelijk dat kritisch denken niet noodzakelijk betekent dat intellectuelen zelf politieke macht moeten nastreven. Hun bijdrage kan juist bestaan uit het kritisch onderzoeken van bestaande machtsverhoudingen, het verduidelijken van publieke problemen en het stimuleren van democratische meningsvorming.</w:t>
+        <w:t xml:space="preserve">Daarin was Habermas een meester. Het wordt ook duidelijk dat je dan </w:t>
+      </w:r>
+      <w:r>
+        <w:rPr>
+          <w:rFonts w:ascii="Courier New" w:hAnsi="Courier New" w:cs="Courier New"/>
+          <w:sz w:val="22"/>
+          <w:szCs w:val="22"/>
+        </w:rPr>
+        <w:t xml:space="preserve">onderdeel </w:t>
+      </w:r>
+      <w:r>
+        <w:rPr>
+          <w:rFonts w:ascii="Courier New" w:hAnsi="Courier New" w:cs="Courier New"/>
+          <w:sz w:val="22"/>
+          <w:szCs w:val="22"/>
+        </w:rPr>
+        <w:t>kunt</w:t>
+      </w:r>
+      <w:r>
+        <w:rPr>
+          <w:rFonts w:ascii="Courier New" w:hAnsi="Courier New" w:cs="Courier New"/>
+          <w:sz w:val="22"/>
+          <w:szCs w:val="22"/>
+        </w:rPr>
+        <w:t xml:space="preserve"> worden van de politieke stri</w:t>
+      </w:r>
+      <w:r>
+        <w:rPr>
+          <w:rFonts w:ascii="Courier New" w:hAnsi="Courier New" w:cs="Courier New"/>
+          <w:sz w:val="22"/>
+          <w:szCs w:val="22"/>
+        </w:rPr>
+        <w:t>jd en dat je die</w:t>
+      </w:r>
+      <w:r>
+        <w:rPr>
+          <w:rFonts w:ascii="Courier New" w:hAnsi="Courier New" w:cs="Courier New"/>
+          <w:sz w:val="22"/>
+          <w:szCs w:val="22"/>
+        </w:rPr>
+        <w:t xml:space="preserve"> spanning niet altijd </w:t>
+      </w:r>
+      <w:r>
+        <w:rPr>
+          <w:rFonts w:ascii="Courier New" w:hAnsi="Courier New" w:cs="Courier New"/>
+          <w:sz w:val="22"/>
+          <w:szCs w:val="22"/>
+        </w:rPr>
+        <w:t xml:space="preserve">kunt </w:t>
+      </w:r>
+      <w:r>
+        <w:rPr>
+          <w:rFonts w:ascii="Courier New" w:hAnsi="Courier New" w:cs="Courier New"/>
+          <w:sz w:val="22"/>
+          <w:szCs w:val="22"/>
+        </w:rPr>
+        <w:t xml:space="preserve">oplossen. </w:t>
+      </w:r>
+      <w:r>
+        <w:rPr>
+          <w:rFonts w:ascii="Courier New" w:hAnsi="Courier New" w:cs="Courier New"/>
+          <w:sz w:val="22"/>
+          <w:szCs w:val="22"/>
+        </w:rPr>
+        <w:t>W</w:t>
+      </w:r>
+      <w:r>
+        <w:rPr>
+          <w:rFonts w:ascii="Courier New" w:hAnsi="Courier New" w:cs="Courier New"/>
+          <w:sz w:val="22"/>
+          <w:szCs w:val="22"/>
+        </w:rPr>
+        <w:t xml:space="preserve">elke verantwoordelijkheid </w:t>
+      </w:r>
+      <w:r>
+        <w:rPr>
+          <w:rFonts w:ascii="Courier New" w:hAnsi="Courier New" w:cs="Courier New"/>
+          <w:sz w:val="22"/>
+          <w:szCs w:val="22"/>
+        </w:rPr>
+        <w:t>heeft de</w:t>
+      </w:r>
+      <w:r>
+        <w:rPr>
+          <w:rFonts w:ascii="Courier New" w:hAnsi="Courier New" w:cs="Courier New"/>
+          <w:sz w:val="22"/>
+          <w:szCs w:val="22"/>
+        </w:rPr>
+        <w:t xml:space="preserve"> intellectue</w:t>
+      </w:r>
+      <w:r>
+        <w:rPr>
+          <w:rFonts w:ascii="Courier New" w:hAnsi="Courier New" w:cs="Courier New"/>
+          <w:sz w:val="22"/>
+          <w:szCs w:val="22"/>
+        </w:rPr>
+        <w:t>el</w:t>
+      </w:r>
+      <w:r>
+        <w:rPr>
+          <w:rFonts w:ascii="Courier New" w:hAnsi="Courier New" w:cs="Courier New"/>
+          <w:sz w:val="22"/>
+          <w:szCs w:val="22"/>
+        </w:rPr>
+        <w:t xml:space="preserve"> voor de democratische samenleving waarin </w:t>
+      </w:r>
+      <w:r>
+        <w:rPr>
+          <w:rFonts w:ascii="Courier New" w:hAnsi="Courier New" w:cs="Courier New"/>
+          <w:sz w:val="22"/>
+          <w:szCs w:val="22"/>
+        </w:rPr>
+        <w:t>hij leeft</w:t>
+      </w:r>
+      <w:r>
+        <w:rPr>
+          <w:rFonts w:ascii="Courier New" w:hAnsi="Courier New" w:cs="Courier New"/>
+          <w:sz w:val="22"/>
+          <w:szCs w:val="22"/>
+        </w:rPr>
+        <w:t xml:space="preserve">? </w:t>
+      </w:r>
+      <w:r>
+        <w:rPr>
+          <w:rFonts w:ascii="Courier New" w:hAnsi="Courier New" w:cs="Courier New"/>
+          <w:sz w:val="22"/>
+          <w:szCs w:val="22"/>
+        </w:rPr>
+        <w:t xml:space="preserve">Voor Habermas was het duidelijk dat je als </w:t>
+      </w:r>
+      <w:r>
+        <w:rPr>
+          <w:rFonts w:ascii="Courier New" w:hAnsi="Courier New" w:cs="Courier New"/>
+          <w:sz w:val="22"/>
+          <w:szCs w:val="22"/>
+        </w:rPr>
+        <w:t>filoso</w:t>
+      </w:r>
+      <w:r>
+        <w:rPr>
+          <w:rFonts w:ascii="Courier New" w:hAnsi="Courier New" w:cs="Courier New"/>
+          <w:sz w:val="22"/>
+          <w:szCs w:val="22"/>
+        </w:rPr>
+        <w:t>of</w:t>
+      </w:r>
+      <w:r>
+        <w:rPr>
+          <w:rFonts w:ascii="Courier New" w:hAnsi="Courier New" w:cs="Courier New"/>
+          <w:sz w:val="22"/>
+          <w:szCs w:val="22"/>
+        </w:rPr>
+        <w:t xml:space="preserve"> niet boven de democratie </w:t>
+      </w:r>
+      <w:r>
+        <w:rPr>
+          <w:rFonts w:ascii="Courier New" w:hAnsi="Courier New" w:cs="Courier New"/>
+          <w:sz w:val="22"/>
+          <w:szCs w:val="22"/>
+        </w:rPr>
+        <w:t xml:space="preserve">moet </w:t>
+      </w:r>
+      <w:r>
+        <w:rPr>
+          <w:rFonts w:ascii="Courier New" w:hAnsi="Courier New" w:cs="Courier New"/>
+          <w:sz w:val="22"/>
+          <w:szCs w:val="22"/>
+        </w:rPr>
+        <w:t>staan</w:t>
+      </w:r>
+      <w:r>
+        <w:rPr>
+          <w:rFonts w:ascii="Courier New" w:hAnsi="Courier New" w:cs="Courier New"/>
+          <w:sz w:val="22"/>
+          <w:szCs w:val="22"/>
+        </w:rPr>
+        <w:t xml:space="preserve"> en het beter past er</w:t>
+      </w:r>
+      <w:r>
+        <w:rPr>
+          <w:rFonts w:ascii="Courier New" w:hAnsi="Courier New" w:cs="Courier New"/>
+          <w:sz w:val="22"/>
+          <w:szCs w:val="22"/>
+        </w:rPr>
+        <w:t xml:space="preserve"> als kritische burgers aan deel</w:t>
+      </w:r>
+      <w:r>
+        <w:rPr>
+          <w:rFonts w:ascii="Courier New" w:hAnsi="Courier New" w:cs="Courier New"/>
+          <w:sz w:val="22"/>
+          <w:szCs w:val="22"/>
+        </w:rPr>
+        <w:t xml:space="preserve"> te </w:t>
+      </w:r>
+      <w:r>
+        <w:rPr>
+          <w:rFonts w:ascii="Courier New" w:hAnsi="Courier New" w:cs="Courier New"/>
+          <w:sz w:val="22"/>
+          <w:szCs w:val="22"/>
+        </w:rPr>
+        <w:t>ne</w:t>
+      </w:r>
+      <w:r>
+        <w:rPr>
+          <w:rFonts w:ascii="Courier New" w:hAnsi="Courier New" w:cs="Courier New"/>
+          <w:sz w:val="22"/>
+          <w:szCs w:val="22"/>
+        </w:rPr>
+        <w:t>men met</w:t>
+      </w:r>
+      <w:r>
+        <w:rPr>
+          <w:rFonts w:ascii="Courier New" w:hAnsi="Courier New" w:cs="Courier New"/>
+          <w:sz w:val="22"/>
+          <w:szCs w:val="22"/>
+        </w:rPr>
+        <w:t xml:space="preserve"> de overtuigingskracht van argumenten.</w:t>
       </w:r>
       <w:r>
         <w:rPr>
@@ -3421,58 +4181,39 @@
           <w:sz w:val="22"/>
           <w:szCs w:val="22"/>
         </w:rPr>
-        <w:t>Daarbij blijft een spanning bestaan tussen betrokkenheid</w:t>
-      </w:r>
-      <w:r>
-        <w:rPr>
-          <w:rFonts w:ascii="Courier New" w:hAnsi="Courier New" w:cs="Courier New"/>
-          <w:sz w:val="22"/>
-          <w:szCs w:val="22"/>
-        </w:rPr>
-        <w:t xml:space="preserve"> en onafhankelijkheid, deelname en distantie</w:t>
-      </w:r>
-      <w:r>
-        <w:rPr>
-          <w:rFonts w:ascii="Courier New" w:hAnsi="Courier New" w:cs="Courier New"/>
-          <w:sz w:val="22"/>
-          <w:szCs w:val="22"/>
-        </w:rPr>
-        <w:t>. Wie zich intensief mengt in politieke discussies, loopt het risico onderdeel te worden van de politieke strijd die hij kritisch wil onderzoeken. Habermas wist die spanning niet altijd op te lossen. Verovšek maakt juist deze wisselwerking tot een belangrijk onderwerp van zijn analyse.</w:t>
-      </w:r>
-    </w:p>
-    <w:p>
-      <w:pPr>
-        <w:spacing w:line="360" w:lineRule="auto"/>
-        <w:ind w:firstLine="720"/>
-        <w:rPr>
-          <w:rFonts w:ascii="Courier New" w:hAnsi="Courier New" w:cs="Courier New"/>
-          <w:sz w:val="22"/>
-          <w:szCs w:val="22"/>
-        </w:rPr>
-      </w:pPr>
-      <w:r>
-        <w:rPr>
-          <w:rFonts w:ascii="Courier New" w:hAnsi="Courier New" w:cs="Courier New"/>
-          <w:sz w:val="22"/>
-          <w:szCs w:val="22"/>
-        </w:rPr>
-        <w:t>Uiteindelijk draait het boek om een fundamentele vraag: welke verantwoordelijkheid dragen intellectuelen voor de democratische samenleving waarin zij leven? Habermas' antwoord was dat filosofen niet boven de democratie staan, maar er als kritische burgers aan moeten deelnemen. Hun gezag berust niet op hun academische positie, maar op de overtuigingskracht van hun argumenten.</w:t>
-      </w:r>
-      <w:r>
-        <w:rPr>
-          <w:rFonts w:ascii="Courier New" w:hAnsi="Courier New" w:cs="Courier New"/>
-          <w:sz w:val="22"/>
-          <w:szCs w:val="22"/>
-        </w:rPr>
-        <w:t xml:space="preserve"> </w:t>
-      </w:r>
-      <w:r>
-        <w:rPr>
-          <w:rFonts w:ascii="Courier New" w:hAnsi="Courier New" w:cs="Courier New"/>
-          <w:sz w:val="22"/>
-          <w:szCs w:val="22"/>
-        </w:rPr>
-        <w:t>Verovšek laat daarmee zien dat Habermas' levenslange verdediging van democratische openbaarheid zowel een filosofisch project als een maatschappelijke praktijk was. De publieke intellectueel is in deze benadering niet degene die de samenleving vertelt wat zij moet denken, maar degene die helpt de voorwaarden in stand te houden waaronder burgers zelfstandig, kritisch en gezamenlijk kunnen oordelen.</w:t>
+        <w:t>De publieke intellectueel is in deze benadering niet degene die de samenleving vertelt wat zij moet denken, maar degene die helpt de voorwaarden in stand te houden waaronder burgers zelfstandig, kritisch en gezamenlijk kunnen oordelen</w:t>
+      </w:r>
+      <w:r>
+        <w:rPr>
+          <w:rFonts w:ascii="Courier New" w:hAnsi="Courier New" w:cs="Courier New"/>
+          <w:sz w:val="22"/>
+          <w:szCs w:val="22"/>
+        </w:rPr>
+        <w:t xml:space="preserve"> en daar de munitie voor aan te dragen</w:t>
+      </w:r>
+      <w:r>
+        <w:rPr>
+          <w:rFonts w:ascii="Courier New" w:hAnsi="Courier New" w:cs="Courier New"/>
+          <w:sz w:val="22"/>
+          <w:szCs w:val="22"/>
+        </w:rPr>
+        <w:t>.</w:t>
+      </w:r>
+      <w:r>
+        <w:rPr>
+          <w:rFonts w:ascii="Courier New" w:hAnsi="Courier New" w:cs="Courier New"/>
+          <w:sz w:val="22"/>
+          <w:szCs w:val="22"/>
+        </w:rPr>
+        <w:t xml:space="preserve"> Deze munitie hebben we komende jaren nodig en mensen als Habermas hebben </w:t>
+      </w:r>
+      <w:r>
+        <w:rPr>
+          <w:rFonts w:ascii="Courier New" w:hAnsi="Courier New" w:cs="Courier New"/>
+          <w:sz w:val="22"/>
+          <w:szCs w:val="22"/>
+        </w:rPr>
+        <w:t>we heel erg nodig.</w:t>
       </w:r>
     </w:p>
     <w:p>
@@ -3510,6 +4251,7 @@
           <w:sz w:val="22"/>
           <w:szCs w:val="22"/>
         </w:rPr>
+        <w:lastRenderedPageBreak/>
         <w:t>Verovšek</w:t>
       </w:r>
       <w:r>

</xml_diff>

<commit_message>
26-10-27, Deelname en distantie bijgewerkt
</commit_message>
<xml_diff>
--- a/BlogsWord/Deelnameendistantie.docx
+++ b/BlogsWord/Deelnameendistantie.docx
@@ -138,7 +138,23 @@
           <w:sz w:val="22"/>
           <w:szCs w:val="22"/>
         </w:rPr>
-        <w:t xml:space="preserve">lees. Dat ‘vriendengroepje’ bestaat uit John Dewey, Hannah Arendt, Richard Bernstein en Jürgen Habermas. Dit jaar overleed </w:t>
+        <w:t>lees. Dat ‘vriendengroepje’ bestaat uit John Dewey, Hannah Arendt, Richard Bernstein en Jürgen Habermas</w:t>
+      </w:r>
+      <w:r>
+        <w:rPr>
+          <w:rFonts w:ascii="Courier New" w:hAnsi="Courier New" w:cs="Courier New"/>
+          <w:sz w:val="22"/>
+          <w:szCs w:val="22"/>
+        </w:rPr>
+        <w:t>, filosofen die pendelen tussen het denken over en de moderne samenleving zelf.</w:t>
+      </w:r>
+      <w:r>
+        <w:rPr>
+          <w:rFonts w:ascii="Courier New" w:hAnsi="Courier New" w:cs="Courier New"/>
+          <w:sz w:val="22"/>
+          <w:szCs w:val="22"/>
+        </w:rPr>
+        <w:t xml:space="preserve"> Dit jaar overleed </w:t>
       </w:r>
       <w:r>
         <w:rPr>
@@ -202,7 +218,15 @@
           <w:sz w:val="22"/>
           <w:szCs w:val="22"/>
         </w:rPr>
-        <w:t>, maar er zat ook nog een andere kant aan Habermas</w:t>
+        <w:t>. E</w:t>
+      </w:r>
+      <w:r>
+        <w:rPr>
+          <w:rFonts w:ascii="Courier New" w:hAnsi="Courier New" w:cs="Courier New"/>
+          <w:sz w:val="22"/>
+          <w:szCs w:val="22"/>
+        </w:rPr>
+        <w:t>r zat ook nog een andere kant aan Habermas</w:t>
       </w:r>
       <w:r>
         <w:rPr>
@@ -226,7 +250,7 @@
           <w:sz w:val="22"/>
           <w:szCs w:val="22"/>
         </w:rPr>
-        <w:t xml:space="preserve"> mengde hij zich </w:t>
+        <w:t xml:space="preserve"> mengde zich </w:t>
       </w:r>
       <w:r>
         <w:rPr>
@@ -242,7 +266,23 @@
           <w:sz w:val="22"/>
           <w:szCs w:val="22"/>
         </w:rPr>
-        <w:t xml:space="preserve">sinds de jaren vijftig in allerlei </w:t>
+        <w:t xml:space="preserve">sinds de jaren vijftig </w:t>
+      </w:r>
+      <w:r>
+        <w:rPr>
+          <w:rFonts w:ascii="Courier New" w:hAnsi="Courier New" w:cs="Courier New"/>
+          <w:sz w:val="22"/>
+          <w:szCs w:val="22"/>
+        </w:rPr>
+        <w:t xml:space="preserve">van de twintigste eeuw </w:t>
+      </w:r>
+      <w:r>
+        <w:rPr>
+          <w:rFonts w:ascii="Courier New" w:hAnsi="Courier New" w:cs="Courier New"/>
+          <w:sz w:val="22"/>
+          <w:szCs w:val="22"/>
+        </w:rPr>
+        <w:t xml:space="preserve">in allerlei </w:t>
       </w:r>
       <w:r>
         <w:rPr>
@@ -310,6 +350,14 @@
           <w:sz w:val="22"/>
           <w:szCs w:val="22"/>
         </w:rPr>
+        <w:t xml:space="preserve">Want </w:t>
+      </w:r>
+      <w:r>
+        <w:rPr>
+          <w:rFonts w:ascii="Courier New" w:hAnsi="Courier New" w:cs="Courier New"/>
+          <w:sz w:val="22"/>
+          <w:szCs w:val="22"/>
+        </w:rPr>
         <w:t xml:space="preserve">Habermas was </w:t>
       </w:r>
       <w:r>
@@ -390,7 +438,23 @@
           <w:sz w:val="22"/>
           <w:szCs w:val="22"/>
         </w:rPr>
-        <w:t xml:space="preserve">. Over dat laatste gaat </w:t>
+        <w:t>. Over d</w:t>
+      </w:r>
+      <w:r>
+        <w:rPr>
+          <w:rFonts w:ascii="Courier New" w:hAnsi="Courier New" w:cs="Courier New"/>
+          <w:sz w:val="22"/>
+          <w:szCs w:val="22"/>
+        </w:rPr>
+        <w:t xml:space="preserve">e rol van Habermas als publiek intellectueel </w:t>
+      </w:r>
+      <w:r>
+        <w:rPr>
+          <w:rFonts w:ascii="Courier New" w:hAnsi="Courier New" w:cs="Courier New"/>
+          <w:sz w:val="22"/>
+          <w:szCs w:val="22"/>
+        </w:rPr>
+        <w:t xml:space="preserve"> gaat </w:t>
       </w:r>
       <w:r>
         <w:rPr>
@@ -422,7 +486,23 @@
           <w:sz w:val="22"/>
           <w:szCs w:val="22"/>
         </w:rPr>
-        <w:t xml:space="preserve">Zijn theorieën over communicatieve rationaliteit, democratie, rechtvaardigheid en de publieke sfeer vormen </w:t>
+        <w:t xml:space="preserve">Zijn theorieën over communicatieve rationaliteit, democratie, rechtvaardigheid en de publieke sfeer </w:t>
+      </w:r>
+      <w:r>
+        <w:rPr>
+          <w:rFonts w:ascii="Courier New" w:hAnsi="Courier New" w:cs="Courier New"/>
+          <w:sz w:val="22"/>
+          <w:szCs w:val="22"/>
+        </w:rPr>
+        <w:t>worden</w:t>
+      </w:r>
+      <w:r>
+        <w:rPr>
+          <w:rFonts w:ascii="Courier New" w:hAnsi="Courier New" w:cs="Courier New"/>
+          <w:sz w:val="22"/>
+          <w:szCs w:val="22"/>
+        </w:rPr>
+        <w:t xml:space="preserve"> </w:t>
       </w:r>
       <w:r>
         <w:rPr>
@@ -438,7 +518,15 @@
           <w:sz w:val="22"/>
           <w:szCs w:val="22"/>
         </w:rPr>
-        <w:t xml:space="preserve">de achtergrond van </w:t>
+        <w:t>verweven met de</w:t>
+      </w:r>
+      <w:r>
+        <w:rPr>
+          <w:rFonts w:ascii="Courier New" w:hAnsi="Courier New" w:cs="Courier New"/>
+          <w:sz w:val="22"/>
+          <w:szCs w:val="22"/>
+        </w:rPr>
+        <w:t xml:space="preserve"> </w:t>
       </w:r>
       <w:r>
         <w:rPr>
@@ -665,7 +753,16 @@
           <w:sz w:val="22"/>
           <w:szCs w:val="22"/>
         </w:rPr>
-        <w:t>Politieke en maatschappelijke discussies waren voor</w:t>
+        <w:t xml:space="preserve">Politieke en maatschappelijke discussies </w:t>
+      </w:r>
+      <w:r>
+        <w:rPr>
+          <w:rFonts w:ascii="Courier New" w:hAnsi="Courier New" w:cs="Courier New"/>
+          <w:sz w:val="22"/>
+          <w:szCs w:val="22"/>
+        </w:rPr>
+        <w:lastRenderedPageBreak/>
+        <w:t>waren voor</w:t>
       </w:r>
       <w:r>
         <w:rPr>
@@ -697,6 +794,78 @@
           <w:sz w:val="22"/>
           <w:szCs w:val="22"/>
         </w:rPr>
+        <w:t>. Daaraan</w:t>
+      </w:r>
+      <w:r>
+        <w:rPr>
+          <w:rFonts w:ascii="Courier New" w:hAnsi="Courier New" w:cs="Courier New"/>
+          <w:sz w:val="22"/>
+          <w:szCs w:val="22"/>
+        </w:rPr>
+        <w:t xml:space="preserve"> wilde </w:t>
+      </w:r>
+      <w:r>
+        <w:rPr>
+          <w:rFonts w:ascii="Courier New" w:hAnsi="Courier New" w:cs="Courier New"/>
+          <w:sz w:val="22"/>
+          <w:szCs w:val="22"/>
+        </w:rPr>
+        <w:t xml:space="preserve">hij actief </w:t>
+      </w:r>
+      <w:r>
+        <w:rPr>
+          <w:rFonts w:ascii="Courier New" w:hAnsi="Courier New" w:cs="Courier New"/>
+          <w:sz w:val="22"/>
+          <w:szCs w:val="22"/>
+        </w:rPr>
+        <w:t>meedoen</w:t>
+      </w:r>
+      <w:r>
+        <w:rPr>
+          <w:rFonts w:ascii="Courier New" w:hAnsi="Courier New" w:cs="Courier New"/>
+          <w:sz w:val="22"/>
+          <w:szCs w:val="22"/>
+        </w:rPr>
+        <w:t xml:space="preserve">, zonder daarbij overigens </w:t>
+      </w:r>
+      <w:r>
+        <w:rPr>
+          <w:rFonts w:ascii="Courier New" w:hAnsi="Courier New" w:cs="Courier New"/>
+          <w:sz w:val="22"/>
+          <w:szCs w:val="22"/>
+        </w:rPr>
+        <w:t xml:space="preserve">als hoogleraar filosofie </w:t>
+      </w:r>
+      <w:r>
+        <w:rPr>
+          <w:rFonts w:ascii="Courier New" w:hAnsi="Courier New" w:cs="Courier New"/>
+          <w:sz w:val="22"/>
+          <w:szCs w:val="22"/>
+        </w:rPr>
+        <w:t>a</w:t>
+      </w:r>
+      <w:r>
+        <w:rPr>
+          <w:rFonts w:ascii="Courier New" w:hAnsi="Courier New" w:cs="Courier New"/>
+          <w:sz w:val="22"/>
+          <w:szCs w:val="22"/>
+        </w:rPr>
+        <w:t>anspraak te willen maken</w:t>
+      </w:r>
+      <w:r>
+        <w:rPr>
+          <w:rFonts w:ascii="Courier New" w:hAnsi="Courier New" w:cs="Courier New"/>
+          <w:sz w:val="22"/>
+          <w:szCs w:val="22"/>
+        </w:rPr>
+        <w:t xml:space="preserve"> op een bevoorrechte positie.</w:t>
+      </w:r>
+      <w:r>
+        <w:rPr>
+          <w:rFonts w:ascii="Courier New" w:hAnsi="Courier New" w:cs="Courier New"/>
+          <w:sz w:val="22"/>
+          <w:szCs w:val="22"/>
+        </w:rPr>
         <w:t xml:space="preserve"> </w:t>
       </w:r>
       <w:r>
@@ -705,56 +874,15 @@
           <w:sz w:val="22"/>
           <w:szCs w:val="22"/>
         </w:rPr>
-        <w:t>waaraan hij wilde meedoen</w:t>
-      </w:r>
-      <w:r>
-        <w:rPr>
-          <w:rFonts w:ascii="Courier New" w:hAnsi="Courier New" w:cs="Courier New"/>
-          <w:sz w:val="22"/>
-          <w:szCs w:val="22"/>
-        </w:rPr>
-        <w:t xml:space="preserve">, zonder daarbij overigens </w:t>
-      </w:r>
-      <w:r>
-        <w:rPr>
-          <w:rFonts w:ascii="Courier New" w:hAnsi="Courier New" w:cs="Courier New"/>
-          <w:sz w:val="22"/>
-          <w:szCs w:val="22"/>
-        </w:rPr>
-        <w:t xml:space="preserve">als hoogleraar filosofie </w:t>
-      </w:r>
-      <w:r>
-        <w:rPr>
-          <w:rFonts w:ascii="Courier New" w:hAnsi="Courier New" w:cs="Courier New"/>
-          <w:sz w:val="22"/>
-          <w:szCs w:val="22"/>
-        </w:rPr>
-        <w:t>a</w:t>
-      </w:r>
-      <w:r>
-        <w:rPr>
-          <w:rFonts w:ascii="Courier New" w:hAnsi="Courier New" w:cs="Courier New"/>
-          <w:sz w:val="22"/>
-          <w:szCs w:val="22"/>
-        </w:rPr>
-        <w:t xml:space="preserve">anspraak te </w:t>
-      </w:r>
-      <w:r>
-        <w:rPr>
-          <w:rFonts w:ascii="Courier New" w:hAnsi="Courier New" w:cs="Courier New"/>
-          <w:sz w:val="22"/>
-          <w:szCs w:val="22"/>
-        </w:rPr>
-        <w:lastRenderedPageBreak/>
-        <w:t>willen maken</w:t>
-      </w:r>
-      <w:r>
-        <w:rPr>
-          <w:rFonts w:ascii="Courier New" w:hAnsi="Courier New" w:cs="Courier New"/>
-          <w:sz w:val="22"/>
-          <w:szCs w:val="22"/>
-        </w:rPr>
-        <w:t xml:space="preserve"> op een bevoorrechte positie.</w:t>
+        <w:t>Hij zocht de publieke ruimten op die d</w:t>
+      </w:r>
+      <w:r>
+        <w:rPr>
+          <w:rFonts w:ascii="Courier New" w:hAnsi="Courier New" w:cs="Courier New"/>
+          <w:sz w:val="22"/>
+          <w:szCs w:val="22"/>
+        </w:rPr>
+        <w:t>emocratie</w:t>
       </w:r>
       <w:r>
         <w:rPr>
@@ -770,7 +898,7 @@
           <w:sz w:val="22"/>
           <w:szCs w:val="22"/>
         </w:rPr>
-        <w:t>Democratie</w:t>
+        <w:t>heeft</w:t>
       </w:r>
       <w:r>
         <w:rPr>
@@ -786,30 +914,6 @@
           <w:sz w:val="22"/>
           <w:szCs w:val="22"/>
         </w:rPr>
-        <w:t>heeft</w:t>
-      </w:r>
-      <w:r>
-        <w:rPr>
-          <w:rFonts w:ascii="Courier New" w:hAnsi="Courier New" w:cs="Courier New"/>
-          <w:sz w:val="22"/>
-          <w:szCs w:val="22"/>
-        </w:rPr>
-        <w:t xml:space="preserve"> maatschappelijke ruimten</w:t>
-      </w:r>
-      <w:r>
-        <w:rPr>
-          <w:rFonts w:ascii="Courier New" w:hAnsi="Courier New" w:cs="Courier New"/>
-          <w:sz w:val="22"/>
-          <w:szCs w:val="22"/>
-        </w:rPr>
-        <w:t> </w:t>
-      </w:r>
-      <w:r>
-        <w:rPr>
-          <w:rFonts w:ascii="Courier New" w:hAnsi="Courier New" w:cs="Courier New"/>
-          <w:sz w:val="22"/>
-          <w:szCs w:val="22"/>
-        </w:rPr>
         <w:t xml:space="preserve">nodig </w:t>
       </w:r>
       <w:r>
@@ -818,7 +922,7 @@
           <w:sz w:val="22"/>
           <w:szCs w:val="22"/>
         </w:rPr>
-        <w:t>waar</w:t>
+        <w:t>voor</w:t>
       </w:r>
       <w:r>
         <w:rPr>
@@ -834,6 +938,14 @@
           <w:sz w:val="22"/>
           <w:szCs w:val="22"/>
         </w:rPr>
+        <w:t xml:space="preserve">om </w:t>
+      </w:r>
+      <w:r>
+        <w:rPr>
+          <w:rFonts w:ascii="Courier New" w:hAnsi="Courier New" w:cs="Courier New"/>
+          <w:sz w:val="22"/>
+          <w:szCs w:val="22"/>
+        </w:rPr>
         <w:t xml:space="preserve">met elkaar </w:t>
       </w:r>
       <w:r>
@@ -842,15 +954,47 @@
           <w:sz w:val="22"/>
           <w:szCs w:val="22"/>
         </w:rPr>
-        <w:t xml:space="preserve">informatie uitwisselen, argumenten bespreken en </w:t>
-      </w:r>
-      <w:r>
-        <w:rPr>
-          <w:rFonts w:ascii="Courier New" w:hAnsi="Courier New" w:cs="Courier New"/>
-          <w:sz w:val="22"/>
-          <w:szCs w:val="22"/>
-        </w:rPr>
-        <w:t xml:space="preserve">waar </w:t>
+        <w:t>informatie uit</w:t>
+      </w:r>
+      <w:r>
+        <w:rPr>
+          <w:rFonts w:ascii="Courier New" w:hAnsi="Courier New" w:cs="Courier New"/>
+          <w:sz w:val="22"/>
+          <w:szCs w:val="22"/>
+        </w:rPr>
+        <w:t xml:space="preserve"> te </w:t>
+      </w:r>
+      <w:r>
+        <w:rPr>
+          <w:rFonts w:ascii="Courier New" w:hAnsi="Courier New" w:cs="Courier New"/>
+          <w:sz w:val="22"/>
+          <w:szCs w:val="22"/>
+        </w:rPr>
+        <w:t xml:space="preserve">wisselen, argumenten </w:t>
+      </w:r>
+      <w:r>
+        <w:rPr>
+          <w:rFonts w:ascii="Courier New" w:hAnsi="Courier New" w:cs="Courier New"/>
+          <w:sz w:val="22"/>
+          <w:szCs w:val="22"/>
+        </w:rPr>
+        <w:t xml:space="preserve">te </w:t>
+      </w:r>
+      <w:r>
+        <w:rPr>
+          <w:rFonts w:ascii="Courier New" w:hAnsi="Courier New" w:cs="Courier New"/>
+          <w:sz w:val="22"/>
+          <w:szCs w:val="22"/>
+        </w:rPr>
+        <w:t xml:space="preserve">bespreken en </w:t>
+      </w:r>
+      <w:r>
+        <w:rPr>
+          <w:rFonts w:ascii="Courier New" w:hAnsi="Courier New" w:cs="Courier New"/>
+          <w:sz w:val="22"/>
+          <w:szCs w:val="22"/>
+        </w:rPr>
+        <w:t xml:space="preserve">om </w:t>
       </w:r>
       <w:r>
         <w:rPr>
@@ -866,7 +1010,167 @@
           <w:sz w:val="22"/>
           <w:szCs w:val="22"/>
         </w:rPr>
-        <w:t xml:space="preserve">gezamenlijk oordelen </w:t>
+        <w:t xml:space="preserve">oordelen </w:t>
+      </w:r>
+      <w:r>
+        <w:rPr>
+          <w:rFonts w:ascii="Courier New" w:hAnsi="Courier New" w:cs="Courier New"/>
+          <w:sz w:val="22"/>
+          <w:szCs w:val="22"/>
+        </w:rPr>
+        <w:t xml:space="preserve">te kunnen </w:t>
+      </w:r>
+      <w:r>
+        <w:rPr>
+          <w:rFonts w:ascii="Courier New" w:hAnsi="Courier New" w:cs="Courier New"/>
+          <w:sz w:val="22"/>
+          <w:szCs w:val="22"/>
+        </w:rPr>
+        <w:t>vorm</w:t>
+      </w:r>
+      <w:r>
+        <w:rPr>
+          <w:rFonts w:ascii="Courier New" w:hAnsi="Courier New" w:cs="Courier New"/>
+          <w:sz w:val="22"/>
+          <w:szCs w:val="22"/>
+        </w:rPr>
+        <w:t>en</w:t>
+      </w:r>
+      <w:r>
+        <w:rPr>
+          <w:rFonts w:ascii="Courier New" w:hAnsi="Courier New" w:cs="Courier New"/>
+          <w:sz w:val="22"/>
+          <w:szCs w:val="22"/>
+        </w:rPr>
+        <w:t xml:space="preserve"> over </w:t>
+      </w:r>
+      <w:r>
+        <w:rPr>
+          <w:rFonts w:ascii="Courier New" w:hAnsi="Courier New" w:cs="Courier New"/>
+          <w:sz w:val="22"/>
+          <w:szCs w:val="22"/>
+        </w:rPr>
+        <w:t>zaken die iedereen aangaan</w:t>
+      </w:r>
+      <w:r>
+        <w:rPr>
+          <w:rFonts w:ascii="Courier New" w:hAnsi="Courier New" w:cs="Courier New"/>
+          <w:sz w:val="22"/>
+          <w:szCs w:val="22"/>
+        </w:rPr>
+        <w:t>.</w:t>
+      </w:r>
+      <w:r>
+        <w:rPr>
+          <w:rFonts w:ascii="Courier New" w:hAnsi="Courier New" w:cs="Courier New"/>
+          <w:sz w:val="22"/>
+          <w:szCs w:val="22"/>
+        </w:rPr>
+        <w:t xml:space="preserve"> </w:t>
+      </w:r>
+      <w:r>
+        <w:rPr>
+          <w:rFonts w:ascii="Courier New" w:hAnsi="Courier New" w:cs="Courier New"/>
+          <w:sz w:val="22"/>
+          <w:szCs w:val="22"/>
+        </w:rPr>
+        <w:t>D</w:t>
+      </w:r>
+      <w:r>
+        <w:rPr>
+          <w:rFonts w:ascii="Courier New" w:hAnsi="Courier New" w:cs="Courier New"/>
+          <w:sz w:val="22"/>
+          <w:szCs w:val="22"/>
+        </w:rPr>
+        <w:t xml:space="preserve">emocratie </w:t>
+      </w:r>
+      <w:r>
+        <w:rPr>
+          <w:rFonts w:ascii="Courier New" w:hAnsi="Courier New" w:cs="Courier New"/>
+          <w:sz w:val="22"/>
+          <w:szCs w:val="22"/>
+        </w:rPr>
+        <w:t>is zoveel meer dan</w:t>
+      </w:r>
+      <w:r>
+        <w:rPr>
+          <w:rFonts w:ascii="Courier New" w:hAnsi="Courier New" w:cs="Courier New"/>
+          <w:sz w:val="22"/>
+          <w:szCs w:val="22"/>
+        </w:rPr>
+        <w:t xml:space="preserve"> verkiezingen, parlementen en juridische procedures</w:t>
+      </w:r>
+      <w:r>
+        <w:rPr>
+          <w:rFonts w:ascii="Courier New" w:hAnsi="Courier New" w:cs="Courier New"/>
+          <w:sz w:val="22"/>
+          <w:szCs w:val="22"/>
+        </w:rPr>
+        <w:t>. Ze</w:t>
+      </w:r>
+      <w:r>
+        <w:rPr>
+          <w:rFonts w:ascii="Courier New" w:hAnsi="Courier New" w:cs="Courier New"/>
+          <w:sz w:val="22"/>
+          <w:szCs w:val="22"/>
+        </w:rPr>
+        <w:t xml:space="preserve"> vraagt </w:t>
+      </w:r>
+      <w:r>
+        <w:rPr>
+          <w:rFonts w:ascii="Courier New" w:hAnsi="Courier New" w:cs="Courier New"/>
+          <w:sz w:val="22"/>
+          <w:szCs w:val="22"/>
+        </w:rPr>
+        <w:t>een actieve maatschappelijke houding en</w:t>
+      </w:r>
+      <w:r>
+        <w:rPr>
+          <w:rFonts w:ascii="Courier New" w:hAnsi="Courier New" w:cs="Courier New"/>
+          <w:sz w:val="22"/>
+          <w:szCs w:val="22"/>
+        </w:rPr>
+        <w:t xml:space="preserve"> een</w:t>
+      </w:r>
+      <w:r>
+        <w:rPr>
+          <w:rFonts w:ascii="Courier New" w:hAnsi="Courier New" w:cs="Courier New"/>
+          <w:sz w:val="22"/>
+          <w:szCs w:val="22"/>
+        </w:rPr>
+        <w:t xml:space="preserve"> levende publieke cultuur waarin burgers hun opvattingen kunnen </w:t>
+      </w:r>
+      <w:r>
+        <w:rPr>
+          <w:rFonts w:ascii="Courier New" w:hAnsi="Courier New" w:cs="Courier New"/>
+          <w:sz w:val="22"/>
+          <w:szCs w:val="22"/>
+        </w:rPr>
+        <w:t xml:space="preserve">vormen en </w:t>
+      </w:r>
+      <w:r>
+        <w:rPr>
+          <w:rFonts w:ascii="Courier New" w:hAnsi="Courier New" w:cs="Courier New"/>
+          <w:sz w:val="22"/>
+          <w:szCs w:val="22"/>
+        </w:rPr>
+        <w:t xml:space="preserve">ontwikkelen en </w:t>
+      </w:r>
+      <w:r>
+        <w:rPr>
+          <w:rFonts w:ascii="Courier New" w:hAnsi="Courier New" w:cs="Courier New"/>
+          <w:sz w:val="22"/>
+          <w:szCs w:val="22"/>
+        </w:rPr>
+        <w:t xml:space="preserve">waarin </w:t>
+      </w:r>
+      <w:r>
+        <w:rPr>
+          <w:rFonts w:ascii="Courier New" w:hAnsi="Courier New" w:cs="Courier New"/>
+          <w:sz w:val="22"/>
+          <w:szCs w:val="22"/>
+        </w:rPr>
+        <w:t xml:space="preserve">machthebbers ter verantwoording kunnen </w:t>
       </w:r>
       <w:r>
         <w:rPr>
@@ -882,39 +1186,7 @@
           <w:sz w:val="22"/>
           <w:szCs w:val="22"/>
         </w:rPr>
-        <w:t>vorm</w:t>
-      </w:r>
-      <w:r>
-        <w:rPr>
-          <w:rFonts w:ascii="Courier New" w:hAnsi="Courier New" w:cs="Courier New"/>
-          <w:sz w:val="22"/>
-          <w:szCs w:val="22"/>
-        </w:rPr>
-        <w:t>d</w:t>
-      </w:r>
-      <w:r>
-        <w:rPr>
-          <w:rFonts w:ascii="Courier New" w:hAnsi="Courier New" w:cs="Courier New"/>
-          <w:sz w:val="22"/>
-          <w:szCs w:val="22"/>
-        </w:rPr>
-        <w:t xml:space="preserve"> over </w:t>
-      </w:r>
-      <w:r>
-        <w:rPr>
-          <w:rFonts w:ascii="Courier New" w:hAnsi="Courier New" w:cs="Courier New"/>
-          <w:sz w:val="22"/>
-          <w:szCs w:val="22"/>
-        </w:rPr>
-        <w:t>zaken die iedereen aangaan</w:t>
-      </w:r>
-      <w:r>
-        <w:rPr>
-          <w:rFonts w:ascii="Courier New" w:hAnsi="Courier New" w:cs="Courier New"/>
-          <w:sz w:val="22"/>
-          <w:szCs w:val="22"/>
-        </w:rPr>
-        <w:t>.</w:t>
+        <w:t>roepen.</w:t>
       </w:r>
       <w:r>
         <w:rPr>
@@ -930,118 +1202,6 @@
           <w:sz w:val="22"/>
           <w:szCs w:val="22"/>
         </w:rPr>
-        <w:t>D</w:t>
-      </w:r>
-      <w:r>
-        <w:rPr>
-          <w:rFonts w:ascii="Courier New" w:hAnsi="Courier New" w:cs="Courier New"/>
-          <w:sz w:val="22"/>
-          <w:szCs w:val="22"/>
-        </w:rPr>
-        <w:t xml:space="preserve">emocratie </w:t>
-      </w:r>
-      <w:r>
-        <w:rPr>
-          <w:rFonts w:ascii="Courier New" w:hAnsi="Courier New" w:cs="Courier New"/>
-          <w:sz w:val="22"/>
-          <w:szCs w:val="22"/>
-        </w:rPr>
-        <w:t>is zoveel meer dan</w:t>
-      </w:r>
-      <w:r>
-        <w:rPr>
-          <w:rFonts w:ascii="Courier New" w:hAnsi="Courier New" w:cs="Courier New"/>
-          <w:sz w:val="22"/>
-          <w:szCs w:val="22"/>
-        </w:rPr>
-        <w:t xml:space="preserve"> verkiezingen, parlementen en juridische procedures</w:t>
-      </w:r>
-      <w:r>
-        <w:rPr>
-          <w:rFonts w:ascii="Courier New" w:hAnsi="Courier New" w:cs="Courier New"/>
-          <w:sz w:val="22"/>
-          <w:szCs w:val="22"/>
-        </w:rPr>
-        <w:t>. Ze</w:t>
-      </w:r>
-      <w:r>
-        <w:rPr>
-          <w:rFonts w:ascii="Courier New" w:hAnsi="Courier New" w:cs="Courier New"/>
-          <w:sz w:val="22"/>
-          <w:szCs w:val="22"/>
-        </w:rPr>
-        <w:t xml:space="preserve"> vraagt ook een</w:t>
-      </w:r>
-      <w:r>
-        <w:rPr>
-          <w:rFonts w:ascii="Courier New" w:hAnsi="Courier New" w:cs="Courier New"/>
-          <w:sz w:val="22"/>
-          <w:szCs w:val="22"/>
-        </w:rPr>
-        <w:t xml:space="preserve"> levende publieke cultuur waarin burgers hun opvattingen kunnen </w:t>
-      </w:r>
-      <w:r>
-        <w:rPr>
-          <w:rFonts w:ascii="Courier New" w:hAnsi="Courier New" w:cs="Courier New"/>
-          <w:sz w:val="22"/>
-          <w:szCs w:val="22"/>
-        </w:rPr>
-        <w:t xml:space="preserve">vormen en </w:t>
-      </w:r>
-      <w:r>
-        <w:rPr>
-          <w:rFonts w:ascii="Courier New" w:hAnsi="Courier New" w:cs="Courier New"/>
-          <w:sz w:val="22"/>
-          <w:szCs w:val="22"/>
-        </w:rPr>
-        <w:t xml:space="preserve">ontwikkelen en </w:t>
-      </w:r>
-      <w:r>
-        <w:rPr>
-          <w:rFonts w:ascii="Courier New" w:hAnsi="Courier New" w:cs="Courier New"/>
-          <w:sz w:val="22"/>
-          <w:szCs w:val="22"/>
-        </w:rPr>
-        <w:t xml:space="preserve">waarin </w:t>
-      </w:r>
-      <w:r>
-        <w:rPr>
-          <w:rFonts w:ascii="Courier New" w:hAnsi="Courier New" w:cs="Courier New"/>
-          <w:sz w:val="22"/>
-          <w:szCs w:val="22"/>
-        </w:rPr>
-        <w:t xml:space="preserve">machthebbers ter verantwoording kunnen </w:t>
-      </w:r>
-      <w:r>
-        <w:rPr>
-          <w:rFonts w:ascii="Courier New" w:hAnsi="Courier New" w:cs="Courier New"/>
-          <w:sz w:val="22"/>
-          <w:szCs w:val="22"/>
-        </w:rPr>
-        <w:t>worden ge</w:t>
-      </w:r>
-      <w:r>
-        <w:rPr>
-          <w:rFonts w:ascii="Courier New" w:hAnsi="Courier New" w:cs="Courier New"/>
-          <w:sz w:val="22"/>
-          <w:szCs w:val="22"/>
-        </w:rPr>
-        <w:t>roepen.</w:t>
-      </w:r>
-      <w:r>
-        <w:rPr>
-          <w:rFonts w:ascii="Courier New" w:hAnsi="Courier New" w:cs="Courier New"/>
-          <w:sz w:val="22"/>
-          <w:szCs w:val="22"/>
-        </w:rPr>
-        <w:t xml:space="preserve"> </w:t>
-      </w:r>
-      <w:r>
-        <w:rPr>
-          <w:rFonts w:ascii="Courier New" w:hAnsi="Courier New" w:cs="Courier New"/>
-          <w:sz w:val="22"/>
-          <w:szCs w:val="22"/>
-        </w:rPr>
         <w:t>Politiek is zoveel meer dan</w:t>
       </w:r>
       <w:r>
@@ -1058,7 +1218,15 @@
           <w:sz w:val="22"/>
           <w:szCs w:val="22"/>
         </w:rPr>
-        <w:t xml:space="preserve"> en dan komt</w:t>
+        <w:t>. Als je dat vindt</w:t>
+      </w:r>
+      <w:r>
+        <w:rPr>
+          <w:rFonts w:ascii="Courier New" w:hAnsi="Courier New" w:cs="Courier New"/>
+          <w:sz w:val="22"/>
+          <w:szCs w:val="22"/>
+        </w:rPr>
+        <w:t xml:space="preserve"> komt</w:t>
       </w:r>
       <w:r>
         <w:rPr>
@@ -1082,31 +1250,55 @@
           <w:sz w:val="22"/>
           <w:szCs w:val="22"/>
         </w:rPr>
-        <w:t>.</w:t>
-      </w:r>
-      <w:r>
-        <w:rPr>
-          <w:rFonts w:ascii="Courier New" w:hAnsi="Courier New" w:cs="Courier New"/>
-          <w:sz w:val="22"/>
-          <w:szCs w:val="22"/>
-        </w:rPr>
-        <w:t xml:space="preserve"> En niet om het altijd maar met elkaar eens te worden. </w:t>
-      </w:r>
-      <w:r>
-        <w:rPr>
-          <w:rFonts w:ascii="Courier New" w:hAnsi="Courier New" w:cs="Courier New"/>
-          <w:sz w:val="22"/>
-          <w:szCs w:val="22"/>
-        </w:rPr>
-        <w:t>Deze gedachten zit niet alleeen in zijn theoretisch werk</w:t>
-      </w:r>
-      <w:r>
-        <w:rPr>
-          <w:rFonts w:ascii="Courier New" w:hAnsi="Courier New" w:cs="Courier New"/>
-          <w:sz w:val="22"/>
-          <w:szCs w:val="22"/>
-        </w:rPr>
-        <w:t xml:space="preserve"> en die heeft hij</w:t>
+        <w:t>, n</w:t>
+      </w:r>
+      <w:r>
+        <w:rPr>
+          <w:rFonts w:ascii="Courier New" w:hAnsi="Courier New" w:cs="Courier New"/>
+          <w:sz w:val="22"/>
+          <w:szCs w:val="22"/>
+        </w:rPr>
+        <w:t xml:space="preserve">iet om het altijd maar met elkaar eens te worden. </w:t>
+      </w:r>
+      <w:r>
+        <w:rPr>
+          <w:rFonts w:ascii="Courier New" w:hAnsi="Courier New" w:cs="Courier New"/>
+          <w:sz w:val="22"/>
+          <w:szCs w:val="22"/>
+        </w:rPr>
+        <w:t xml:space="preserve">Deze gedachten zit niet alleeen in </w:t>
+      </w:r>
+      <w:r>
+        <w:rPr>
+          <w:rFonts w:ascii="Courier New" w:hAnsi="Courier New" w:cs="Courier New"/>
+          <w:sz w:val="22"/>
+          <w:szCs w:val="22"/>
+        </w:rPr>
+        <w:t>Habermas’</w:t>
+      </w:r>
+      <w:r>
+        <w:rPr>
+          <w:rFonts w:ascii="Courier New" w:hAnsi="Courier New" w:cs="Courier New"/>
+          <w:sz w:val="22"/>
+          <w:szCs w:val="22"/>
+        </w:rPr>
+        <w:t xml:space="preserve"> theoretisch werk</w:t>
+      </w:r>
+      <w:r>
+        <w:rPr>
+          <w:rFonts w:ascii="Courier New" w:hAnsi="Courier New" w:cs="Courier New"/>
+          <w:sz w:val="22"/>
+          <w:szCs w:val="22"/>
+        </w:rPr>
+        <w:t>,</w:t>
+      </w:r>
+      <w:r>
+        <w:rPr>
+          <w:rFonts w:ascii="Courier New" w:hAnsi="Courier New" w:cs="Courier New"/>
+          <w:sz w:val="22"/>
+          <w:szCs w:val="22"/>
+        </w:rPr>
+        <w:t xml:space="preserve"> die heeft hij</w:t>
       </w:r>
       <w:r>
         <w:rPr>
@@ -1411,7 +1603,7 @@
           <w:sz w:val="22"/>
           <w:szCs w:val="22"/>
         </w:rPr>
-        <w:t>de</w:t>
+        <w:t>t</w:t>
       </w:r>
       <w:r>
         <w:rPr>
@@ -1707,15 +1899,23 @@
           <w:sz w:val="22"/>
           <w:szCs w:val="22"/>
         </w:rPr>
-        <w:t>oe kan een democratische samenleving ontstaan wanneer haar burgers en intellectuele elites onvoldoende kritisch omgaan met hun eigen geschiedenis?</w:t>
-      </w:r>
-      <w:r>
-        <w:rPr>
-          <w:rFonts w:ascii="Courier New" w:hAnsi="Courier New" w:cs="Courier New"/>
-          <w:sz w:val="22"/>
-          <w:szCs w:val="22"/>
-        </w:rPr>
-        <w:t xml:space="preserve"> Dat is een centrale vraag voor Habermas.</w:t>
+        <w:t>oe kan</w:t>
+      </w:r>
+      <w:r>
+        <w:rPr>
+          <w:rFonts w:ascii="Courier New" w:hAnsi="Courier New" w:cs="Courier New"/>
+          <w:sz w:val="22"/>
+          <w:szCs w:val="22"/>
+        </w:rPr>
+        <w:t>, vraagt Habermas zich af,</w:t>
+      </w:r>
+      <w:r>
+        <w:rPr>
+          <w:rFonts w:ascii="Courier New" w:hAnsi="Courier New" w:cs="Courier New"/>
+          <w:sz w:val="22"/>
+          <w:szCs w:val="22"/>
+        </w:rPr>
+        <w:t xml:space="preserve"> een democratische samenleving ontstaan wanneer haar burgers en intellectuele elites onvoldoende kritisch omgaan met hun eigen geschiedenis?</w:t>
       </w:r>
       <w:r>
         <w:rPr>
@@ -1747,7 +1947,23 @@
           <w:sz w:val="22"/>
           <w:szCs w:val="22"/>
         </w:rPr>
-        <w:t xml:space="preserve">als journalist en </w:t>
+        <w:t>als journalist en publiceer</w:t>
+      </w:r>
+      <w:r>
+        <w:rPr>
+          <w:rFonts w:ascii="Courier New" w:hAnsi="Courier New" w:cs="Courier New"/>
+          <w:sz w:val="22"/>
+          <w:szCs w:val="22"/>
+        </w:rPr>
+        <w:t>t</w:t>
+      </w:r>
+      <w:r>
+        <w:rPr>
+          <w:rFonts w:ascii="Courier New" w:hAnsi="Courier New" w:cs="Courier New"/>
+          <w:sz w:val="22"/>
+          <w:szCs w:val="22"/>
+        </w:rPr>
+        <w:t xml:space="preserve"> </w:t>
       </w:r>
       <w:r>
         <w:rPr>
@@ -1763,23 +1979,16 @@
           <w:sz w:val="22"/>
           <w:szCs w:val="22"/>
         </w:rPr>
-        <w:t>publiceer</w:t>
-      </w:r>
-      <w:r>
-        <w:rPr>
-          <w:rFonts w:ascii="Courier New" w:hAnsi="Courier New" w:cs="Courier New"/>
-          <w:sz w:val="22"/>
-          <w:szCs w:val="22"/>
-        </w:rPr>
-        <w:t>t</w:t>
-      </w:r>
-      <w:r>
-        <w:rPr>
-          <w:rFonts w:ascii="Courier New" w:hAnsi="Courier New" w:cs="Courier New"/>
-          <w:sz w:val="22"/>
-          <w:szCs w:val="22"/>
-        </w:rPr>
-        <w:t xml:space="preserve"> regelmatig over filosofische en politieke kwesties. Zijn belangstelling voor de publieke meningsvorming </w:t>
+        <w:t xml:space="preserve">regelmatig over filosofische en politieke kwesties. Zijn belangstelling voor de </w:t>
+      </w:r>
+      <w:r>
+        <w:rPr>
+          <w:rFonts w:ascii="Courier New" w:hAnsi="Courier New" w:cs="Courier New"/>
+          <w:sz w:val="22"/>
+          <w:szCs w:val="22"/>
+        </w:rPr>
+        <w:lastRenderedPageBreak/>
+        <w:t xml:space="preserve">publieke meningsvorming </w:t>
       </w:r>
       <w:r>
         <w:rPr>
@@ -1830,7 +2039,6 @@
           <w:sz w:val="22"/>
           <w:szCs w:val="22"/>
         </w:rPr>
-        <w:lastRenderedPageBreak/>
         <w:t>Wanneer</w:t>
       </w:r>
       <w:r>
@@ -1839,7 +2047,39 @@
           <w:sz w:val="22"/>
           <w:szCs w:val="22"/>
         </w:rPr>
-        <w:t xml:space="preserve"> hij in 1956 bij het Institut für Sozialforschung in Frankfurt g</w:t>
+        <w:t xml:space="preserve"> hij in 1956 bij het </w:t>
+      </w:r>
+      <w:r>
+        <w:rPr>
+          <w:rFonts w:ascii="Courier New" w:hAnsi="Courier New" w:cs="Courier New"/>
+          <w:sz w:val="22"/>
+          <w:szCs w:val="22"/>
+        </w:rPr>
+        <w:t>beroemde ‘</w:t>
+      </w:r>
+      <w:r>
+        <w:rPr>
+          <w:rFonts w:ascii="Courier New" w:hAnsi="Courier New" w:cs="Courier New"/>
+          <w:sz w:val="22"/>
+          <w:szCs w:val="22"/>
+        </w:rPr>
+        <w:t>Institut für Sozialforschung</w:t>
+      </w:r>
+      <w:r>
+        <w:rPr>
+          <w:rFonts w:ascii="Courier New" w:hAnsi="Courier New" w:cs="Courier New"/>
+          <w:sz w:val="22"/>
+          <w:szCs w:val="22"/>
+        </w:rPr>
+        <w:t>’</w:t>
+      </w:r>
+      <w:r>
+        <w:rPr>
+          <w:rFonts w:ascii="Courier New" w:hAnsi="Courier New" w:cs="Courier New"/>
+          <w:sz w:val="22"/>
+          <w:szCs w:val="22"/>
+        </w:rPr>
+        <w:t xml:space="preserve"> in Frankfurt g</w:t>
       </w:r>
       <w:r>
         <w:rPr>
@@ -2364,7 +2604,23 @@
           <w:sz w:val="22"/>
           <w:szCs w:val="22"/>
         </w:rPr>
-        <w:t xml:space="preserve">zijn </w:t>
+        <w:t>zijn</w:t>
+      </w:r>
+      <w:r>
+        <w:rPr>
+          <w:rFonts w:ascii="Courier New" w:hAnsi="Courier New" w:cs="Courier New"/>
+          <w:sz w:val="22"/>
+          <w:szCs w:val="22"/>
+        </w:rPr>
+        <w:t xml:space="preserve"> ‘blauwe monster’,</w:t>
+      </w:r>
+      <w:r>
+        <w:rPr>
+          <w:rFonts w:ascii="Courier New" w:hAnsi="Courier New" w:cs="Courier New"/>
+          <w:sz w:val="22"/>
+          <w:szCs w:val="22"/>
+        </w:rPr>
+        <w:t xml:space="preserve"> </w:t>
       </w:r>
       <w:r>
         <w:rPr>
@@ -2382,7 +2638,7 @@
           <w:sz w:val="22"/>
           <w:szCs w:val="22"/>
         </w:rPr>
-        <w:t> (1981), waarin hij zijn opvattingen over rationaliteit, maatschappelijke integratie en de verhouding tussen systeem en leefwereld verder uitwerkt.</w:t>
+        <w:t> (1981) waarin hij zijn opvattingen over rationaliteit, maatschappelijke integratie en de verhouding tussen systeem en leefwereld uitwerkt.</w:t>
       </w:r>
       <w:r>
         <w:rPr>
@@ -2398,7 +2654,23 @@
           <w:sz w:val="22"/>
           <w:szCs w:val="22"/>
         </w:rPr>
-        <w:t>Verovšek interpreteert deze periode niet als een afscheid van politiek engagement, maar als een fase waarin Habermas zijn theoretische grondslagen verdiept. </w:t>
+        <w:t>Verovšek interpreteert deze periode niet als een afscheid van politiek</w:t>
+      </w:r>
+      <w:r>
+        <w:rPr>
+          <w:rFonts w:ascii="Courier New" w:hAnsi="Courier New" w:cs="Courier New"/>
+          <w:sz w:val="22"/>
+          <w:szCs w:val="22"/>
+        </w:rPr>
+        <w:t>e betrokkenheid</w:t>
+      </w:r>
+      <w:r>
+        <w:rPr>
+          <w:rFonts w:ascii="Courier New" w:hAnsi="Courier New" w:cs="Courier New"/>
+          <w:sz w:val="22"/>
+          <w:szCs w:val="22"/>
+        </w:rPr>
+        <w:t>, maar als een fase waarin Habermas zijn theoretische grondslagen verdiept. </w:t>
       </w:r>
       <w:r>
         <w:rPr>
@@ -2430,7 +2702,23 @@
           <w:sz w:val="22"/>
           <w:szCs w:val="22"/>
         </w:rPr>
-        <w:t xml:space="preserve"> opnieuw een prominente plaats in het Duitse publieke debat in. Vooral zijn deelname aan de zogenoemde </w:t>
+        <w:t xml:space="preserve"> </w:t>
+      </w:r>
+      <w:r>
+        <w:rPr>
+          <w:rFonts w:ascii="Courier New" w:hAnsi="Courier New" w:cs="Courier New"/>
+          <w:sz w:val="22"/>
+          <w:szCs w:val="22"/>
+        </w:rPr>
+        <w:t xml:space="preserve">vervolgens </w:t>
+      </w:r>
+      <w:r>
+        <w:rPr>
+          <w:rFonts w:ascii="Courier New" w:hAnsi="Courier New" w:cs="Courier New"/>
+          <w:sz w:val="22"/>
+          <w:szCs w:val="22"/>
+        </w:rPr>
+        <w:t>opnieuw een prominente plaats in het Duitse publieke debat in. Vooral zijn deelname aan de zogenoemde </w:t>
       </w:r>
       <w:r>
         <w:rPr>
@@ -2470,7 +2758,23 @@
           <w:sz w:val="22"/>
           <w:szCs w:val="22"/>
         </w:rPr>
-        <w:t xml:space="preserve"> Daarbij verzet </w:t>
+        <w:t xml:space="preserve"> Daar</w:t>
+      </w:r>
+      <w:r>
+        <w:rPr>
+          <w:rFonts w:ascii="Courier New" w:hAnsi="Courier New" w:cs="Courier New"/>
+          <w:sz w:val="22"/>
+          <w:szCs w:val="22"/>
+        </w:rPr>
+        <w:t>in</w:t>
+      </w:r>
+      <w:r>
+        <w:rPr>
+          <w:rFonts w:ascii="Courier New" w:hAnsi="Courier New" w:cs="Courier New"/>
+          <w:sz w:val="22"/>
+          <w:szCs w:val="22"/>
+        </w:rPr>
+        <w:t xml:space="preserve"> verzet </w:t>
       </w:r>
       <w:r>
         <w:rPr>
@@ -2494,7 +2798,16 @@
           <w:sz w:val="22"/>
           <w:szCs w:val="22"/>
         </w:rPr>
-        <w:t>volgens hem de bijzondere betekenis van de</w:t>
+        <w:t xml:space="preserve">volgens hem de bijzondere </w:t>
+      </w:r>
+      <w:r>
+        <w:rPr>
+          <w:rFonts w:ascii="Courier New" w:hAnsi="Courier New" w:cs="Courier New"/>
+          <w:sz w:val="22"/>
+          <w:szCs w:val="22"/>
+        </w:rPr>
+        <w:lastRenderedPageBreak/>
+        <w:t>betekenis van de</w:t>
       </w:r>
       <w:r>
         <w:rPr>
@@ -2558,16 +2871,7 @@
           <w:sz w:val="22"/>
           <w:szCs w:val="22"/>
         </w:rPr>
-        <w:t xml:space="preserve"> </w:t>
-      </w:r>
-      <w:r>
-        <w:rPr>
-          <w:rFonts w:ascii="Courier New" w:hAnsi="Courier New" w:cs="Courier New"/>
-          <w:sz w:val="22"/>
-          <w:szCs w:val="22"/>
-        </w:rPr>
-        <w:lastRenderedPageBreak/>
-        <w:t>discussie raakt</w:t>
+        <w:t xml:space="preserve"> discussie raakt</w:t>
       </w:r>
       <w:r>
         <w:rPr>
@@ -3146,7 +3450,16 @@
           <w:sz w:val="22"/>
           <w:szCs w:val="22"/>
         </w:rPr>
-        <w:t>dat economische noodzakelijkheden w</w:t>
+        <w:t xml:space="preserve">dat </w:t>
+      </w:r>
+      <w:r>
+        <w:rPr>
+          <w:rFonts w:ascii="Courier New" w:hAnsi="Courier New" w:cs="Courier New"/>
+          <w:sz w:val="22"/>
+          <w:szCs w:val="22"/>
+        </w:rPr>
+        <w:lastRenderedPageBreak/>
+        <w:t>economische noodzakelijkheden w</w:t>
       </w:r>
       <w:r>
         <w:rPr>
@@ -3162,16 +3475,7 @@
           <w:sz w:val="22"/>
           <w:szCs w:val="22"/>
         </w:rPr>
-        <w:t xml:space="preserve">rden voorgesteld als onvermijdelijke feiten waarover burgers nauwelijks nog democratische zeggenschap </w:t>
-      </w:r>
-      <w:r>
-        <w:rPr>
-          <w:rFonts w:ascii="Courier New" w:hAnsi="Courier New" w:cs="Courier New"/>
-          <w:sz w:val="22"/>
-          <w:szCs w:val="22"/>
-        </w:rPr>
-        <w:lastRenderedPageBreak/>
-        <w:t>h</w:t>
+        <w:t>rden voorgesteld als onvermijdelijke feiten waarover burgers nauwelijks nog democratische zeggenschap h</w:t>
       </w:r>
       <w:r>
         <w:rPr>
@@ -3235,7 +3539,23 @@
           <w:sz w:val="22"/>
           <w:szCs w:val="22"/>
         </w:rPr>
-        <w:t>een opvallende ontwikkeling. Terwijl Habermas theoretisch vasthield aan het onderscheid tussen filosofische reflectie en politieke besluitvorming, tr</w:t>
+        <w:t>een opvallende ontwikkeling. Terwijl Habermas theoretisch vasth</w:t>
+      </w:r>
+      <w:r>
+        <w:rPr>
+          <w:rFonts w:ascii="Courier New" w:hAnsi="Courier New" w:cs="Courier New"/>
+          <w:sz w:val="22"/>
+          <w:szCs w:val="22"/>
+        </w:rPr>
+        <w:t>oudt</w:t>
+      </w:r>
+      <w:r>
+        <w:rPr>
+          <w:rFonts w:ascii="Courier New" w:hAnsi="Courier New" w:cs="Courier New"/>
+          <w:sz w:val="22"/>
+          <w:szCs w:val="22"/>
+        </w:rPr>
+        <w:t xml:space="preserve"> aan het onderscheid tussen filosofische reflectie en politieke besluitvorming, tr</w:t>
       </w:r>
       <w:r>
         <w:rPr>
@@ -3367,7 +3687,55 @@
           <w:sz w:val="22"/>
           <w:szCs w:val="22"/>
         </w:rPr>
-        <w:t xml:space="preserve">De laatste jaren van zijn leven neemt de productie van zijn politieke teksten af. Hij reageeert nog wel op de Russische invasie van Oekraïne van 24 februari 2022 en op het geweld van Israël in Gaza na de terroristische aanval van 7 oktober 2023. De Russische aanval is voor hem een schokkende ervaring, </w:t>
+        <w:t xml:space="preserve">De laatste jaren van </w:t>
+      </w:r>
+      <w:r>
+        <w:rPr>
+          <w:rFonts w:ascii="Courier New" w:hAnsi="Courier New" w:cs="Courier New"/>
+          <w:sz w:val="22"/>
+          <w:szCs w:val="22"/>
+        </w:rPr>
+        <w:t>Habermas’</w:t>
+      </w:r>
+      <w:r>
+        <w:rPr>
+          <w:rFonts w:ascii="Courier New" w:hAnsi="Courier New" w:cs="Courier New"/>
+          <w:sz w:val="22"/>
+          <w:szCs w:val="22"/>
+        </w:rPr>
+        <w:t xml:space="preserve"> leven neemt de productie van zijn politieke teksten af</w:t>
+      </w:r>
+      <w:r>
+        <w:rPr>
+          <w:rFonts w:ascii="Courier New" w:hAnsi="Courier New" w:cs="Courier New"/>
+          <w:sz w:val="22"/>
+          <w:szCs w:val="22"/>
+        </w:rPr>
+        <w:t>, terwijl rond 2020 nog een vuistdik en meerdelig eigenzinniuge geschiedenis van de filosofie schrijft.</w:t>
+      </w:r>
+      <w:r>
+        <w:rPr>
+          <w:rFonts w:ascii="Courier New" w:hAnsi="Courier New" w:cs="Courier New"/>
+          <w:sz w:val="22"/>
+          <w:szCs w:val="22"/>
+        </w:rPr>
+        <w:t xml:space="preserve"> H</w:t>
+      </w:r>
+      <w:r>
+        <w:rPr>
+          <w:rFonts w:ascii="Courier New" w:hAnsi="Courier New" w:cs="Courier New"/>
+          <w:sz w:val="22"/>
+          <w:szCs w:val="22"/>
+        </w:rPr>
+        <w:t>abermas</w:t>
+      </w:r>
+      <w:r>
+        <w:rPr>
+          <w:rFonts w:ascii="Courier New" w:hAnsi="Courier New" w:cs="Courier New"/>
+          <w:sz w:val="22"/>
+          <w:szCs w:val="22"/>
+        </w:rPr>
+        <w:t xml:space="preserve"> reageeert nog wel op de Russische invasie van Oekraïne van 24 februari 2022 en op het geweld van Israël in Gaza na de terroristische aanval van 7 oktober 2023. De Russische aanval is voor hem een schokkende ervaring, </w:t>
       </w:r>
       <w:r>
         <w:rPr>
@@ -3391,31 +3759,31 @@
           <w:sz w:val="22"/>
           <w:szCs w:val="22"/>
         </w:rPr>
-        <w:t xml:space="preserve">wanneer hij </w:t>
-      </w:r>
-      <w:r>
-        <w:rPr>
-          <w:rFonts w:ascii="Courier New" w:hAnsi="Courier New" w:cs="Courier New"/>
-          <w:sz w:val="22"/>
-          <w:szCs w:val="22"/>
-        </w:rPr>
-        <w:t xml:space="preserve">wat tijd neemt om zijn opties te onderzoeken en </w:t>
-      </w:r>
-      <w:r>
-        <w:rPr>
-          <w:rFonts w:ascii="Courier New" w:hAnsi="Courier New" w:cs="Courier New"/>
-          <w:sz w:val="22"/>
-          <w:szCs w:val="22"/>
-        </w:rPr>
-        <w:t xml:space="preserve">hij </w:t>
-      </w:r>
-      <w:r>
-        <w:rPr>
-          <w:rFonts w:ascii="Courier New" w:hAnsi="Courier New" w:cs="Courier New"/>
-          <w:sz w:val="22"/>
-          <w:szCs w:val="22"/>
-        </w:rPr>
-        <w:t>wijst er</w:t>
+        <w:t xml:space="preserve">wanneer </w:t>
+      </w:r>
+      <w:r>
+        <w:rPr>
+          <w:rFonts w:ascii="Courier New" w:hAnsi="Courier New" w:cs="Courier New"/>
+          <w:sz w:val="22"/>
+          <w:szCs w:val="22"/>
+        </w:rPr>
+        <w:t>die</w:t>
+      </w:r>
+      <w:r>
+        <w:rPr>
+          <w:rFonts w:ascii="Courier New" w:hAnsi="Courier New" w:cs="Courier New"/>
+          <w:sz w:val="22"/>
+          <w:szCs w:val="22"/>
+        </w:rPr>
+        <w:t xml:space="preserve"> </w:t>
+      </w:r>
+      <w:r>
+        <w:rPr>
+          <w:rFonts w:ascii="Courier New" w:hAnsi="Courier New" w:cs="Courier New"/>
+          <w:sz w:val="22"/>
+          <w:szCs w:val="22"/>
+        </w:rPr>
+        <w:t>wat tijd neemt om zijn opties te onderzoeken en wijst er</w:t>
       </w:r>
       <w:r>
         <w:rPr>
@@ -3521,7 +3889,23 @@
           <w:sz w:val="22"/>
           <w:szCs w:val="22"/>
         </w:rPr>
-        <w:t xml:space="preserve"> had geschreven. De teksten gaan tegenwoordig over landgrenzen heen, er is niet meer één leidend medium en het karakter van de hele deliberatie is veranderd. Het is </w:t>
+        <w:t xml:space="preserve"> had geschreven. De teksten gaan tegenwoordig over landgrenzen heen, er is niet meer één leidend medium en het karakter van de hele deliberatie is veranderd. </w:t>
+      </w:r>
+      <w:r>
+        <w:rPr>
+          <w:rFonts w:ascii="Courier New" w:hAnsi="Courier New" w:cs="Courier New"/>
+          <w:sz w:val="22"/>
+          <w:szCs w:val="22"/>
+        </w:rPr>
+        <w:t>De wereld waarin hij zich bevindt</w:t>
+      </w:r>
+      <w:r>
+        <w:rPr>
+          <w:rFonts w:ascii="Courier New" w:hAnsi="Courier New" w:cs="Courier New"/>
+          <w:sz w:val="22"/>
+          <w:szCs w:val="22"/>
+        </w:rPr>
+        <w:t xml:space="preserve"> is </w:t>
       </w:r>
       <w:r>
         <w:rPr>
@@ -3545,7 +3929,7 @@
           <w:sz w:val="22"/>
           <w:szCs w:val="22"/>
         </w:rPr>
-        <w:t xml:space="preserve">  </w:t>
+        <w:t xml:space="preserve"> </w:t>
       </w:r>
       <w:r>
         <w:rPr>
@@ -3633,7 +4017,16 @@
           <w:sz w:val="22"/>
           <w:szCs w:val="22"/>
         </w:rPr>
-        <w:t xml:space="preserve">gezaghebbende denkers </w:t>
+        <w:t xml:space="preserve">gezaghebbende </w:t>
+      </w:r>
+      <w:r>
+        <w:rPr>
+          <w:rFonts w:ascii="Courier New" w:hAnsi="Courier New" w:cs="Courier New"/>
+          <w:sz w:val="22"/>
+          <w:szCs w:val="22"/>
+        </w:rPr>
+        <w:lastRenderedPageBreak/>
+        <w:t xml:space="preserve">denkers </w:t>
       </w:r>
       <w:r>
         <w:rPr>
@@ -3665,16 +4058,31 @@
           <w:sz w:val="22"/>
           <w:szCs w:val="22"/>
         </w:rPr>
-        <w:t xml:space="preserve">Sociale media, digitale platforms, politieke polarisatie en de versnippering van het medialandschap hebben de voorwaarden voor publieke </w:t>
-      </w:r>
-      <w:r>
-        <w:rPr>
-          <w:rFonts w:ascii="Courier New" w:hAnsi="Courier New" w:cs="Courier New"/>
-          <w:sz w:val="22"/>
-          <w:szCs w:val="22"/>
-        </w:rPr>
-        <w:lastRenderedPageBreak/>
-        <w:t xml:space="preserve">meningsvorming </w:t>
+        <w:t>Sociale media, digitale platforms, politieke polarisatie en de versnippering van het medialandschap hebben de voorwaarden voor publieke meningsvorming</w:t>
+      </w:r>
+      <w:r>
+        <w:rPr>
+          <w:rFonts w:ascii="Courier New" w:hAnsi="Courier New" w:cs="Courier New"/>
+          <w:sz w:val="22"/>
+          <w:szCs w:val="22"/>
+        </w:rPr>
+        <w:t>,</w:t>
+      </w:r>
+      <w:r>
+        <w:rPr>
+          <w:rFonts w:ascii="Courier New" w:hAnsi="Courier New" w:cs="Courier New"/>
+          <w:sz w:val="22"/>
+          <w:szCs w:val="22"/>
+        </w:rPr>
+        <w:t xml:space="preserve"> </w:t>
+      </w:r>
+      <w:r>
+        <w:rPr>
+          <w:rFonts w:ascii="Courier New" w:hAnsi="Courier New" w:cs="Courier New"/>
+          <w:sz w:val="22"/>
+          <w:szCs w:val="22"/>
+        </w:rPr>
+        <w:t xml:space="preserve">waar hij expliciete ideeën over heeft, </w:t>
       </w:r>
       <w:r>
         <w:rPr>
@@ -3778,23 +4186,79 @@
           <w:sz w:val="22"/>
           <w:szCs w:val="22"/>
         </w:rPr>
-        <w:t>deelnemen aan het publieke debat, kritisch blijven tegenover politieke macht en de democratische discussie verdedigen.</w:t>
-      </w:r>
-      <w:r>
-        <w:rPr>
-          <w:rFonts w:ascii="Courier New" w:hAnsi="Courier New" w:cs="Courier New"/>
-          <w:sz w:val="22"/>
-          <w:szCs w:val="22"/>
-        </w:rPr>
-        <w:t xml:space="preserve"> Habermas had daar zijn manier voor, maar tegenwoordig zijn er andere manieren voor en mensen als Heather Cox Richardson, Timothy Snyder en Anne Applebauwm in de Verenigde Staten, Judith Zeh in Duitsland en Beatrice de Graaf in eigen land zijn daar voorbeelden van.</w:t>
-      </w:r>
-      <w:r>
-        <w:rPr>
-          <w:rFonts w:ascii="Courier New" w:hAnsi="Courier New" w:cs="Courier New"/>
-          <w:sz w:val="22"/>
-          <w:szCs w:val="22"/>
-        </w:rPr>
-        <w:t xml:space="preserve"> Met een andere stijl, met kwaliteit en toch invloedrijk.</w:t>
+        <w:t xml:space="preserve">in dit nieuwe landschap </w:t>
+      </w:r>
+      <w:r>
+        <w:rPr>
+          <w:rFonts w:ascii="Courier New" w:hAnsi="Courier New" w:cs="Courier New"/>
+          <w:sz w:val="22"/>
+          <w:szCs w:val="22"/>
+        </w:rPr>
+        <w:t xml:space="preserve">deelnemen aan het publieke debat, kritisch blijven tegenover politieke macht en </w:t>
+      </w:r>
+      <w:r>
+        <w:rPr>
+          <w:rFonts w:ascii="Courier New" w:hAnsi="Courier New" w:cs="Courier New"/>
+          <w:sz w:val="22"/>
+          <w:szCs w:val="22"/>
+        </w:rPr>
+        <w:t xml:space="preserve">ook nog eens </w:t>
+      </w:r>
+      <w:r>
+        <w:rPr>
+          <w:rFonts w:ascii="Courier New" w:hAnsi="Courier New" w:cs="Courier New"/>
+          <w:sz w:val="22"/>
+          <w:szCs w:val="22"/>
+        </w:rPr>
+        <w:t>de democratische discussie verdedigen</w:t>
+      </w:r>
+      <w:r>
+        <w:rPr>
+          <w:rFonts w:ascii="Courier New" w:hAnsi="Courier New" w:cs="Courier New"/>
+          <w:sz w:val="22"/>
+          <w:szCs w:val="22"/>
+        </w:rPr>
+        <w:t>?</w:t>
+      </w:r>
+      <w:r>
+        <w:rPr>
+          <w:rFonts w:ascii="Courier New" w:hAnsi="Courier New" w:cs="Courier New"/>
+          <w:sz w:val="22"/>
+          <w:szCs w:val="22"/>
+        </w:rPr>
+        <w:t xml:space="preserve"> Habermas had daar zijn manier voor, maar tegenwoordig zijn er andere manieren voor en mensen als Heather Cox Richardson, Timothy Snyder en Anne Applebauwm in de Verenigde Staten, Judith Zeh in Duitsland en Beatrice de Graaf in eigen land zijn daar </w:t>
+      </w:r>
+      <w:r>
+        <w:rPr>
+          <w:rFonts w:ascii="Courier New" w:hAnsi="Courier New" w:cs="Courier New"/>
+          <w:sz w:val="22"/>
+          <w:szCs w:val="22"/>
+        </w:rPr>
+        <w:t>aangepaste manieren</w:t>
+      </w:r>
+      <w:r>
+        <w:rPr>
+          <w:rFonts w:ascii="Courier New" w:hAnsi="Courier New" w:cs="Courier New"/>
+          <w:sz w:val="22"/>
+          <w:szCs w:val="22"/>
+        </w:rPr>
+        <w:t xml:space="preserve"> </w:t>
+      </w:r>
+      <w:r>
+        <w:rPr>
+          <w:rFonts w:ascii="Courier New" w:hAnsi="Courier New" w:cs="Courier New"/>
+          <w:sz w:val="22"/>
+          <w:szCs w:val="22"/>
+        </w:rPr>
+        <w:t>voor, m</w:t>
+      </w:r>
+      <w:r>
+        <w:rPr>
+          <w:rFonts w:ascii="Courier New" w:hAnsi="Courier New" w:cs="Courier New"/>
+          <w:sz w:val="22"/>
+          <w:szCs w:val="22"/>
+        </w:rPr>
+        <w:t>et een andere stijl, met kwaliteit en toch invloedrijk.</w:t>
       </w:r>
       <w:r>
         <w:rPr>
@@ -3877,15 +4341,31 @@
           <w:sz w:val="22"/>
           <w:szCs w:val="22"/>
         </w:rPr>
-        <w:t>D</w:t>
-      </w:r>
-      <w:r>
-        <w:rPr>
-          <w:rFonts w:ascii="Courier New" w:hAnsi="Courier New" w:cs="Courier New"/>
-          <w:sz w:val="22"/>
-          <w:szCs w:val="22"/>
-        </w:rPr>
-        <w:t xml:space="preserve">at kritisch denken niet noodzakelijk betekent dat </w:t>
+        <w:t>K</w:t>
+      </w:r>
+      <w:r>
+        <w:rPr>
+          <w:rFonts w:ascii="Courier New" w:hAnsi="Courier New" w:cs="Courier New"/>
+          <w:sz w:val="22"/>
+          <w:szCs w:val="22"/>
+        </w:rPr>
+        <w:t xml:space="preserve">ritisch denken </w:t>
+      </w:r>
+      <w:r>
+        <w:rPr>
+          <w:rFonts w:ascii="Courier New" w:hAnsi="Courier New" w:cs="Courier New"/>
+          <w:sz w:val="22"/>
+          <w:szCs w:val="22"/>
+        </w:rPr>
+        <w:t xml:space="preserve">betekent </w:t>
+      </w:r>
+      <w:r>
+        <w:rPr>
+          <w:rFonts w:ascii="Courier New" w:hAnsi="Courier New" w:cs="Courier New"/>
+          <w:sz w:val="22"/>
+          <w:szCs w:val="22"/>
+        </w:rPr>
+        <w:t xml:space="preserve">niet noodzakelijk dat </w:t>
       </w:r>
       <w:r>
         <w:rPr>
@@ -4013,70 +4493,6 @@
           <w:sz w:val="22"/>
           <w:szCs w:val="22"/>
         </w:rPr>
-        <w:t>W</w:t>
-      </w:r>
-      <w:r>
-        <w:rPr>
-          <w:rFonts w:ascii="Courier New" w:hAnsi="Courier New" w:cs="Courier New"/>
-          <w:sz w:val="22"/>
-          <w:szCs w:val="22"/>
-        </w:rPr>
-        <w:t xml:space="preserve">elke verantwoordelijkheid </w:t>
-      </w:r>
-      <w:r>
-        <w:rPr>
-          <w:rFonts w:ascii="Courier New" w:hAnsi="Courier New" w:cs="Courier New"/>
-          <w:sz w:val="22"/>
-          <w:szCs w:val="22"/>
-        </w:rPr>
-        <w:t>heeft de</w:t>
-      </w:r>
-      <w:r>
-        <w:rPr>
-          <w:rFonts w:ascii="Courier New" w:hAnsi="Courier New" w:cs="Courier New"/>
-          <w:sz w:val="22"/>
-          <w:szCs w:val="22"/>
-        </w:rPr>
-        <w:t xml:space="preserve"> intellectue</w:t>
-      </w:r>
-      <w:r>
-        <w:rPr>
-          <w:rFonts w:ascii="Courier New" w:hAnsi="Courier New" w:cs="Courier New"/>
-          <w:sz w:val="22"/>
-          <w:szCs w:val="22"/>
-        </w:rPr>
-        <w:t>el</w:t>
-      </w:r>
-      <w:r>
-        <w:rPr>
-          <w:rFonts w:ascii="Courier New" w:hAnsi="Courier New" w:cs="Courier New"/>
-          <w:sz w:val="22"/>
-          <w:szCs w:val="22"/>
-        </w:rPr>
-        <w:t xml:space="preserve"> voor de democratische samenleving waarin </w:t>
-      </w:r>
-      <w:r>
-        <w:rPr>
-          <w:rFonts w:ascii="Courier New" w:hAnsi="Courier New" w:cs="Courier New"/>
-          <w:sz w:val="22"/>
-          <w:szCs w:val="22"/>
-        </w:rPr>
-        <w:t>hij leeft</w:t>
-      </w:r>
-      <w:r>
-        <w:rPr>
-          <w:rFonts w:ascii="Courier New" w:hAnsi="Courier New" w:cs="Courier New"/>
-          <w:sz w:val="22"/>
-          <w:szCs w:val="22"/>
-        </w:rPr>
-        <w:t xml:space="preserve">? </w:t>
-      </w:r>
-      <w:r>
-        <w:rPr>
-          <w:rFonts w:ascii="Courier New" w:hAnsi="Courier New" w:cs="Courier New"/>
-          <w:sz w:val="22"/>
-          <w:szCs w:val="22"/>
-        </w:rPr>
         <w:t xml:space="preserve">Voor Habermas was het duidelijk dat je als </w:t>
       </w:r>
       <w:r>
@@ -4205,15 +4621,88 @@
           <w:sz w:val="22"/>
           <w:szCs w:val="22"/>
         </w:rPr>
-        <w:t xml:space="preserve"> Deze munitie hebben we komende jaren nodig en mensen als Habermas hebben </w:t>
-      </w:r>
-      <w:r>
-        <w:rPr>
-          <w:rFonts w:ascii="Courier New" w:hAnsi="Courier New" w:cs="Courier New"/>
-          <w:sz w:val="22"/>
-          <w:szCs w:val="22"/>
-        </w:rPr>
-        <w:t>we heel erg nodig.</w:t>
+        <w:t xml:space="preserve"> </w:t>
+      </w:r>
+      <w:r>
+        <w:rPr>
+          <w:rFonts w:ascii="Courier New" w:hAnsi="Courier New" w:cs="Courier New"/>
+          <w:sz w:val="22"/>
+          <w:szCs w:val="22"/>
+        </w:rPr>
+        <w:t xml:space="preserve">Wat lijkt hij in alles op John Dewey, </w:t>
+      </w:r>
+      <w:r>
+        <w:rPr>
+          <w:rFonts w:ascii="Courier New" w:hAnsi="Courier New" w:cs="Courier New"/>
+          <w:sz w:val="22"/>
+          <w:szCs w:val="22"/>
+        </w:rPr>
+        <w:lastRenderedPageBreak/>
+        <w:t>maar daarover later meer. Voor nu stel ik vast dat we dit soort</w:t>
+      </w:r>
+      <w:r>
+        <w:rPr>
+          <w:rFonts w:ascii="Courier New" w:hAnsi="Courier New" w:cs="Courier New"/>
+          <w:sz w:val="22"/>
+          <w:szCs w:val="22"/>
+        </w:rPr>
+        <w:t xml:space="preserve"> munitie </w:t>
+      </w:r>
+      <w:r>
+        <w:rPr>
+          <w:rFonts w:ascii="Courier New" w:hAnsi="Courier New" w:cs="Courier New"/>
+          <w:sz w:val="22"/>
+          <w:szCs w:val="22"/>
+        </w:rPr>
+        <w:t xml:space="preserve">en </w:t>
+      </w:r>
+      <w:r>
+        <w:rPr>
+          <w:rFonts w:ascii="Courier New" w:hAnsi="Courier New" w:cs="Courier New"/>
+          <w:sz w:val="22"/>
+          <w:szCs w:val="22"/>
+        </w:rPr>
+        <w:t>mensen als Habermas</w:t>
+      </w:r>
+      <w:r>
+        <w:rPr>
+          <w:rFonts w:ascii="Courier New" w:hAnsi="Courier New" w:cs="Courier New"/>
+          <w:sz w:val="22"/>
+          <w:szCs w:val="22"/>
+        </w:rPr>
+        <w:t xml:space="preserve"> heel </w:t>
+      </w:r>
+      <w:r>
+        <w:rPr>
+          <w:rFonts w:ascii="Courier New" w:hAnsi="Courier New" w:cs="Courier New"/>
+          <w:sz w:val="22"/>
+          <w:szCs w:val="22"/>
+        </w:rPr>
+        <w:t xml:space="preserve">hard </w:t>
+      </w:r>
+      <w:r>
+        <w:rPr>
+          <w:rFonts w:ascii="Courier New" w:hAnsi="Courier New" w:cs="Courier New"/>
+          <w:sz w:val="22"/>
+          <w:szCs w:val="22"/>
+        </w:rPr>
+        <w:t>nodig</w:t>
+      </w:r>
+      <w:r>
+        <w:rPr>
+          <w:rFonts w:ascii="Courier New" w:hAnsi="Courier New" w:cs="Courier New"/>
+          <w:sz w:val="22"/>
+          <w:szCs w:val="22"/>
+        </w:rPr>
+        <w:t xml:space="preserve"> hebben</w:t>
+      </w:r>
+      <w:r>
+        <w:rPr>
+          <w:rFonts w:ascii="Courier New" w:hAnsi="Courier New" w:cs="Courier New"/>
+          <w:sz w:val="22"/>
+          <w:szCs w:val="22"/>
+        </w:rPr>
+        <w:t>.</w:t>
       </w:r>
     </w:p>
     <w:p>
@@ -4251,7 +4740,6 @@
           <w:sz w:val="22"/>
           <w:szCs w:val="22"/>
         </w:rPr>
-        <w:lastRenderedPageBreak/>
         <w:t>Verovšek</w:t>
       </w:r>
       <w:r>

</xml_diff>